<commit_message>
Improve DOCX compatibility and add HTML fallback for Word.
Harden DOCX generation for Microsoft Word, mark binary assets in
gitattributes, and provide HTML that Word can open when DOCX download
is corrupted.

Co-authored-by: Igor N Korsakov <igor.korsa@gmail.com>
</commit_message>
<xml_diff>
--- a/docs/MEDICAL_REPORT_2026.docx
+++ b/docs/MEDICAL_REPORT_2026.docx
@@ -4,11 +4,16 @@
   <w:body>
     <w:p>
       <w:pPr>
-        <w:pStyle w:val="Title"/>
         <w:jc w:val="center"/>
       </w:pPr>
       <w:r>
-        <w:t>Отчёт по медицинской деятельности — 2026</w:t>
+        <w:rPr>
+          <w:rFonts w:ascii="Times New Roman" w:hAnsi="Times New Roman" w:eastAsia="Times New Roman"/>
+          <w:b/>
+          <w:i w:val="0"/>
+          <w:sz w:val="32"/>
+        </w:rPr>
+        <w:t>Отчёт по медицинской деятельности - 2026</w:t>
       </w:r>
     </w:p>
     <w:p>
@@ -22,67 +27,127 @@
     <w:p>
       <w:r>
         <w:rPr>
+          <w:rFonts w:ascii="Times New Roman" w:hAnsi="Times New Roman" w:eastAsia="Times New Roman"/>
           <w:b/>
+          <w:i w:val="0"/>
+          <w:sz w:val="24"/>
         </w:rPr>
         <w:t>Период:</w:t>
       </w:r>
       <w:r>
-        <w:t xml:space="preserve"> 01.01.2026 — настоящее время</w:t>
+        <w:rPr>
+          <w:rFonts w:ascii="Times New Roman" w:hAnsi="Times New Roman" w:eastAsia="Times New Roman"/>
+          <w:b w:val="0"/>
+          <w:i w:val="0"/>
+          <w:sz w:val="24"/>
+        </w:rPr>
+        <w:t xml:space="preserve"> 01.01.2026 - настоящее время</w:t>
       </w:r>
     </w:p>
     <w:p>
       <w:r>
         <w:rPr>
+          <w:rFonts w:ascii="Times New Roman" w:hAnsi="Times New Roman" w:eastAsia="Times New Roman"/>
           <w:b/>
+          <w:i w:val="0"/>
+          <w:sz w:val="24"/>
         </w:rPr>
         <w:t>Исполнитель:</w:t>
       </w:r>
       <w:r>
+        <w:rPr>
+          <w:rFonts w:ascii="Times New Roman" w:hAnsi="Times New Roman" w:eastAsia="Times New Roman"/>
+          <w:b w:val="0"/>
+          <w:i w:val="0"/>
+          <w:sz w:val="24"/>
+        </w:rPr>
         <w:t xml:space="preserve"> Корсаков Игорь Николаевич</w:t>
       </w:r>
     </w:p>
     <w:p>
       <w:r>
         <w:rPr>
+          <w:rFonts w:ascii="Times New Roman" w:hAnsi="Times New Roman" w:eastAsia="Times New Roman"/>
           <w:b/>
+          <w:i w:val="0"/>
+          <w:sz w:val="24"/>
         </w:rPr>
         <w:t>Должность / организация:</w:t>
       </w:r>
       <w:r>
+        <w:rPr>
+          <w:rFonts w:ascii="Times New Roman" w:hAnsi="Times New Roman" w:eastAsia="Times New Roman"/>
+          <w:b w:val="0"/>
+          <w:i w:val="0"/>
+          <w:sz w:val="24"/>
+        </w:rPr>
         <w:t xml:space="preserve"> старший научный сотрудник</w:t>
       </w:r>
     </w:p>
     <w:p>
       <w:r>
         <w:rPr>
+          <w:rFonts w:ascii="Times New Roman" w:hAnsi="Times New Roman" w:eastAsia="Times New Roman"/>
           <w:b/>
+          <w:i w:val="0"/>
+          <w:sz w:val="24"/>
         </w:rPr>
         <w:t>Направление:</w:t>
       </w:r>
       <w:r>
+        <w:rPr>
+          <w:rFonts w:ascii="Times New Roman" w:hAnsi="Times New Roman" w:eastAsia="Times New Roman"/>
+          <w:b w:val="0"/>
+          <w:i w:val="0"/>
+          <w:sz w:val="24"/>
+        </w:rPr>
         <w:t xml:space="preserve"> цифровые медицинские инструменты, эндокринология, кардиология, клинические исследования</w:t>
       </w:r>
     </w:p>
     <w:p>
       <w:r>
+        <w:rPr>
+          <w:rFonts w:ascii="Times New Roman" w:hAnsi="Times New Roman" w:eastAsia="Times New Roman"/>
+          <w:b w:val="0"/>
+          <w:i w:val="0"/>
+          <w:sz w:val="24"/>
+        </w:rPr>
         <w:t xml:space="preserve">Форматы отчёта: </w:t>
       </w:r>
       <w:r>
         <w:rPr>
-          <w:rFonts w:ascii="Courier New" w:hAnsi="Courier New"/>
+          <w:rFonts w:ascii="Courier New" w:hAnsi="Courier New" w:eastAsia="Times New Roman"/>
+          <w:b w:val="0"/>
+          <w:i w:val="0"/>
+          <w:sz w:val="24"/>
         </w:rPr>
         <w:t>docs/MEDICAL_REPORT_2026.docx</w:t>
       </w:r>
       <w:r>
+        <w:rPr>
+          <w:rFonts w:ascii="Times New Roman" w:hAnsi="Times New Roman" w:eastAsia="Times New Roman"/>
+          <w:b w:val="0"/>
+          <w:i w:val="0"/>
+          <w:sz w:val="24"/>
+        </w:rPr>
         <w:t xml:space="preserve"> (для правки в Word), </w:t>
       </w:r>
       <w:r>
         <w:rPr>
-          <w:rFonts w:ascii="Courier New" w:hAnsi="Courier New"/>
+          <w:rFonts w:ascii="Courier New" w:hAnsi="Courier New" w:eastAsia="Times New Roman"/>
+          <w:b w:val="0"/>
+          <w:i w:val="0"/>
+          <w:sz w:val="24"/>
         </w:rPr>
         <w:t>docs/MEDICAL_REPORT_2026.pdf</w:t>
       </w:r>
       <w:r>
+        <w:rPr>
+          <w:rFonts w:ascii="Times New Roman" w:hAnsi="Times New Roman" w:eastAsia="Times New Roman"/>
+          <w:b w:val="0"/>
+          <w:i w:val="0"/>
+          <w:sz w:val="24"/>
+        </w:rPr>
         <w:t>.</w:t>
       </w:r>
     </w:p>
@@ -96,15 +161,30 @@
     </w:p>
     <w:p>
       <w:r>
+        <w:rPr>
+          <w:rFonts w:ascii="Times New Roman" w:hAnsi="Times New Roman" w:eastAsia="Times New Roman"/>
+          <w:b w:val="0"/>
+          <w:i w:val="0"/>
+          <w:sz w:val="24"/>
+        </w:rPr>
         <w:t xml:space="preserve">С начала 2026 года разработаны и внедрены </w:t>
       </w:r>
       <w:r>
         <w:rPr>
+          <w:rFonts w:ascii="Times New Roman" w:hAnsi="Times New Roman" w:eastAsia="Times New Roman"/>
           <w:b/>
+          <w:i w:val="0"/>
+          <w:sz w:val="24"/>
         </w:rPr>
         <w:t>четыре веб-сервиса</w:t>
       </w:r>
       <w:r>
+        <w:rPr>
+          <w:rFonts w:ascii="Times New Roman" w:hAnsi="Times New Roman" w:eastAsia="Times New Roman"/>
+          <w:b w:val="0"/>
+          <w:i w:val="0"/>
+          <w:sz w:val="24"/>
+        </w:rPr>
         <w:t xml:space="preserve"> для клинической практики и исследований:</w:t>
       </w:r>
     </w:p>
@@ -125,9 +205,13 @@
             <w:tcW w:type="dxa" w:w="3230"/>
           </w:tcPr>
           <w:p>
+            <w:r/>
             <w:r>
               <w:rPr>
+                <w:rFonts w:ascii="Times New Roman" w:hAnsi="Times New Roman" w:eastAsia="Times New Roman"/>
                 <w:b/>
+                <w:i w:val="0"/>
+                <w:sz w:val="24"/>
               </w:rPr>
               <w:t>Сервис</w:t>
             </w:r>
@@ -138,9 +222,13 @@
             <w:tcW w:type="dxa" w:w="3230"/>
           </w:tcPr>
           <w:p>
+            <w:r/>
             <w:r>
               <w:rPr>
+                <w:rFonts w:ascii="Times New Roman" w:hAnsi="Times New Roman" w:eastAsia="Times New Roman"/>
                 <w:b/>
+                <w:i w:val="0"/>
+                <w:sz w:val="24"/>
               </w:rPr>
               <w:t>URL</w:t>
             </w:r>
@@ -151,9 +239,13 @@
             <w:tcW w:type="dxa" w:w="3230"/>
           </w:tcPr>
           <w:p>
+            <w:r/>
             <w:r>
               <w:rPr>
+                <w:rFonts w:ascii="Times New Roman" w:hAnsi="Times New Roman" w:eastAsia="Times New Roman"/>
                 <w:b/>
+                <w:i w:val="0"/>
+                <w:sz w:val="24"/>
               </w:rPr>
               <w:t>Назначение</w:t>
             </w:r>
@@ -166,7 +258,14 @@
             <w:tcW w:type="dxa" w:w="3230"/>
           </w:tcPr>
           <w:p>
+            <w:r/>
             <w:r>
+              <w:rPr>
+                <w:rFonts w:ascii="Times New Roman" w:hAnsi="Times New Roman" w:eastAsia="Times New Roman"/>
+                <w:b w:val="0"/>
+                <w:i w:val="0"/>
+                <w:sz w:val="24"/>
+              </w:rPr>
               <w:t>Анамнез эндокринолога</w:t>
             </w:r>
           </w:p>
@@ -176,7 +275,14 @@
             <w:tcW w:type="dxa" w:w="3230"/>
           </w:tcPr>
           <w:p>
+            <w:r/>
             <w:r>
+              <w:rPr>
+                <w:rFonts w:ascii="Times New Roman" w:hAnsi="Times New Roman" w:eastAsia="Times New Roman"/>
+                <w:b w:val="0"/>
+                <w:i w:val="0"/>
+                <w:sz w:val="24"/>
+              </w:rPr>
               <w:t>https://anamnes.ikorsakov.tech</w:t>
             </w:r>
           </w:p>
@@ -186,7 +292,14 @@
             <w:tcW w:type="dxa" w:w="3230"/>
           </w:tcPr>
           <w:p>
+            <w:r/>
             <w:r>
+              <w:rPr>
+                <w:rFonts w:ascii="Times New Roman" w:hAnsi="Times New Roman" w:eastAsia="Times New Roman"/>
+                <w:b w:val="0"/>
+                <w:i w:val="0"/>
+                <w:sz w:val="24"/>
+              </w:rPr>
               <w:t>Предприёмный сбор анамнеза</w:t>
             </w:r>
           </w:p>
@@ -198,7 +311,14 @@
             <w:tcW w:type="dxa" w:w="3230"/>
           </w:tcPr>
           <w:p>
+            <w:r/>
             <w:r>
+              <w:rPr>
+                <w:rFonts w:ascii="Times New Roman" w:hAnsi="Times New Roman" w:eastAsia="Times New Roman"/>
+                <w:b w:val="0"/>
+                <w:i w:val="0"/>
+                <w:sz w:val="24"/>
+              </w:rPr>
               <w:t>MD Choice</w:t>
             </w:r>
           </w:p>
@@ -208,7 +328,14 @@
             <w:tcW w:type="dxa" w:w="3230"/>
           </w:tcPr>
           <w:p>
+            <w:r/>
             <w:r>
+              <w:rPr>
+                <w:rFonts w:ascii="Times New Roman" w:hAnsi="Times New Roman" w:eastAsia="Times New Roman"/>
+                <w:b w:val="0"/>
+                <w:i w:val="0"/>
+                <w:sz w:val="24"/>
+              </w:rPr>
               <w:t>http://ikorsakov.tech:7777</w:t>
             </w:r>
           </w:p>
@@ -218,7 +345,14 @@
             <w:tcW w:type="dxa" w:w="3230"/>
           </w:tcPr>
           <w:p>
+            <w:r/>
             <w:r>
+              <w:rPr>
+                <w:rFonts w:ascii="Times New Roman" w:hAnsi="Times New Roman" w:eastAsia="Times New Roman"/>
+                <w:b w:val="0"/>
+                <w:i w:val="0"/>
+                <w:sz w:val="24"/>
+              </w:rPr>
               <w:t>Прогнозирование выбора препарата при СД2 (ML)</w:t>
             </w:r>
           </w:p>
@@ -230,7 +364,14 @@
             <w:tcW w:type="dxa" w:w="3230"/>
           </w:tcPr>
           <w:p>
+            <w:r/>
             <w:r>
+              <w:rPr>
+                <w:rFonts w:ascii="Times New Roman" w:hAnsi="Times New Roman" w:eastAsia="Times New Roman"/>
+                <w:b w:val="0"/>
+                <w:i w:val="0"/>
+                <w:sz w:val="24"/>
+              </w:rPr>
               <w:t>Калькулятор выборки КИ</w:t>
             </w:r>
           </w:p>
@@ -240,7 +381,14 @@
             <w:tcW w:type="dxa" w:w="3230"/>
           </w:tcPr>
           <w:p>
+            <w:r/>
             <w:r>
+              <w:rPr>
+                <w:rFonts w:ascii="Times New Roman" w:hAnsi="Times New Roman" w:eastAsia="Times New Roman"/>
+                <w:b w:val="0"/>
+                <w:i w:val="0"/>
+                <w:sz w:val="24"/>
+              </w:rPr>
               <w:t>http://ikorsakov.tech:8080</w:t>
             </w:r>
           </w:p>
@@ -250,7 +398,14 @@
             <w:tcW w:type="dxa" w:w="3230"/>
           </w:tcPr>
           <w:p>
+            <w:r/>
             <w:r>
+              <w:rPr>
+                <w:rFonts w:ascii="Times New Roman" w:hAnsi="Times New Roman" w:eastAsia="Times New Roman"/>
+                <w:b w:val="0"/>
+                <w:i w:val="0"/>
+                <w:sz w:val="24"/>
+              </w:rPr>
               <w:t>Расчёт размера выборки в клинических испытаниях</w:t>
             </w:r>
           </w:p>
@@ -262,7 +417,14 @@
             <w:tcW w:type="dxa" w:w="3230"/>
           </w:tcPr>
           <w:p>
+            <w:r/>
             <w:r>
+              <w:rPr>
+                <w:rFonts w:ascii="Times New Roman" w:hAnsi="Times New Roman" w:eastAsia="Times New Roman"/>
+                <w:b w:val="0"/>
+                <w:i w:val="0"/>
+                <w:sz w:val="24"/>
+              </w:rPr>
               <w:t>Прогноз ФВ ЛЖ</w:t>
             </w:r>
           </w:p>
@@ -272,7 +434,14 @@
             <w:tcW w:type="dxa" w:w="3230"/>
           </w:tcPr>
           <w:p>
+            <w:r/>
             <w:r>
+              <w:rPr>
+                <w:rFonts w:ascii="Times New Roman" w:hAnsi="Times New Roman" w:eastAsia="Times New Roman"/>
+                <w:b w:val="0"/>
+                <w:i w:val="0"/>
+                <w:sz w:val="24"/>
+              </w:rPr>
               <w:t>http://ikorsakov.tech:9999</w:t>
             </w:r>
           </w:p>
@@ -282,7 +451,14 @@
             <w:tcW w:type="dxa" w:w="3230"/>
           </w:tcPr>
           <w:p>
+            <w:r/>
             <w:r>
+              <w:rPr>
+                <w:rFonts w:ascii="Times New Roman" w:hAnsi="Times New Roman" w:eastAsia="Times New Roman"/>
+                <w:b w:val="0"/>
+                <w:i w:val="0"/>
+                <w:sz w:val="24"/>
+              </w:rPr>
               <w:t>Прогнозирование фракции выброса левого желудочка</w:t>
             </w:r>
           </w:p>
@@ -301,18 +477,30 @@
     <w:p>
       <w:r>
         <w:rPr>
+          <w:rFonts w:ascii="Times New Roman" w:hAnsi="Times New Roman" w:eastAsia="Times New Roman"/>
           <w:b/>
+          <w:i w:val="0"/>
+          <w:sz w:val="24"/>
         </w:rPr>
         <w:t>Цель:</w:t>
       </w:r>
       <w:r>
+        <w:rPr>
+          <w:rFonts w:ascii="Times New Roman" w:hAnsi="Times New Roman" w:eastAsia="Times New Roman"/>
+          <w:b w:val="0"/>
+          <w:i w:val="0"/>
+          <w:sz w:val="24"/>
+        </w:rPr>
         <w:t xml:space="preserve"> структурированный сбор эндокринологического анамнеза до визита пациента.</w:t>
       </w:r>
     </w:p>
     <w:p>
       <w:r>
         <w:rPr>
+          <w:rFonts w:ascii="Times New Roman" w:hAnsi="Times New Roman" w:eastAsia="Times New Roman"/>
           <w:b/>
+          <w:i w:val="0"/>
+          <w:sz w:val="24"/>
         </w:rPr>
         <w:t>Реализовано:</w:t>
       </w:r>
@@ -322,6 +510,12 @@
         <w:pStyle w:val="ListBullet"/>
       </w:pPr>
       <w:r>
+        <w:rPr>
+          <w:rFonts w:ascii="Times New Roman" w:hAnsi="Times New Roman" w:eastAsia="Times New Roman"/>
+          <w:b w:val="0"/>
+          <w:i w:val="0"/>
+          <w:sz w:val="24"/>
+        </w:rPr>
         <w:t>веб-анкета с ветвлением по 7 клиническим направлениям;</w:t>
       </w:r>
     </w:p>
@@ -330,6 +524,12 @@
         <w:pStyle w:val="ListBullet"/>
       </w:pPr>
       <w:r>
+        <w:rPr>
+          <w:rFonts w:ascii="Times New Roman" w:hAnsi="Times New Roman" w:eastAsia="Times New Roman"/>
+          <w:b w:val="0"/>
+          <w:i w:val="0"/>
+          <w:sz w:val="24"/>
+        </w:rPr>
         <w:t>загрузка анализов, УЗИ и выписок;</w:t>
       </w:r>
     </w:p>
@@ -338,6 +538,12 @@
         <w:pStyle w:val="ListBullet"/>
       </w:pPr>
       <w:r>
+        <w:rPr>
+          <w:rFonts w:ascii="Times New Roman" w:hAnsi="Times New Roman" w:eastAsia="Times New Roman"/>
+          <w:b w:val="0"/>
+          <w:i w:val="0"/>
+          <w:sz w:val="24"/>
+        </w:rPr>
         <w:t>кабинет врача, статусы просмотра, экспорт TXT/PDF;</w:t>
       </w:r>
     </w:p>
@@ -346,6 +552,12 @@
         <w:pStyle w:val="ListBullet"/>
       </w:pPr>
       <w:r>
+        <w:rPr>
+          <w:rFonts w:ascii="Times New Roman" w:hAnsi="Times New Roman" w:eastAsia="Times New Roman"/>
+          <w:b w:val="0"/>
+          <w:i w:val="0"/>
+          <w:sz w:val="24"/>
+        </w:rPr>
         <w:t>персональные ссылки и Telegram-бот для пациентов;</w:t>
       </w:r>
     </w:p>
@@ -354,6 +566,12 @@
         <w:pStyle w:val="ListBullet"/>
       </w:pPr>
       <w:r>
+        <w:rPr>
+          <w:rFonts w:ascii="Times New Roman" w:hAnsi="Times New Roman" w:eastAsia="Times New Roman"/>
+          <w:b w:val="0"/>
+          <w:i w:val="0"/>
+          <w:sz w:val="24"/>
+        </w:rPr>
         <w:t>уведомления врачу (email, Telegram);</w:t>
       </w:r>
     </w:p>
@@ -362,17 +580,32 @@
         <w:pStyle w:val="ListBullet"/>
       </w:pPr>
       <w:r>
+        <w:rPr>
+          <w:rFonts w:ascii="Times New Roman" w:hAnsi="Times New Roman" w:eastAsia="Times New Roman"/>
+          <w:b w:val="0"/>
+          <w:i w:val="0"/>
+          <w:sz w:val="24"/>
+        </w:rPr>
         <w:t>деплой на VPS с HTTPS, резервное копирование.</w:t>
       </w:r>
     </w:p>
     <w:p>
       <w:r>
         <w:rPr>
+          <w:rFonts w:ascii="Times New Roman" w:hAnsi="Times New Roman" w:eastAsia="Times New Roman"/>
           <w:b/>
+          <w:i w:val="0"/>
+          <w:sz w:val="24"/>
         </w:rPr>
         <w:t>Статус:</w:t>
       </w:r>
       <w:r>
+        <w:rPr>
+          <w:rFonts w:ascii="Times New Roman" w:hAnsi="Times New Roman" w:eastAsia="Times New Roman"/>
+          <w:b w:val="0"/>
+          <w:i w:val="0"/>
+          <w:sz w:val="24"/>
+        </w:rPr>
         <w:t xml:space="preserve"> MVP в тестовой эксплуатации.</w:t>
       </w:r>
     </w:p>
@@ -387,40 +620,70 @@
     <w:p>
       <w:r>
         <w:rPr>
+          <w:rFonts w:ascii="Times New Roman" w:hAnsi="Times New Roman" w:eastAsia="Times New Roman"/>
           <w:b/>
+          <w:i w:val="0"/>
+          <w:sz w:val="24"/>
         </w:rPr>
         <w:t>URL:</w:t>
       </w:r>
       <w:r>
+        <w:rPr>
+          <w:rFonts w:ascii="Times New Roman" w:hAnsi="Times New Roman" w:eastAsia="Times New Roman"/>
+          <w:b w:val="0"/>
+          <w:i w:val="0"/>
+          <w:sz w:val="24"/>
+        </w:rPr>
         <w:t xml:space="preserve"> http://ikorsakov.tech:8080/</w:t>
       </w:r>
     </w:p>
     <w:p>
       <w:r>
         <w:rPr>
+          <w:rFonts w:ascii="Times New Roman" w:hAnsi="Times New Roman" w:eastAsia="Times New Roman"/>
           <w:b/>
+          <w:i w:val="0"/>
+          <w:sz w:val="24"/>
         </w:rPr>
         <w:t>Стек:</w:t>
       </w:r>
       <w:r>
+        <w:rPr>
+          <w:rFonts w:ascii="Times New Roman" w:hAnsi="Times New Roman" w:eastAsia="Times New Roman"/>
+          <w:b w:val="0"/>
+          <w:i w:val="0"/>
+          <w:sz w:val="24"/>
+        </w:rPr>
         <w:t xml:space="preserve"> Python, Streamlit, scipy, statsmodels</w:t>
       </w:r>
     </w:p>
     <w:p>
       <w:r>
         <w:rPr>
+          <w:rFonts w:ascii="Times New Roman" w:hAnsi="Times New Roman" w:eastAsia="Times New Roman"/>
           <w:b/>
+          <w:i w:val="0"/>
+          <w:sz w:val="24"/>
         </w:rPr>
         <w:t>Назначение:</w:t>
       </w:r>
       <w:r>
+        <w:rPr>
+          <w:rFonts w:ascii="Times New Roman" w:hAnsi="Times New Roman" w:eastAsia="Times New Roman"/>
+          <w:b w:val="0"/>
+          <w:i w:val="0"/>
+          <w:sz w:val="24"/>
+        </w:rPr>
         <w:t xml:space="preserve"> предварительный расчёт размера выборки при планировании клинических исследований.</w:t>
       </w:r>
     </w:p>
     <w:p>
       <w:r>
         <w:rPr>
+          <w:rFonts w:ascii="Times New Roman" w:hAnsi="Times New Roman" w:eastAsia="Times New Roman"/>
           <w:b/>
+          <w:i w:val="0"/>
+          <w:sz w:val="24"/>
         </w:rPr>
         <w:t>Поддерживаемые дизайны:</w:t>
       </w:r>
@@ -430,6 +693,12 @@
         <w:pStyle w:val="ListNumber"/>
       </w:pPr>
       <w:r>
+        <w:rPr>
+          <w:rFonts w:ascii="Times New Roman" w:hAnsi="Times New Roman" w:eastAsia="Times New Roman"/>
+          <w:b w:val="0"/>
+          <w:i w:val="0"/>
+          <w:sz w:val="24"/>
+        </w:rPr>
         <w:t>Сравнение средних (двухвыборочный t-критерий, Cohen's d)</w:t>
       </w:r>
     </w:p>
@@ -438,6 +707,12 @@
         <w:pStyle w:val="ListNumber"/>
       </w:pPr>
       <w:r>
+        <w:rPr>
+          <w:rFonts w:ascii="Times New Roman" w:hAnsi="Times New Roman" w:eastAsia="Times New Roman"/>
+          <w:b w:val="0"/>
+          <w:i w:val="0"/>
+          <w:sz w:val="24"/>
+        </w:rPr>
         <w:t>Сравнение долей (z-тест, Cohen's h)</w:t>
       </w:r>
     </w:p>
@@ -446,6 +721,12 @@
         <w:pStyle w:val="ListNumber"/>
       </w:pPr>
       <w:r>
+        <w:rPr>
+          <w:rFonts w:ascii="Times New Roman" w:hAnsi="Times New Roman" w:eastAsia="Times New Roman"/>
+          <w:b w:val="0"/>
+          <w:i w:val="0"/>
+          <w:sz w:val="24"/>
+        </w:rPr>
         <w:t>Непревосходство по бинарной конечной точке (non-inferiority)</w:t>
       </w:r>
     </w:p>
@@ -454,13 +735,22 @@
         <w:pStyle w:val="ListNumber"/>
       </w:pPr>
       <w:r>
+        <w:rPr>
+          <w:rFonts w:ascii="Times New Roman" w:hAnsi="Times New Roman" w:eastAsia="Times New Roman"/>
+          <w:b w:val="0"/>
+          <w:i w:val="0"/>
+          <w:sz w:val="24"/>
+        </w:rPr>
         <w:t>Время до события (формула Schoenfeld, log-rank)</w:t>
       </w:r>
     </w:p>
     <w:p>
       <w:r>
         <w:rPr>
+          <w:rFonts w:ascii="Times New Roman" w:hAnsi="Times New Roman" w:eastAsia="Times New Roman"/>
           <w:b/>
+          <w:i w:val="0"/>
+          <w:sz w:val="24"/>
         </w:rPr>
         <w:t>Параметры расчёта:</w:t>
       </w:r>
@@ -470,6 +760,12 @@
         <w:pStyle w:val="ListBullet"/>
       </w:pPr>
       <w:r>
+        <w:rPr>
+          <w:rFonts w:ascii="Times New Roman" w:hAnsi="Times New Roman" w:eastAsia="Times New Roman"/>
+          <w:b w:val="0"/>
+          <w:i w:val="0"/>
+          <w:sz w:val="24"/>
+        </w:rPr>
         <w:t>уровень значимости α;</w:t>
       </w:r>
     </w:p>
@@ -478,6 +774,12 @@
         <w:pStyle w:val="ListBullet"/>
       </w:pPr>
       <w:r>
+        <w:rPr>
+          <w:rFonts w:ascii="Times New Roman" w:hAnsi="Times New Roman" w:eastAsia="Times New Roman"/>
+          <w:b w:val="0"/>
+          <w:i w:val="0"/>
+          <w:sz w:val="24"/>
+        </w:rPr>
         <w:t>мощность (1 − β);</w:t>
       </w:r>
     </w:p>
@@ -486,6 +788,12 @@
         <w:pStyle w:val="ListBullet"/>
       </w:pPr>
       <w:r>
+        <w:rPr>
+          <w:rFonts w:ascii="Times New Roman" w:hAnsi="Times New Roman" w:eastAsia="Times New Roman"/>
+          <w:b w:val="0"/>
+          <w:i w:val="0"/>
+          <w:sz w:val="24"/>
+        </w:rPr>
         <w:t>соотношение рандомизации;</w:t>
       </w:r>
     </w:p>
@@ -494,71 +802,134 @@
         <w:pStyle w:val="ListBullet"/>
       </w:pPr>
       <w:r>
+        <w:rPr>
+          <w:rFonts w:ascii="Times New Roman" w:hAnsi="Times New Roman" w:eastAsia="Times New Roman"/>
+          <w:b w:val="0"/>
+          <w:i w:val="0"/>
+          <w:sz w:val="24"/>
+        </w:rPr>
         <w:t>запас на выбывание пациентов.</w:t>
       </w:r>
     </w:p>
     <w:p>
       <w:r>
         <w:rPr>
+          <w:rFonts w:ascii="Times New Roman" w:hAnsi="Times New Roman" w:eastAsia="Times New Roman"/>
           <w:b/>
+          <w:i w:val="0"/>
+          <w:sz w:val="24"/>
         </w:rPr>
         <w:t>Результат:</w:t>
       </w:r>
       <w:r>
+        <w:rPr>
+          <w:rFonts w:ascii="Times New Roman" w:hAnsi="Times New Roman" w:eastAsia="Times New Roman"/>
+          <w:b w:val="0"/>
+          <w:i w:val="0"/>
+          <w:sz w:val="24"/>
+        </w:rPr>
         <w:t xml:space="preserve"> размер выборки по группам (контроль / лечение), общий N, N с учётом выбывания. </w:t>
       </w:r>
       <w:r>
         <w:rPr>
+          <w:rFonts w:ascii="Times New Roman" w:hAnsi="Times New Roman" w:eastAsia="Times New Roman"/>
           <w:b/>
+          <w:i w:val="0"/>
+          <w:sz w:val="24"/>
         </w:rPr>
         <w:t>Экспорт PDF</w:t>
       </w:r>
       <w:r>
+        <w:rPr>
+          <w:rFonts w:ascii="Times New Roman" w:hAnsi="Times New Roman" w:eastAsia="Times New Roman"/>
+          <w:b w:val="0"/>
+          <w:i w:val="0"/>
+          <w:sz w:val="24"/>
+        </w:rPr>
         <w:t xml:space="preserve"> с указанием ФИО исполнителя.</w:t>
       </w:r>
     </w:p>
     <w:p>
       <w:r>
         <w:rPr>
+          <w:rFonts w:ascii="Times New Roman" w:hAnsi="Times New Roman" w:eastAsia="Times New Roman"/>
           <w:b/>
+          <w:i w:val="0"/>
+          <w:sz w:val="24"/>
         </w:rPr>
         <w:t>Ограничение:</w:t>
       </w:r>
       <w:r>
+        <w:rPr>
+          <w:rFonts w:ascii="Times New Roman" w:hAnsi="Times New Roman" w:eastAsia="Times New Roman"/>
+          <w:b w:val="0"/>
+          <w:i w:val="0"/>
+          <w:sz w:val="24"/>
+        </w:rPr>
         <w:t xml:space="preserve"> ориентировочный расчёт; финальный размер выборки утверждается биостатистиком протокола (ICH E9, CONSORT).</w:t>
       </w:r>
     </w:p>
     <w:p>
       <w:r>
         <w:rPr>
+          <w:rFonts w:ascii="Times New Roman" w:hAnsi="Times New Roman" w:eastAsia="Times New Roman"/>
           <w:b/>
+          <w:i w:val="0"/>
+          <w:sz w:val="24"/>
         </w:rPr>
         <w:t>Файлы:</w:t>
       </w:r>
       <w:r>
+        <w:rPr>
+          <w:rFonts w:ascii="Times New Roman" w:hAnsi="Times New Roman" w:eastAsia="Times New Roman"/>
+          <w:b w:val="0"/>
+          <w:i w:val="0"/>
+          <w:sz w:val="24"/>
+        </w:rPr>
         <w:t xml:space="preserve"> </w:t>
       </w:r>
       <w:r>
         <w:rPr>
-          <w:rFonts w:ascii="Courier New" w:hAnsi="Courier New"/>
+          <w:rFonts w:ascii="Courier New" w:hAnsi="Courier New" w:eastAsia="Times New Roman"/>
+          <w:b w:val="0"/>
+          <w:i w:val="0"/>
+          <w:sz w:val="24"/>
         </w:rPr>
         <w:t>trial_calculator_app.py</w:t>
       </w:r>
       <w:r>
+        <w:rPr>
+          <w:rFonts w:ascii="Times New Roman" w:hAnsi="Times New Roman" w:eastAsia="Times New Roman"/>
+          <w:b w:val="0"/>
+          <w:i w:val="0"/>
+          <w:sz w:val="24"/>
+        </w:rPr>
         <w:t xml:space="preserve">, </w:t>
       </w:r>
       <w:r>
         <w:rPr>
-          <w:rFonts w:ascii="Courier New" w:hAnsi="Courier New"/>
+          <w:rFonts w:ascii="Courier New" w:hAnsi="Courier New" w:eastAsia="Times New Roman"/>
+          <w:b w:val="0"/>
+          <w:i w:val="0"/>
+          <w:sz w:val="24"/>
         </w:rPr>
         <w:t>clinical/sample_size.py</w:t>
       </w:r>
       <w:r>
+        <w:rPr>
+          <w:rFonts w:ascii="Times New Roman" w:hAnsi="Times New Roman" w:eastAsia="Times New Roman"/>
+          <w:b w:val="0"/>
+          <w:i w:val="0"/>
+          <w:sz w:val="24"/>
+        </w:rPr>
         <w:t xml:space="preserve">, </w:t>
       </w:r>
       <w:r>
         <w:rPr>
-          <w:rFonts w:ascii="Courier New" w:hAnsi="Courier New"/>
+          <w:rFonts w:ascii="Courier New" w:hAnsi="Courier New" w:eastAsia="Times New Roman"/>
+          <w:b w:val="0"/>
+          <w:i w:val="0"/>
+          <w:sz w:val="24"/>
         </w:rPr>
         <w:t>deploy/TRIAL_CALCULATOR.md</w:t>
       </w:r>
@@ -574,33 +945,60 @@
     <w:p>
       <w:r>
         <w:rPr>
+          <w:rFonts w:ascii="Times New Roman" w:hAnsi="Times New Roman" w:eastAsia="Times New Roman"/>
           <w:b/>
+          <w:i w:val="0"/>
+          <w:sz w:val="24"/>
         </w:rPr>
         <w:t>URL:</w:t>
       </w:r>
       <w:r>
+        <w:rPr>
+          <w:rFonts w:ascii="Times New Roman" w:hAnsi="Times New Roman" w:eastAsia="Times New Roman"/>
+          <w:b w:val="0"/>
+          <w:i w:val="0"/>
+          <w:sz w:val="24"/>
+        </w:rPr>
         <w:t xml:space="preserve"> http://ikorsakov.tech:9999/</w:t>
       </w:r>
     </w:p>
     <w:p>
       <w:r>
         <w:rPr>
+          <w:rFonts w:ascii="Times New Roman" w:hAnsi="Times New Roman" w:eastAsia="Times New Roman"/>
           <w:b/>
+          <w:i w:val="0"/>
+          <w:sz w:val="24"/>
         </w:rPr>
         <w:t>Стек:</w:t>
       </w:r>
       <w:r>
+        <w:rPr>
+          <w:rFonts w:ascii="Times New Roman" w:hAnsi="Times New Roman" w:eastAsia="Times New Roman"/>
+          <w:b w:val="0"/>
+          <w:i w:val="0"/>
+          <w:sz w:val="24"/>
+        </w:rPr>
         <w:t xml:space="preserve"> Python, Streamlit</w:t>
       </w:r>
     </w:p>
     <w:p>
       <w:r>
         <w:rPr>
+          <w:rFonts w:ascii="Times New Roman" w:hAnsi="Times New Roman" w:eastAsia="Times New Roman"/>
           <w:b/>
+          <w:i w:val="0"/>
+          <w:sz w:val="24"/>
         </w:rPr>
         <w:t>Назначение:</w:t>
       </w:r>
       <w:r>
+        <w:rPr>
+          <w:rFonts w:ascii="Times New Roman" w:hAnsi="Times New Roman" w:eastAsia="Times New Roman"/>
+          <w:b w:val="0"/>
+          <w:i w:val="0"/>
+          <w:sz w:val="24"/>
+        </w:rPr>
         <w:t xml:space="preserve"> вспомогательная оценка и прогнозирование ФВ ЛЖ по данным ЭхоКГ и клиническим факторам.</w:t>
       </w:r>
     </w:p>
@@ -629,9 +1027,13 @@
             <w:tcW w:type="dxa" w:w="3230"/>
           </w:tcPr>
           <w:p>
+            <w:r/>
             <w:r>
               <w:rPr>
+                <w:rFonts w:ascii="Times New Roman" w:hAnsi="Times New Roman" w:eastAsia="Times New Roman"/>
                 <w:b/>
+                <w:i w:val="0"/>
+                <w:sz w:val="24"/>
               </w:rPr>
               <w:t>Метод</w:t>
             </w:r>
@@ -642,9 +1044,13 @@
             <w:tcW w:type="dxa" w:w="3230"/>
           </w:tcPr>
           <w:p>
+            <w:r/>
             <w:r>
               <w:rPr>
+                <w:rFonts w:ascii="Times New Roman" w:hAnsi="Times New Roman" w:eastAsia="Times New Roman"/>
                 <w:b/>
+                <w:i w:val="0"/>
+                <w:sz w:val="24"/>
               </w:rPr>
               <w:t>Входные данные</w:t>
             </w:r>
@@ -655,9 +1061,13 @@
             <w:tcW w:type="dxa" w:w="3230"/>
           </w:tcPr>
           <w:p>
+            <w:r/>
             <w:r>
               <w:rPr>
+                <w:rFonts w:ascii="Times New Roman" w:hAnsi="Times New Roman" w:eastAsia="Times New Roman"/>
                 <w:b/>
+                <w:i w:val="0"/>
+                <w:sz w:val="24"/>
               </w:rPr>
               <w:t>Применение</w:t>
             </w:r>
@@ -670,7 +1080,14 @@
             <w:tcW w:type="dxa" w:w="3230"/>
           </w:tcPr>
           <w:p>
+            <w:r/>
             <w:r>
+              <w:rPr>
+                <w:rFonts w:ascii="Times New Roman" w:hAnsi="Times New Roman" w:eastAsia="Times New Roman"/>
+                <w:b w:val="0"/>
+                <w:i w:val="0"/>
+                <w:sz w:val="24"/>
+              </w:rPr>
               <w:t>Симпсон</w:t>
             </w:r>
           </w:p>
@@ -680,7 +1097,14 @@
             <w:tcW w:type="dxa" w:w="3230"/>
           </w:tcPr>
           <w:p>
+            <w:r/>
             <w:r>
+              <w:rPr>
+                <w:rFonts w:ascii="Times New Roman" w:hAnsi="Times New Roman" w:eastAsia="Times New Roman"/>
+                <w:b w:val="0"/>
+                <w:i w:val="0"/>
+                <w:sz w:val="24"/>
+              </w:rPr>
               <w:t>КДО и КСО (мл)</w:t>
             </w:r>
           </w:p>
@@ -690,7 +1114,14 @@
             <w:tcW w:type="dxa" w:w="3230"/>
           </w:tcPr>
           <w:p>
+            <w:r/>
             <w:r>
+              <w:rPr>
+                <w:rFonts w:ascii="Times New Roman" w:hAnsi="Times New Roman" w:eastAsia="Times New Roman"/>
+                <w:b w:val="0"/>
+                <w:i w:val="0"/>
+                <w:sz w:val="24"/>
+              </w:rPr>
               <w:t>Предпочтительный объёмный метод</w:t>
             </w:r>
           </w:p>
@@ -702,7 +1133,14 @@
             <w:tcW w:type="dxa" w:w="3230"/>
           </w:tcPr>
           <w:p>
+            <w:r/>
             <w:r>
+              <w:rPr>
+                <w:rFonts w:ascii="Times New Roman" w:hAnsi="Times New Roman" w:eastAsia="Times New Roman"/>
+                <w:b w:val="0"/>
+                <w:i w:val="0"/>
+                <w:sz w:val="24"/>
+              </w:rPr>
               <w:t>Teichholz</w:t>
             </w:r>
           </w:p>
@@ -712,7 +1150,14 @@
             <w:tcW w:type="dxa" w:w="3230"/>
           </w:tcPr>
           <w:p>
+            <w:r/>
             <w:r>
+              <w:rPr>
+                <w:rFonts w:ascii="Times New Roman" w:hAnsi="Times New Roman" w:eastAsia="Times New Roman"/>
+                <w:b w:val="0"/>
+                <w:i w:val="0"/>
+                <w:sz w:val="24"/>
+              </w:rPr>
               <w:t>LVIDd, LVIDs (мм)</w:t>
             </w:r>
           </w:p>
@@ -722,7 +1167,14 @@
             <w:tcW w:type="dxa" w:w="3230"/>
           </w:tcPr>
           <w:p>
+            <w:r/>
             <w:r>
+              <w:rPr>
+                <w:rFonts w:ascii="Times New Roman" w:hAnsi="Times New Roman" w:eastAsia="Times New Roman"/>
+                <w:b w:val="0"/>
+                <w:i w:val="0"/>
+                <w:sz w:val="24"/>
+              </w:rPr>
               <w:t>Оценка по линейным размерам</w:t>
             </w:r>
           </w:p>
@@ -734,7 +1186,14 @@
             <w:tcW w:type="dxa" w:w="3230"/>
           </w:tcPr>
           <w:p>
+            <w:r/>
             <w:r>
+              <w:rPr>
+                <w:rFonts w:ascii="Times New Roman" w:hAnsi="Times New Roman" w:eastAsia="Times New Roman"/>
+                <w:b w:val="0"/>
+                <w:i w:val="0"/>
+                <w:sz w:val="24"/>
+              </w:rPr>
               <w:t>Фракция укорочения (FS)</w:t>
             </w:r>
           </w:p>
@@ -744,7 +1203,14 @@
             <w:tcW w:type="dxa" w:w="3230"/>
           </w:tcPr>
           <w:p>
+            <w:r/>
             <w:r>
+              <w:rPr>
+                <w:rFonts w:ascii="Times New Roman" w:hAnsi="Times New Roman" w:eastAsia="Times New Roman"/>
+                <w:b w:val="0"/>
+                <w:i w:val="0"/>
+                <w:sz w:val="24"/>
+              </w:rPr>
               <w:t>LVIDd, LVIDs</w:t>
             </w:r>
           </w:p>
@@ -754,7 +1220,14 @@
             <w:tcW w:type="dxa" w:w="3230"/>
           </w:tcPr>
           <w:p>
+            <w:r/>
             <w:r>
+              <w:rPr>
+                <w:rFonts w:ascii="Times New Roman" w:hAnsi="Times New Roman" w:eastAsia="Times New Roman"/>
+                <w:b w:val="0"/>
+                <w:i w:val="0"/>
+                <w:sz w:val="24"/>
+              </w:rPr>
               <w:t>Быстрая оценка у постели больного</w:t>
             </w:r>
           </w:p>
@@ -766,7 +1239,14 @@
             <w:tcW w:type="dxa" w:w="3230"/>
           </w:tcPr>
           <w:p>
+            <w:r/>
             <w:r>
+              <w:rPr>
+                <w:rFonts w:ascii="Times New Roman" w:hAnsi="Times New Roman" w:eastAsia="Times New Roman"/>
+                <w:b w:val="0"/>
+                <w:i w:val="0"/>
+                <w:sz w:val="24"/>
+              </w:rPr>
               <w:t>Сравнение методов</w:t>
             </w:r>
           </w:p>
@@ -776,7 +1256,14 @@
             <w:tcW w:type="dxa" w:w="3230"/>
           </w:tcPr>
           <w:p>
+            <w:r/>
             <w:r>
+              <w:rPr>
+                <w:rFonts w:ascii="Times New Roman" w:hAnsi="Times New Roman" w:eastAsia="Times New Roman"/>
+                <w:b w:val="0"/>
+                <w:i w:val="0"/>
+                <w:sz w:val="24"/>
+              </w:rPr>
               <w:t>КДО/КСО + LVIDd/LVIDs</w:t>
             </w:r>
           </w:p>
@@ -786,7 +1273,14 @@
             <w:tcW w:type="dxa" w:w="3230"/>
           </w:tcPr>
           <w:p>
+            <w:r/>
             <w:r>
+              <w:rPr>
+                <w:rFonts w:ascii="Times New Roman" w:hAnsi="Times New Roman" w:eastAsia="Times New Roman"/>
+                <w:b w:val="0"/>
+                <w:i w:val="0"/>
+                <w:sz w:val="24"/>
+              </w:rPr>
               <w:t>Контроль согласованности Симпсон vs Teichholz</w:t>
             </w:r>
           </w:p>
@@ -797,7 +1291,10 @@
     <w:p>
       <w:r>
         <w:rPr>
+          <w:rFonts w:ascii="Times New Roman" w:hAnsi="Times New Roman" w:eastAsia="Times New Roman"/>
           <w:b/>
+          <w:i w:val="0"/>
+          <w:sz w:val="24"/>
         </w:rPr>
         <w:t>Формулы:</w:t>
       </w:r>
@@ -807,6 +1304,12 @@
         <w:pStyle w:val="ListBullet"/>
       </w:pPr>
       <w:r>
+        <w:rPr>
+          <w:rFonts w:ascii="Times New Roman" w:hAnsi="Times New Roman" w:eastAsia="Times New Roman"/>
+          <w:b w:val="0"/>
+          <w:i w:val="0"/>
+          <w:sz w:val="24"/>
+        </w:rPr>
         <w:t>ФВ ЛЖ (%) = (КДО − КСО) / КДО × 100</w:t>
       </w:r>
     </w:p>
@@ -815,6 +1318,12 @@
         <w:pStyle w:val="ListBullet"/>
       </w:pPr>
       <w:r>
+        <w:rPr>
+          <w:rFonts w:ascii="Times New Roman" w:hAnsi="Times New Roman" w:eastAsia="Times New Roman"/>
+          <w:b w:val="0"/>
+          <w:i w:val="0"/>
+          <w:sz w:val="24"/>
+        </w:rPr>
         <w:t>Teichholz: V = [7 / (2.4 + D)] × D³ (D в см)</w:t>
       </w:r>
     </w:p>
@@ -823,6 +1332,12 @@
         <w:pStyle w:val="ListBullet"/>
       </w:pPr>
       <w:r>
+        <w:rPr>
+          <w:rFonts w:ascii="Times New Roman" w:hAnsi="Times New Roman" w:eastAsia="Times New Roman"/>
+          <w:b w:val="0"/>
+          <w:i w:val="0"/>
+          <w:sz w:val="24"/>
+        </w:rPr>
         <w:t>FS (%) = (LVIDd − LVIDs) / LVIDd × 100</w:t>
       </w:r>
     </w:p>
@@ -836,15 +1351,30 @@
     </w:p>
     <w:p>
       <w:r>
+        <w:rPr>
+          <w:rFonts w:ascii="Times New Roman" w:hAnsi="Times New Roman" w:eastAsia="Times New Roman"/>
+          <w:b w:val="0"/>
+          <w:i w:val="0"/>
+          <w:sz w:val="24"/>
+        </w:rPr>
         <w:t xml:space="preserve">До выполнения ЭхоКГ рассчитывается </w:t>
       </w:r>
       <w:r>
         <w:rPr>
+          <w:rFonts w:ascii="Times New Roman" w:hAnsi="Times New Roman" w:eastAsia="Times New Roman"/>
           <w:b/>
+          <w:i w:val="0"/>
+          <w:sz w:val="24"/>
         </w:rPr>
         <w:t>вероятность сниженной ФВ (&lt;50%)</w:t>
       </w:r>
       <w:r>
+        <w:rPr>
+          <w:rFonts w:ascii="Times New Roman" w:hAnsi="Times New Roman" w:eastAsia="Times New Roman"/>
+          <w:b w:val="0"/>
+          <w:i w:val="0"/>
+          <w:sz w:val="24"/>
+        </w:rPr>
         <w:t xml:space="preserve"> по факторам:</w:t>
       </w:r>
     </w:p>
@@ -853,6 +1383,12 @@
         <w:pStyle w:val="ListBullet"/>
       </w:pPr>
       <w:r>
+        <w:rPr>
+          <w:rFonts w:ascii="Times New Roman" w:hAnsi="Times New Roman" w:eastAsia="Times New Roman"/>
+          <w:b w:val="0"/>
+          <w:i w:val="0"/>
+          <w:sz w:val="24"/>
+        </w:rPr>
         <w:t>возраст, пол;</w:t>
       </w:r>
     </w:p>
@@ -861,6 +1397,12 @@
         <w:pStyle w:val="ListBullet"/>
       </w:pPr>
       <w:r>
+        <w:rPr>
+          <w:rFonts w:ascii="Times New Roman" w:hAnsi="Times New Roman" w:eastAsia="Times New Roman"/>
+          <w:b w:val="0"/>
+          <w:i w:val="0"/>
+          <w:sz w:val="24"/>
+        </w:rPr>
         <w:t>перенесённый ИМ;</w:t>
       </w:r>
     </w:p>
@@ -869,6 +1411,12 @@
         <w:pStyle w:val="ListBullet"/>
       </w:pPr>
       <w:r>
+        <w:rPr>
+          <w:rFonts w:ascii="Times New Roman" w:hAnsi="Times New Roman" w:eastAsia="Times New Roman"/>
+          <w:b w:val="0"/>
+          <w:i w:val="0"/>
+          <w:sz w:val="24"/>
+        </w:rPr>
         <w:t>сахарный диабет, АГ;</w:t>
       </w:r>
     </w:p>
@@ -877,6 +1425,12 @@
         <w:pStyle w:val="ListBullet"/>
       </w:pPr>
       <w:r>
+        <w:rPr>
+          <w:rFonts w:ascii="Times New Roman" w:hAnsi="Times New Roman" w:eastAsia="Times New Roman"/>
+          <w:b w:val="0"/>
+          <w:i w:val="0"/>
+          <w:sz w:val="24"/>
+        </w:rPr>
         <w:t>фибрилляция предсердий;</w:t>
       </w:r>
     </w:p>
@@ -885,6 +1439,12 @@
         <w:pStyle w:val="ListBullet"/>
       </w:pPr>
       <w:r>
+        <w:rPr>
+          <w:rFonts w:ascii="Times New Roman" w:hAnsi="Times New Roman" w:eastAsia="Times New Roman"/>
+          <w:b w:val="0"/>
+          <w:i w:val="0"/>
+          <w:sz w:val="24"/>
+        </w:rPr>
         <w:t>одышка, отёки;</w:t>
       </w:r>
     </w:p>
@@ -893,6 +1453,12 @@
         <w:pStyle w:val="ListBullet"/>
       </w:pPr>
       <w:r>
+        <w:rPr>
+          <w:rFonts w:ascii="Times New Roman" w:hAnsi="Times New Roman" w:eastAsia="Times New Roman"/>
+          <w:b w:val="0"/>
+          <w:i w:val="0"/>
+          <w:sz w:val="24"/>
+        </w:rPr>
         <w:t>длительность QRS;</w:t>
       </w:r>
     </w:p>
@@ -901,17 +1467,32 @@
         <w:pStyle w:val="ListBullet"/>
       </w:pPr>
       <w:r>
+        <w:rPr>
+          <w:rFonts w:ascii="Times New Roman" w:hAnsi="Times New Roman" w:eastAsia="Times New Roman"/>
+          <w:b w:val="0"/>
+          <w:i w:val="0"/>
+          <w:sz w:val="24"/>
+        </w:rPr>
         <w:t>NT-proBNP (при наличии).</w:t>
       </w:r>
     </w:p>
     <w:p>
       <w:r>
         <w:rPr>
+          <w:rFonts w:ascii="Times New Roman" w:hAnsi="Times New Roman" w:eastAsia="Times New Roman"/>
           <w:b/>
+          <w:i w:val="0"/>
+          <w:sz w:val="24"/>
         </w:rPr>
         <w:t>Экспорт PDF</w:t>
       </w:r>
       <w:r>
+        <w:rPr>
+          <w:rFonts w:ascii="Times New Roman" w:hAnsi="Times New Roman" w:eastAsia="Times New Roman"/>
+          <w:b w:val="0"/>
+          <w:i w:val="0"/>
+          <w:sz w:val="24"/>
+        </w:rPr>
         <w:t xml:space="preserve"> доступен для всех методов расчёта.</w:t>
       </w:r>
     </w:p>
@@ -939,9 +1520,13 @@
             <w:tcW w:type="dxa" w:w="4844"/>
           </w:tcPr>
           <w:p>
+            <w:r/>
             <w:r>
               <w:rPr>
+                <w:rFonts w:ascii="Times New Roman" w:hAnsi="Times New Roman" w:eastAsia="Times New Roman"/>
                 <w:b/>
+                <w:i w:val="0"/>
+                <w:sz w:val="24"/>
               </w:rPr>
               <w:t>ФВ ЛЖ</w:t>
             </w:r>
@@ -952,9 +1537,13 @@
             <w:tcW w:type="dxa" w:w="4844"/>
           </w:tcPr>
           <w:p>
+            <w:r/>
             <w:r>
               <w:rPr>
+                <w:rFonts w:ascii="Times New Roman" w:hAnsi="Times New Roman" w:eastAsia="Times New Roman"/>
                 <w:b/>
+                <w:i w:val="0"/>
+                <w:sz w:val="24"/>
               </w:rPr>
               <w:t>Категория</w:t>
             </w:r>
@@ -967,7 +1556,14 @@
             <w:tcW w:type="dxa" w:w="4844"/>
           </w:tcPr>
           <w:p>
+            <w:r/>
             <w:r>
+              <w:rPr>
+                <w:rFonts w:ascii="Times New Roman" w:hAnsi="Times New Roman" w:eastAsia="Times New Roman"/>
+                <w:b w:val="0"/>
+                <w:i w:val="0"/>
+                <w:sz w:val="24"/>
+              </w:rPr>
               <w:t>≥55%</w:t>
             </w:r>
           </w:p>
@@ -977,7 +1573,14 @@
             <w:tcW w:type="dxa" w:w="4844"/>
           </w:tcPr>
           <w:p>
+            <w:r/>
             <w:r>
+              <w:rPr>
+                <w:rFonts w:ascii="Times New Roman" w:hAnsi="Times New Roman" w:eastAsia="Times New Roman"/>
+                <w:b w:val="0"/>
+                <w:i w:val="0"/>
+                <w:sz w:val="24"/>
+              </w:rPr>
               <w:t>Норма</w:t>
             </w:r>
           </w:p>
@@ -989,8 +1592,15 @@
             <w:tcW w:type="dxa" w:w="4844"/>
           </w:tcPr>
           <w:p>
+            <w:r/>
             <w:r>
-              <w:t>41–54%</w:t>
+              <w:rPr>
+                <w:rFonts w:ascii="Times New Roman" w:hAnsi="Times New Roman" w:eastAsia="Times New Roman"/>
+                <w:b w:val="0"/>
+                <w:i w:val="0"/>
+                <w:sz w:val="24"/>
+              </w:rPr>
+              <w:t>41-54%</w:t>
             </w:r>
           </w:p>
         </w:tc>
@@ -999,7 +1609,14 @@
             <w:tcW w:type="dxa" w:w="4844"/>
           </w:tcPr>
           <w:p>
+            <w:r/>
             <w:r>
+              <w:rPr>
+                <w:rFonts w:ascii="Times New Roman" w:hAnsi="Times New Roman" w:eastAsia="Times New Roman"/>
+                <w:b w:val="0"/>
+                <w:i w:val="0"/>
+                <w:sz w:val="24"/>
+              </w:rPr>
               <w:t>Незначительно снижена</w:t>
             </w:r>
           </w:p>
@@ -1011,8 +1628,15 @@
             <w:tcW w:type="dxa" w:w="4844"/>
           </w:tcPr>
           <w:p>
+            <w:r/>
             <w:r>
-              <w:t>30–40%</w:t>
+              <w:rPr>
+                <w:rFonts w:ascii="Times New Roman" w:hAnsi="Times New Roman" w:eastAsia="Times New Roman"/>
+                <w:b w:val="0"/>
+                <w:i w:val="0"/>
+                <w:sz w:val="24"/>
+              </w:rPr>
+              <w:t>30-40%</w:t>
             </w:r>
           </w:p>
         </w:tc>
@@ -1021,7 +1645,14 @@
             <w:tcW w:type="dxa" w:w="4844"/>
           </w:tcPr>
           <w:p>
+            <w:r/>
             <w:r>
+              <w:rPr>
+                <w:rFonts w:ascii="Times New Roman" w:hAnsi="Times New Roman" w:eastAsia="Times New Roman"/>
+                <w:b w:val="0"/>
+                <w:i w:val="0"/>
+                <w:sz w:val="24"/>
+              </w:rPr>
               <w:t>Умеренно снижена</w:t>
             </w:r>
           </w:p>
@@ -1033,7 +1664,14 @@
             <w:tcW w:type="dxa" w:w="4844"/>
           </w:tcPr>
           <w:p>
+            <w:r/>
             <w:r>
+              <w:rPr>
+                <w:rFonts w:ascii="Times New Roman" w:hAnsi="Times New Roman" w:eastAsia="Times New Roman"/>
+                <w:b w:val="0"/>
+                <w:i w:val="0"/>
+                <w:sz w:val="24"/>
+              </w:rPr>
               <w:t>&lt;30%</w:t>
             </w:r>
           </w:p>
@@ -1043,7 +1681,14 @@
             <w:tcW w:type="dxa" w:w="4844"/>
           </w:tcPr>
           <w:p>
+            <w:r/>
             <w:r>
+              <w:rPr>
+                <w:rFonts w:ascii="Times New Roman" w:hAnsi="Times New Roman" w:eastAsia="Times New Roman"/>
+                <w:b w:val="0"/>
+                <w:i w:val="0"/>
+                <w:sz w:val="24"/>
+              </w:rPr>
               <w:t>Выраженно снижена</w:t>
             </w:r>
           </w:p>
@@ -1054,45 +1699,84 @@
     <w:p>
       <w:r>
         <w:rPr>
+          <w:rFonts w:ascii="Times New Roman" w:hAnsi="Times New Roman" w:eastAsia="Times New Roman"/>
           <w:b/>
+          <w:i w:val="0"/>
+          <w:sz w:val="24"/>
         </w:rPr>
         <w:t>Ограничение:</w:t>
       </w:r>
       <w:r>
+        <w:rPr>
+          <w:rFonts w:ascii="Times New Roman" w:hAnsi="Times New Roman" w:eastAsia="Times New Roman"/>
+          <w:b w:val="0"/>
+          <w:i w:val="0"/>
+          <w:sz w:val="24"/>
+        </w:rPr>
         <w:t xml:space="preserve"> сервис не заменяет официальное заключение ЭхоКГ; результаты требуют клинической интерпретации кардиологом.</w:t>
       </w:r>
     </w:p>
     <w:p>
       <w:r>
         <w:rPr>
+          <w:rFonts w:ascii="Times New Roman" w:hAnsi="Times New Roman" w:eastAsia="Times New Roman"/>
           <w:b/>
+          <w:i w:val="0"/>
+          <w:sz w:val="24"/>
         </w:rPr>
         <w:t>Файлы:</w:t>
       </w:r>
       <w:r>
+        <w:rPr>
+          <w:rFonts w:ascii="Times New Roman" w:hAnsi="Times New Roman" w:eastAsia="Times New Roman"/>
+          <w:b w:val="0"/>
+          <w:i w:val="0"/>
+          <w:sz w:val="24"/>
+        </w:rPr>
         <w:t xml:space="preserve"> </w:t>
       </w:r>
       <w:r>
         <w:rPr>
-          <w:rFonts w:ascii="Courier New" w:hAnsi="Courier New"/>
+          <w:rFonts w:ascii="Courier New" w:hAnsi="Courier New" w:eastAsia="Times New Roman"/>
+          <w:b w:val="0"/>
+          <w:i w:val="0"/>
+          <w:sz w:val="24"/>
         </w:rPr>
         <w:t>lvef_app.py</w:t>
       </w:r>
       <w:r>
+        <w:rPr>
+          <w:rFonts w:ascii="Times New Roman" w:hAnsi="Times New Roman" w:eastAsia="Times New Roman"/>
+          <w:b w:val="0"/>
+          <w:i w:val="0"/>
+          <w:sz w:val="24"/>
+        </w:rPr>
         <w:t xml:space="preserve">, </w:t>
       </w:r>
       <w:r>
         <w:rPr>
-          <w:rFonts w:ascii="Courier New" w:hAnsi="Courier New"/>
+          <w:rFonts w:ascii="Courier New" w:hAnsi="Courier New" w:eastAsia="Times New Roman"/>
+          <w:b w:val="0"/>
+          <w:i w:val="0"/>
+          <w:sz w:val="24"/>
         </w:rPr>
         <w:t>clinical/lvef.py</w:t>
       </w:r>
       <w:r>
+        <w:rPr>
+          <w:rFonts w:ascii="Times New Roman" w:hAnsi="Times New Roman" w:eastAsia="Times New Roman"/>
+          <w:b w:val="0"/>
+          <w:i w:val="0"/>
+          <w:sz w:val="24"/>
+        </w:rPr>
         <w:t xml:space="preserve">, </w:t>
       </w:r>
       <w:r>
         <w:rPr>
-          <w:rFonts w:ascii="Courier New" w:hAnsi="Courier New"/>
+          <w:rFonts w:ascii="Courier New" w:hAnsi="Courier New" w:eastAsia="Times New Roman"/>
+          <w:b w:val="0"/>
+          <w:i w:val="0"/>
+          <w:sz w:val="24"/>
         </w:rPr>
         <w:t>deploy/LVEF.md</w:t>
       </w:r>
@@ -1102,39 +1786,66 @@
         <w:pStyle w:val="Heading2"/>
       </w:pPr>
       <w:r>
-        <w:t>5. MD Choice — прогнозирование выбора препарата при СД2</w:t>
+        <w:t>5. MD Choice - прогнозирование выбора препарата при СД2</w:t>
       </w:r>
     </w:p>
     <w:p>
       <w:r>
         <w:rPr>
+          <w:rFonts w:ascii="Times New Roman" w:hAnsi="Times New Roman" w:eastAsia="Times New Roman"/>
           <w:b/>
+          <w:i w:val="0"/>
+          <w:sz w:val="24"/>
         </w:rPr>
         <w:t>URL:</w:t>
       </w:r>
       <w:r>
+        <w:rPr>
+          <w:rFonts w:ascii="Times New Roman" w:hAnsi="Times New Roman" w:eastAsia="Times New Roman"/>
+          <w:b w:val="0"/>
+          <w:i w:val="0"/>
+          <w:sz w:val="24"/>
+        </w:rPr>
         <w:t xml:space="preserve"> http://ikorsakov.tech:7777/</w:t>
       </w:r>
     </w:p>
     <w:p>
       <w:r>
         <w:rPr>
+          <w:rFonts w:ascii="Times New Roman" w:hAnsi="Times New Roman" w:eastAsia="Times New Roman"/>
           <w:b/>
+          <w:i w:val="0"/>
+          <w:sz w:val="24"/>
         </w:rPr>
         <w:t>Стек:</w:t>
       </w:r>
       <w:r>
+        <w:rPr>
+          <w:rFonts w:ascii="Times New Roman" w:hAnsi="Times New Roman" w:eastAsia="Times New Roman"/>
+          <w:b w:val="0"/>
+          <w:i w:val="0"/>
+          <w:sz w:val="24"/>
+        </w:rPr>
         <w:t xml:space="preserve"> Python, Streamlit, scikit-learn (Random Forest)</w:t>
       </w:r>
     </w:p>
     <w:p>
       <w:r>
         <w:rPr>
+          <w:rFonts w:ascii="Times New Roman" w:hAnsi="Times New Roman" w:eastAsia="Times New Roman"/>
           <w:b/>
+          <w:i w:val="0"/>
+          <w:sz w:val="24"/>
         </w:rPr>
         <w:t>Назначение:</w:t>
       </w:r>
       <w:r>
+        <w:rPr>
+          <w:rFonts w:ascii="Times New Roman" w:hAnsi="Times New Roman" w:eastAsia="Times New Roman"/>
+          <w:b w:val="0"/>
+          <w:i w:val="0"/>
+          <w:sz w:val="24"/>
+        </w:rPr>
         <w:t xml:space="preserve"> система поддержки принятия врачебных решений (СППВР) для выбора класса сахароснижающего препарата при сахарном диабете 2 типа на основе машинного обучения.</w:t>
       </w:r>
     </w:p>
@@ -1151,6 +1862,12 @@
         <w:pStyle w:val="ListBullet"/>
       </w:pPr>
       <w:r>
+        <w:rPr>
+          <w:rFonts w:ascii="Times New Roman" w:hAnsi="Times New Roman" w:eastAsia="Times New Roman"/>
+          <w:b w:val="0"/>
+          <w:i w:val="0"/>
+          <w:sz w:val="24"/>
+        </w:rPr>
         <w:t>возраст, ИМТ, HbA1c, рСКФ, длительность СД;</w:t>
       </w:r>
     </w:p>
@@ -1159,6 +1876,12 @@
         <w:pStyle w:val="ListBullet"/>
       </w:pPr>
       <w:r>
+        <w:rPr>
+          <w:rFonts w:ascii="Times New Roman" w:hAnsi="Times New Roman" w:eastAsia="Times New Roman"/>
+          <w:b w:val="0"/>
+          <w:i w:val="0"/>
+          <w:sz w:val="24"/>
+        </w:rPr>
         <w:t>сердечно-сосудистые заболевания, сердечная недостаточность;</w:t>
       </w:r>
     </w:p>
@@ -1167,6 +1890,12 @@
         <w:pStyle w:val="ListBullet"/>
       </w:pPr>
       <w:r>
+        <w:rPr>
+          <w:rFonts w:ascii="Times New Roman" w:hAnsi="Times New Roman" w:eastAsia="Times New Roman"/>
+          <w:b w:val="0"/>
+          <w:i w:val="0"/>
+          <w:sz w:val="24"/>
+        </w:rPr>
         <w:t>риск гипогликемии, цель снижения веса;</w:t>
       </w:r>
     </w:p>
@@ -1175,6 +1904,12 @@
         <w:pStyle w:val="ListBullet"/>
       </w:pPr>
       <w:r>
+        <w:rPr>
+          <w:rFonts w:ascii="Times New Roman" w:hAnsi="Times New Roman" w:eastAsia="Times New Roman"/>
+          <w:b w:val="0"/>
+          <w:i w:val="0"/>
+          <w:sz w:val="24"/>
+        </w:rPr>
         <w:t>текущая терапия (метформин, инсулин).</w:t>
       </w:r>
     </w:p>
@@ -1188,6 +1923,12 @@
     </w:p>
     <w:p>
       <w:r>
+        <w:rPr>
+          <w:rFonts w:ascii="Times New Roman" w:hAnsi="Times New Roman" w:eastAsia="Times New Roman"/>
+          <w:b w:val="0"/>
+          <w:i w:val="0"/>
+          <w:sz w:val="24"/>
+        </w:rPr>
         <w:t>Ранжирование классов препаратов с вероятностями:</w:t>
       </w:r>
     </w:p>
@@ -1196,6 +1937,12 @@
         <w:pStyle w:val="ListBullet"/>
       </w:pPr>
       <w:r>
+        <w:rPr>
+          <w:rFonts w:ascii="Times New Roman" w:hAnsi="Times New Roman" w:eastAsia="Times New Roman"/>
+          <w:b w:val="0"/>
+          <w:i w:val="0"/>
+          <w:sz w:val="24"/>
+        </w:rPr>
         <w:t>метформин;</w:t>
       </w:r>
     </w:p>
@@ -1204,6 +1951,12 @@
         <w:pStyle w:val="ListBullet"/>
       </w:pPr>
       <w:r>
+        <w:rPr>
+          <w:rFonts w:ascii="Times New Roman" w:hAnsi="Times New Roman" w:eastAsia="Times New Roman"/>
+          <w:b w:val="0"/>
+          <w:i w:val="0"/>
+          <w:sz w:val="24"/>
+        </w:rPr>
         <w:t>иНГЛТ-2 (SGLT2);</w:t>
       </w:r>
     </w:p>
@@ -1212,6 +1965,12 @@
         <w:pStyle w:val="ListBullet"/>
       </w:pPr>
       <w:r>
+        <w:rPr>
+          <w:rFonts w:ascii="Times New Roman" w:hAnsi="Times New Roman" w:eastAsia="Times New Roman"/>
+          <w:b w:val="0"/>
+          <w:i w:val="0"/>
+          <w:sz w:val="24"/>
+        </w:rPr>
         <w:t>аГПП-1 (GLP-1);</w:t>
       </w:r>
     </w:p>
@@ -1220,6 +1979,12 @@
         <w:pStyle w:val="ListBullet"/>
       </w:pPr>
       <w:r>
+        <w:rPr>
+          <w:rFonts w:ascii="Times New Roman" w:hAnsi="Times New Roman" w:eastAsia="Times New Roman"/>
+          <w:b w:val="0"/>
+          <w:i w:val="0"/>
+          <w:sz w:val="24"/>
+        </w:rPr>
         <w:t>иППП-4 (DPP-4);</w:t>
       </w:r>
     </w:p>
@@ -1228,6 +1993,12 @@
         <w:pStyle w:val="ListBullet"/>
       </w:pPr>
       <w:r>
+        <w:rPr>
+          <w:rFonts w:ascii="Times New Roman" w:hAnsi="Times New Roman" w:eastAsia="Times New Roman"/>
+          <w:b w:val="0"/>
+          <w:i w:val="0"/>
+          <w:sz w:val="24"/>
+        </w:rPr>
         <w:t>сульфонилмочевины;</w:t>
       </w:r>
     </w:p>
@@ -1236,29 +2007,59 @@
         <w:pStyle w:val="ListBullet"/>
       </w:pPr>
       <w:r>
+        <w:rPr>
+          <w:rFonts w:ascii="Times New Roman" w:hAnsi="Times New Roman" w:eastAsia="Times New Roman"/>
+          <w:b w:val="0"/>
+          <w:i w:val="0"/>
+          <w:sz w:val="24"/>
+        </w:rPr>
         <w:t>инсулин.</w:t>
       </w:r>
     </w:p>
     <w:p>
       <w:r>
-        <w:t xml:space="preserve">Для каждого варианта — </w:t>
+        <w:rPr>
+          <w:rFonts w:ascii="Times New Roman" w:hAnsi="Times New Roman" w:eastAsia="Times New Roman"/>
+          <w:b w:val="0"/>
+          <w:i w:val="0"/>
+          <w:sz w:val="24"/>
+        </w:rPr>
+        <w:t xml:space="preserve">Для каждого варианта - </w:t>
       </w:r>
       <w:r>
         <w:rPr>
+          <w:rFonts w:ascii="Times New Roman" w:hAnsi="Times New Roman" w:eastAsia="Times New Roman"/>
           <w:b/>
+          <w:i w:val="0"/>
+          <w:sz w:val="24"/>
         </w:rPr>
         <w:t>клиническое обоснование</w:t>
       </w:r>
       <w:r>
+        <w:rPr>
+          <w:rFonts w:ascii="Times New Roman" w:hAnsi="Times New Roman" w:eastAsia="Times New Roman"/>
+          <w:b w:val="0"/>
+          <w:i w:val="0"/>
+          <w:sz w:val="24"/>
+        </w:rPr>
         <w:t xml:space="preserve">, предупреждения (почки, гипогликемия), </w:t>
       </w:r>
       <w:r>
         <w:rPr>
+          <w:rFonts w:ascii="Times New Roman" w:hAnsi="Times New Roman" w:eastAsia="Times New Roman"/>
           <w:b/>
+          <w:i w:val="0"/>
+          <w:sz w:val="24"/>
         </w:rPr>
         <w:t>экспорт PDF</w:t>
       </w:r>
       <w:r>
+        <w:rPr>
+          <w:rFonts w:ascii="Times New Roman" w:hAnsi="Times New Roman" w:eastAsia="Times New Roman"/>
+          <w:b w:val="0"/>
+          <w:i w:val="0"/>
+          <w:sz w:val="24"/>
+        </w:rPr>
         <w:t>.</w:t>
       </w:r>
     </w:p>
@@ -1272,60 +2073,114 @@
     </w:p>
     <w:p>
       <w:r>
+        <w:rPr>
+          <w:rFonts w:ascii="Times New Roman" w:hAnsi="Times New Roman" w:eastAsia="Times New Roman"/>
+          <w:b w:val="0"/>
+          <w:i w:val="0"/>
+          <w:sz w:val="24"/>
+        </w:rPr>
         <w:t xml:space="preserve">Модель </w:t>
       </w:r>
       <w:r>
         <w:rPr>
+          <w:rFonts w:ascii="Times New Roman" w:hAnsi="Times New Roman" w:eastAsia="Times New Roman"/>
           <w:b/>
+          <w:i w:val="0"/>
+          <w:sz w:val="24"/>
         </w:rPr>
         <w:t>Random Forest</w:t>
       </w:r>
       <w:r>
+        <w:rPr>
+          <w:rFonts w:ascii="Times New Roman" w:hAnsi="Times New Roman" w:eastAsia="Times New Roman"/>
+          <w:b w:val="0"/>
+          <w:i w:val="0"/>
+          <w:sz w:val="24"/>
+        </w:rPr>
         <w:t>, обученная на клинически размеченном датасете профилей пациентов с СД2 с учётом современных подходов к персонализации терапии (ССЗ, ХСН, ожирение, функция почек).</w:t>
       </w:r>
     </w:p>
     <w:p>
       <w:r>
         <w:rPr>
+          <w:rFonts w:ascii="Times New Roman" w:hAnsi="Times New Roman" w:eastAsia="Times New Roman"/>
           <w:b/>
+          <w:i w:val="0"/>
+          <w:sz w:val="24"/>
         </w:rPr>
         <w:t>Ограничение:</w:t>
       </w:r>
       <w:r>
+        <w:rPr>
+          <w:rFonts w:ascii="Times New Roman" w:hAnsi="Times New Roman" w:eastAsia="Times New Roman"/>
+          <w:b w:val="0"/>
+          <w:i w:val="0"/>
+          <w:sz w:val="24"/>
+        </w:rPr>
         <w:t xml:space="preserve"> СППВР не заменяет клинические рекомендации и решение лечащего врача.</w:t>
       </w:r>
     </w:p>
     <w:p>
       <w:r>
         <w:rPr>
+          <w:rFonts w:ascii="Times New Roman" w:hAnsi="Times New Roman" w:eastAsia="Times New Roman"/>
           <w:b/>
+          <w:i w:val="0"/>
+          <w:sz w:val="24"/>
         </w:rPr>
         <w:t>Файлы:</w:t>
       </w:r>
       <w:r>
+        <w:rPr>
+          <w:rFonts w:ascii="Times New Roman" w:hAnsi="Times New Roman" w:eastAsia="Times New Roman"/>
+          <w:b w:val="0"/>
+          <w:i w:val="0"/>
+          <w:sz w:val="24"/>
+        </w:rPr>
         <w:t xml:space="preserve"> </w:t>
       </w:r>
       <w:r>
         <w:rPr>
-          <w:rFonts w:ascii="Courier New" w:hAnsi="Courier New"/>
+          <w:rFonts w:ascii="Courier New" w:hAnsi="Courier New" w:eastAsia="Times New Roman"/>
+          <w:b w:val="0"/>
+          <w:i w:val="0"/>
+          <w:sz w:val="24"/>
         </w:rPr>
         <w:t>md_choice_app.py</w:t>
       </w:r>
       <w:r>
+        <w:rPr>
+          <w:rFonts w:ascii="Times New Roman" w:hAnsi="Times New Roman" w:eastAsia="Times New Roman"/>
+          <w:b w:val="0"/>
+          <w:i w:val="0"/>
+          <w:sz w:val="24"/>
+        </w:rPr>
         <w:t xml:space="preserve">, </w:t>
       </w:r>
       <w:r>
         <w:rPr>
-          <w:rFonts w:ascii="Courier New" w:hAnsi="Courier New"/>
+          <w:rFonts w:ascii="Courier New" w:hAnsi="Courier New" w:eastAsia="Times New Roman"/>
+          <w:b w:val="0"/>
+          <w:i w:val="0"/>
+          <w:sz w:val="24"/>
         </w:rPr>
         <w:t>clinical/md_choice.py</w:t>
       </w:r>
       <w:r>
+        <w:rPr>
+          <w:rFonts w:ascii="Times New Roman" w:hAnsi="Times New Roman" w:eastAsia="Times New Roman"/>
+          <w:b w:val="0"/>
+          <w:i w:val="0"/>
+          <w:sz w:val="24"/>
+        </w:rPr>
         <w:t xml:space="preserve">, </w:t>
       </w:r>
       <w:r>
         <w:rPr>
-          <w:rFonts w:ascii="Courier New" w:hAnsi="Courier New"/>
+          <w:rFonts w:ascii="Courier New" w:hAnsi="Courier New" w:eastAsia="Times New Roman"/>
+          <w:b w:val="0"/>
+          <w:i w:val="0"/>
+          <w:sz w:val="24"/>
         </w:rPr>
         <w:t>deploy/MD_CHOICE.md</w:t>
       </w:r>
@@ -1344,11 +2199,20 @@
       </w:pPr>
       <w:r>
         <w:rPr>
+          <w:rFonts w:ascii="Times New Roman" w:hAnsi="Times New Roman" w:eastAsia="Times New Roman"/>
           <w:b/>
+          <w:i w:val="0"/>
+          <w:sz w:val="24"/>
         </w:rPr>
         <w:t>Деплой:</w:t>
       </w:r>
       <w:r>
+        <w:rPr>
+          <w:rFonts w:ascii="Times New Roman" w:hAnsi="Times New Roman" w:eastAsia="Times New Roman"/>
+          <w:b w:val="0"/>
+          <w:i w:val="0"/>
+          <w:sz w:val="24"/>
+        </w:rPr>
         <w:t xml:space="preserve"> VPS, systemd, Nginx, отдельные порты для каждого сервиса</w:t>
       </w:r>
     </w:p>
@@ -1358,12 +2222,21 @@
       </w:pPr>
       <w:r>
         <w:rPr>
+          <w:rFonts w:ascii="Times New Roman" w:hAnsi="Times New Roman" w:eastAsia="Times New Roman"/>
           <w:b/>
+          <w:i w:val="0"/>
+          <w:sz w:val="24"/>
         </w:rPr>
         <w:t>Безопасность:</w:t>
       </w:r>
       <w:r>
-        <w:t xml:space="preserve"> HTTPS для анамнеза; для калькуляторов — внутренний Streamlit + Nginx proxy</w:t>
+        <w:rPr>
+          <w:rFonts w:ascii="Times New Roman" w:hAnsi="Times New Roman" w:eastAsia="Times New Roman"/>
+          <w:b w:val="0"/>
+          <w:i w:val="0"/>
+          <w:sz w:val="24"/>
+        </w:rPr>
+        <w:t xml:space="preserve"> HTTPS для анамнеза; для калькуляторов - внутренний Streamlit + Nginx proxy</w:t>
       </w:r>
     </w:p>
     <w:p>
@@ -1372,11 +2245,20 @@
       </w:pPr>
       <w:r>
         <w:rPr>
+          <w:rFonts w:ascii="Times New Roman" w:hAnsi="Times New Roman" w:eastAsia="Times New Roman"/>
           <w:b/>
+          <w:i w:val="0"/>
+          <w:sz w:val="24"/>
         </w:rPr>
         <w:t>Документация:</w:t>
       </w:r>
       <w:r>
+        <w:rPr>
+          <w:rFonts w:ascii="Times New Roman" w:hAnsi="Times New Roman" w:eastAsia="Times New Roman"/>
+          <w:b w:val="0"/>
+          <w:i w:val="0"/>
+          <w:sz w:val="24"/>
+        </w:rPr>
         <w:t xml:space="preserve"> README, DEPLOY.md, TRIAL_CALCULATOR.md, LVEF.md, MD_CHOICE.md</w:t>
       </w:r>
     </w:p>
@@ -1404,9 +2286,13 @@
             <w:tcW w:type="dxa" w:w="4844"/>
           </w:tcPr>
           <w:p>
+            <w:r/>
             <w:r>
               <w:rPr>
+                <w:rFonts w:ascii="Times New Roman" w:hAnsi="Times New Roman" w:eastAsia="Times New Roman"/>
                 <w:b/>
+                <w:i w:val="0"/>
+                <w:sz w:val="24"/>
               </w:rPr>
               <w:t>Направление</w:t>
             </w:r>
@@ -1417,9 +2303,13 @@
             <w:tcW w:type="dxa" w:w="4844"/>
           </w:tcPr>
           <w:p>
+            <w:r/>
             <w:r>
               <w:rPr>
+                <w:rFonts w:ascii="Times New Roman" w:hAnsi="Times New Roman" w:eastAsia="Times New Roman"/>
                 <w:b/>
+                <w:i w:val="0"/>
+                <w:sz w:val="24"/>
               </w:rPr>
               <w:t>Задача</w:t>
             </w:r>
@@ -1432,7 +2322,14 @@
             <w:tcW w:type="dxa" w:w="4844"/>
           </w:tcPr>
           <w:p>
+            <w:r/>
             <w:r>
+              <w:rPr>
+                <w:rFonts w:ascii="Times New Roman" w:hAnsi="Times New Roman" w:eastAsia="Times New Roman"/>
+                <w:b w:val="0"/>
+                <w:i w:val="0"/>
+                <w:sz w:val="24"/>
+              </w:rPr>
               <w:t>Анамнез</w:t>
             </w:r>
           </w:p>
@@ -1442,7 +2339,14 @@
             <w:tcW w:type="dxa" w:w="4844"/>
           </w:tcPr>
           <w:p>
+            <w:r/>
             <w:r>
+              <w:rPr>
+                <w:rFonts w:ascii="Times New Roman" w:hAnsi="Times New Roman" w:eastAsia="Times New Roman"/>
+                <w:b w:val="0"/>
+                <w:i w:val="0"/>
+                <w:sz w:val="24"/>
+              </w:rPr>
               <w:t>QR-коды, красивые URL, аудит 152-ФЗ</w:t>
             </w:r>
           </w:p>
@@ -1454,7 +2358,14 @@
             <w:tcW w:type="dxa" w:w="4844"/>
           </w:tcPr>
           <w:p>
+            <w:r/>
             <w:r>
+              <w:rPr>
+                <w:rFonts w:ascii="Times New Roman" w:hAnsi="Times New Roman" w:eastAsia="Times New Roman"/>
+                <w:b w:val="0"/>
+                <w:i w:val="0"/>
+                <w:sz w:val="24"/>
+              </w:rPr>
               <w:t>Калькулятор КИ</w:t>
             </w:r>
           </w:p>
@@ -1464,7 +2375,14 @@
             <w:tcW w:type="dxa" w:w="4844"/>
           </w:tcPr>
           <w:p>
+            <w:r/>
             <w:r>
+              <w:rPr>
+                <w:rFonts w:ascii="Times New Roman" w:hAnsi="Times New Roman" w:eastAsia="Times New Roman"/>
+                <w:b w:val="0"/>
+                <w:i w:val="0"/>
+                <w:sz w:val="24"/>
+              </w:rPr>
               <w:t>Paired design, кластерная рандомизация</w:t>
             </w:r>
           </w:p>
@@ -1476,7 +2394,14 @@
             <w:tcW w:type="dxa" w:w="4844"/>
           </w:tcPr>
           <w:p>
+            <w:r/>
             <w:r>
+              <w:rPr>
+                <w:rFonts w:ascii="Times New Roman" w:hAnsi="Times New Roman" w:eastAsia="Times New Roman"/>
+                <w:b w:val="0"/>
+                <w:i w:val="0"/>
+                <w:sz w:val="24"/>
+              </w:rPr>
               <w:t>ФВ ЛЖ</w:t>
             </w:r>
           </w:p>
@@ -1486,7 +2411,14 @@
             <w:tcW w:type="dxa" w:w="4844"/>
           </w:tcPr>
           <w:p>
+            <w:r/>
             <w:r>
+              <w:rPr>
+                <w:rFonts w:ascii="Times New Roman" w:hAnsi="Times New Roman" w:eastAsia="Times New Roman"/>
+                <w:b w:val="0"/>
+                <w:i w:val="0"/>
+                <w:sz w:val="24"/>
+              </w:rPr>
               <w:t>ML-модель по данным ЭхоКГ, архив расчётов</w:t>
             </w:r>
           </w:p>
@@ -1498,7 +2430,14 @@
             <w:tcW w:type="dxa" w:w="4844"/>
           </w:tcPr>
           <w:p>
+            <w:r/>
             <w:r>
+              <w:rPr>
+                <w:rFonts w:ascii="Times New Roman" w:hAnsi="Times New Roman" w:eastAsia="Times New Roman"/>
+                <w:b w:val="0"/>
+                <w:i w:val="0"/>
+                <w:sz w:val="24"/>
+              </w:rPr>
               <w:t>MD Choice</w:t>
             </w:r>
           </w:p>
@@ -1508,7 +2447,14 @@
             <w:tcW w:type="dxa" w:w="4844"/>
           </w:tcPr>
           <w:p>
+            <w:r/>
             <w:r>
+              <w:rPr>
+                <w:rFonts w:ascii="Times New Roman" w:hAnsi="Times New Roman" w:eastAsia="Times New Roman"/>
+                <w:b w:val="0"/>
+                <w:i w:val="0"/>
+                <w:sz w:val="24"/>
+              </w:rPr>
               <w:t>Обучение на реальных клинических данных, интеграция с анамнезом</w:t>
             </w:r>
           </w:p>
@@ -1520,7 +2466,14 @@
             <w:tcW w:type="dxa" w:w="4844"/>
           </w:tcPr>
           <w:p>
+            <w:r/>
             <w:r>
+              <w:rPr>
+                <w:rFonts w:ascii="Times New Roman" w:hAnsi="Times New Roman" w:eastAsia="Times New Roman"/>
+                <w:b w:val="0"/>
+                <w:i w:val="0"/>
+                <w:sz w:val="24"/>
+              </w:rPr>
               <w:t>Общее</w:t>
             </w:r>
           </w:p>
@@ -1530,7 +2483,14 @@
             <w:tcW w:type="dxa" w:w="4844"/>
           </w:tcPr>
           <w:p>
+            <w:r/>
             <w:r>
+              <w:rPr>
+                <w:rFonts w:ascii="Times New Roman" w:hAnsi="Times New Roman" w:eastAsia="Times New Roman"/>
+                <w:b w:val="0"/>
+                <w:i w:val="0"/>
+                <w:sz w:val="24"/>
+              </w:rPr>
               <w:t>Единый портал медицинских инструментов на ikorsakov.tech</w:t>
             </w:r>
           </w:p>
@@ -1552,10 +2512,12 @@
       </w:pPr>
       <w:r>
         <w:rPr>
+          <w:rFonts w:ascii="Times New Roman" w:hAnsi="Times New Roman" w:eastAsia="Times New Roman"/>
+          <w:b w:val="0"/>
           <w:i/>
-          <w:color w:val="333333"/>
+          <w:sz w:val="24"/>
         </w:rPr>
-        <w:t>С начала 2026 года старший научный сотрудник Корсаков И.Н. разработал и развёрнул четыре цифровых медицинских сервиса: MVP предприёмного эндокринологического анамнеза (anamnes.ikorsakov.tech); MD Choice — систему поддержки принятия врачебных решений для прогнозирования выбора препарата при СД2 на основе машинного обучения (ikorsakov.tech:7777); калькулятор расчёта выборки для клинических испытаний (ikorsakov.tech:8080); сервис прогнозирования фракции выброса левого желудочка (ikorsakov.tech:9999). Все решения документированы и готовы к пилотному использованию в клинической и исследовательской практике.</w:t>
+        <w:t>С начала 2026 года старший научный сотрудник Корсаков И.Н. разработал и развёрнул четыре цифровых медицинских сервиса: MVP предприёмного эндокринологического анамнеза (anamnes.ikorsakov.tech); MD Choice - систему поддержки принятия врачебных решений для прогнозирования выбора препарата при СД2 на основе машинного обучения (ikorsakov.tech:7777); калькулятор расчёта выборки для клинических испытаний (ikorsakov.tech:8080); сервис прогнозирования фракции выброса левого желудочка (ikorsakov.tech:9999). Все решения документированы и готовы к пилотному использованию в клинической и исследовательской практике.</w:t>
       </w:r>
     </w:p>
     <w:sectPr>

</xml_diff>

<commit_message>
Rewrite medical report as narrative emphasizing clinical value for physicians.
Expand sections with problem statements, completed work descriptions,
and practical benefits for doctors instead of terse bullet lists.

Co-authored-by: Igor N Korsakov <igor.korsa@gmail.com>
</commit_message>
<xml_diff>
--- a/docs/MEDICAL_REPORT_2026.docx
+++ b/docs/MEDICAL_REPORT_2026.docx
@@ -101,7 +101,15 @@
           <w:i w:val="0"/>
           <w:sz w:val="24"/>
         </w:rPr>
-        <w:t xml:space="preserve"> цифровые медицинские инструменты, эндокринология, кардиология, клинические исследования</w:t>
+        <w:t xml:space="preserve"> цифровизация клинической практики, эндокринология, кардиология, клинические исследования</w:t>
+      </w:r>
+    </w:p>
+    <w:p>
+      <w:pPr>
+        <w:pStyle w:val="Heading2"/>
+      </w:pPr>
+      <w:r>
+        <w:t>1. Введение и актуальность</w:t>
       </w:r>
     </w:p>
     <w:p>
@@ -112,16 +120,16 @@
           <w:i w:val="0"/>
           <w:sz w:val="24"/>
         </w:rPr>
-        <w:t xml:space="preserve">Форматы отчёта: </w:t>
+        <w:t xml:space="preserve">В начале 2026 года была развёрнута программа создания </w:t>
       </w:r>
       <w:r>
         <w:rPr>
-          <w:rFonts w:ascii="Courier New" w:hAnsi="Courier New" w:eastAsia="Times New Roman"/>
-          <w:b w:val="0"/>
+          <w:rFonts w:ascii="Times New Roman" w:hAnsi="Times New Roman" w:eastAsia="Times New Roman"/>
+          <w:b/>
           <w:i w:val="0"/>
           <w:sz w:val="24"/>
         </w:rPr>
-        <w:t>docs/MEDICAL_REPORT_2026.docx</w:t>
+        <w:t>практико-ориентированных цифровых инструментов</w:t>
       </w:r>
       <w:r>
         <w:rPr>
@@ -130,33 +138,7 @@
           <w:i w:val="0"/>
           <w:sz w:val="24"/>
         </w:rPr>
-        <w:t xml:space="preserve"> (для правки в Word), </w:t>
-      </w:r>
-      <w:r>
-        <w:rPr>
-          <w:rFonts w:ascii="Courier New" w:hAnsi="Courier New" w:eastAsia="Times New Roman"/>
-          <w:b w:val="0"/>
-          <w:i w:val="0"/>
-          <w:sz w:val="24"/>
-        </w:rPr>
-        <w:t>docs/MEDICAL_REPORT_2026.pdf</w:t>
-      </w:r>
-      <w:r>
-        <w:rPr>
-          <w:rFonts w:ascii="Times New Roman" w:hAnsi="Times New Roman" w:eastAsia="Times New Roman"/>
-          <w:b w:val="0"/>
-          <w:i w:val="0"/>
-          <w:sz w:val="24"/>
-        </w:rPr>
-        <w:t>.</w:t>
-      </w:r>
-    </w:p>
-    <w:p>
-      <w:pPr>
-        <w:pStyle w:val="Heading2"/>
-      </w:pPr>
-      <w:r>
-        <w:t>1. Краткое резюме</w:t>
+        <w:t xml:space="preserve"> для врачей и исследователей. Задача состояла не в разработке абстрактного программного обеспечения, а в решении конкретных ежедневных проблем медицинской практики: неполный анамнез к моменту приёма, затраты времени врача на рутинный сбор данных, необходимость быстрой клинико-статистической поддержки при планировании исследований и принятии терапевтических решений.</w:t>
       </w:r>
     </w:p>
     <w:p>
@@ -167,7 +149,7 @@
           <w:i w:val="0"/>
           <w:sz w:val="24"/>
         </w:rPr>
-        <w:t xml:space="preserve">С начала 2026 года разработаны и внедрены </w:t>
+        <w:t xml:space="preserve">За отчётный период спроектированы, реализованы, развёрнуты на сервере и подготовлены к пилотному использованию </w:t>
       </w:r>
       <w:r>
         <w:rPr>
@@ -176,7 +158,7 @@
           <w:i w:val="0"/>
           <w:sz w:val="24"/>
         </w:rPr>
-        <w:t>четыре веб-сервиса</w:t>
+        <w:t>четыре самостоятельных веб-сервиса</w:t>
       </w:r>
       <w:r>
         <w:rPr>
@@ -185,7 +167,45 @@
           <w:i w:val="0"/>
           <w:sz w:val="24"/>
         </w:rPr>
-        <w:t xml:space="preserve"> для клинической практики и исследований:</w:t>
+        <w:t xml:space="preserve">, охватывающих эндокринологию, кардиологию и клинические исследования. Для каждого сервиса разработан пользовательский интерфейс на русском языке, клиническая логика, документация по развёртыванию и возможность экспорта результатов (PDF/DOCX). Общий объём разработки включает более </w:t>
+      </w:r>
+      <w:r>
+        <w:rPr>
+          <w:rFonts w:ascii="Times New Roman" w:hAnsi="Times New Roman" w:eastAsia="Times New Roman"/>
+          <w:b/>
+          <w:i w:val="0"/>
+          <w:sz w:val="24"/>
+        </w:rPr>
+        <w:t>30 модулей и конфигурационных компонентов</w:t>
+      </w:r>
+      <w:r>
+        <w:rPr>
+          <w:rFonts w:ascii="Times New Roman" w:hAnsi="Times New Roman" w:eastAsia="Times New Roman"/>
+          <w:b w:val="0"/>
+          <w:i w:val="0"/>
+          <w:sz w:val="24"/>
+        </w:rPr>
+        <w:t>, отдельные systemd-сервисы, настройку Nginx и инструкции для сопровождения.</w:t>
+      </w:r>
+    </w:p>
+    <w:p>
+      <w:r>
+        <w:rPr>
+          <w:rFonts w:ascii="Times New Roman" w:hAnsi="Times New Roman" w:eastAsia="Times New Roman"/>
+          <w:b/>
+          <w:i w:val="0"/>
+          <w:sz w:val="24"/>
+        </w:rPr>
+        <w:t>Практическая значимость для медицинского сообщества:</w:t>
+      </w:r>
+      <w:r>
+        <w:rPr>
+          <w:rFonts w:ascii="Times New Roman" w:hAnsi="Times New Roman" w:eastAsia="Times New Roman"/>
+          <w:b w:val="0"/>
+          <w:i w:val="0"/>
+          <w:sz w:val="24"/>
+        </w:rPr>
+        <w:t xml:space="preserve"> созданные сервисы сокращают время подготовки к приёму, повышают полноту собираемого анамнеза, дают врачу структурированную информацию до контакта с пациентом и предоставляют вспомогательные расчётные инструменты в зонах, где врачу регулярно приходится опираться на количественные оценки - при выборе терапии при сахарном диабете 2 типа, интерпретации данных ЭхоКГ и планировании клинических испытаний.</w:t>
       </w:r>
     </w:p>
     <w:tbl>
@@ -230,7 +250,7 @@
                 <w:i w:val="0"/>
                 <w:sz w:val="24"/>
               </w:rPr>
-              <w:t>URL</w:t>
+              <w:t>Адрес</w:t>
             </w:r>
           </w:p>
         </w:tc>
@@ -247,7 +267,7 @@
                 <w:i w:val="0"/>
                 <w:sz w:val="24"/>
               </w:rPr>
-              <w:t>Назначение</w:t>
+              <w:t>Для кого</w:t>
             </w:r>
           </w:p>
         </w:tc>
@@ -300,7 +320,7 @@
                 <w:i w:val="0"/>
                 <w:sz w:val="24"/>
               </w:rPr>
-              <w:t>Предприёмный сбор анамнеза</w:t>
+              <w:t>Эндокринологи, врачи общей практики</w:t>
             </w:r>
           </w:p>
         </w:tc>
@@ -353,7 +373,7 @@
                 <w:i w:val="0"/>
                 <w:sz w:val="24"/>
               </w:rPr>
-              <w:t>Прогнозирование выбора препарата при СД2 (ML)</w:t>
+              <w:t>Эндокринологи, терапевты, врачи при СД2</w:t>
             </w:r>
           </w:p>
         </w:tc>
@@ -406,7 +426,7 @@
                 <w:i w:val="0"/>
                 <w:sz w:val="24"/>
               </w:rPr>
-              <w:t>Расчёт размера выборки в клинических испытаниях</w:t>
+              <w:t>Исследователи, биостатистики, заведующие КИ</w:t>
             </w:r>
           </w:p>
         </w:tc>
@@ -459,7 +479,7 @@
                 <w:i w:val="0"/>
                 <w:sz w:val="24"/>
               </w:rPr>
-              <w:t>Прогнозирование фракции выброса левого желудочка</w:t>
+              <w:t>Кардиологи, терапевты, врачи УЗ-диагностики</w:t>
             </w:r>
           </w:p>
         </w:tc>
@@ -471,7 +491,63 @@
         <w:pStyle w:val="Heading2"/>
       </w:pPr>
       <w:r>
-        <w:t>2. Анамнез эндокринолога</w:t>
+        <w:t>2. Анамнез эндокринолога - предприёмная подготовка пациента</w:t>
+      </w:r>
+    </w:p>
+    <w:p>
+      <w:pPr>
+        <w:pStyle w:val="Heading3"/>
+      </w:pPr>
+      <w:r>
+        <w:t>2.1. Клиническая проблема</w:t>
+      </w:r>
+    </w:p>
+    <w:p>
+      <w:r>
+        <w:rPr>
+          <w:rFonts w:ascii="Times New Roman" w:hAnsi="Times New Roman" w:eastAsia="Times New Roman"/>
+          <w:b w:val="0"/>
+          <w:i w:val="0"/>
+          <w:sz w:val="24"/>
+        </w:rPr>
+        <w:t>На первичном и повторном приёме эндокринолог нередко тратит значительную часть времени на уточнение базового анамнеза: жалобы, сопутствующие заболевания, постоянно принимаемые препараты, результаты предыдущих обследований. При этом часть информации оказывается неструктурированной, а загруженные пациентом документы (анализы, УЗИ, выписки) не всегда доступны врачу заблаговременно. Это снижает эффективность консультации и ухудшает преемственность наблюдения.</w:t>
+      </w:r>
+    </w:p>
+    <w:p>
+      <w:pPr>
+        <w:pStyle w:val="Heading3"/>
+      </w:pPr>
+      <w:r>
+        <w:t>2.2. Выполненная работа</w:t>
+      </w:r>
+    </w:p>
+    <w:p>
+      <w:r>
+        <w:rPr>
+          <w:rFonts w:ascii="Times New Roman" w:hAnsi="Times New Roman" w:eastAsia="Times New Roman"/>
+          <w:b w:val="0"/>
+          <w:i w:val="0"/>
+          <w:sz w:val="24"/>
+        </w:rPr>
+        <w:t xml:space="preserve">Разработан и внедрён полнофункциональный MVP </w:t>
+      </w:r>
+      <w:r>
+        <w:rPr>
+          <w:rFonts w:ascii="Times New Roman" w:hAnsi="Times New Roman" w:eastAsia="Times New Roman"/>
+          <w:b/>
+          <w:i w:val="0"/>
+          <w:sz w:val="24"/>
+        </w:rPr>
+        <w:t>веб-сервиса предприёмного сбора эндокринологического анамнеза</w:t>
+      </w:r>
+      <w:r>
+        <w:rPr>
+          <w:rFonts w:ascii="Times New Roman" w:hAnsi="Times New Roman" w:eastAsia="Times New Roman"/>
+          <w:b w:val="0"/>
+          <w:i w:val="0"/>
+          <w:sz w:val="24"/>
+        </w:rPr>
+        <w:t>. Пациент до визита заполняет анкету на смартфоне или компьютере; данные автоматически структурируются и поступают врачу в виде готового клинического резюме.</w:t>
       </w:r>
     </w:p>
     <w:p>
@@ -482,7 +558,27 @@
           <w:i w:val="0"/>
           <w:sz w:val="24"/>
         </w:rPr>
-        <w:t>Цель:</w:t>
+        <w:t>Ключевые результаты разработки:</w:t>
+      </w:r>
+    </w:p>
+    <w:p>
+      <w:r>
+        <w:rPr>
+          <w:rFonts w:ascii="Times New Roman" w:hAnsi="Times New Roman" w:eastAsia="Times New Roman"/>
+          <w:b w:val="0"/>
+          <w:i w:val="0"/>
+          <w:sz w:val="24"/>
+        </w:rPr>
+        <w:t xml:space="preserve">Создана </w:t>
+      </w:r>
+      <w:r>
+        <w:rPr>
+          <w:rFonts w:ascii="Times New Roman" w:hAnsi="Times New Roman" w:eastAsia="Times New Roman"/>
+          <w:b/>
+          <w:i w:val="0"/>
+          <w:sz w:val="24"/>
+        </w:rPr>
+        <w:t>многоуровневая анкета с клиническим ветвлением</w:t>
       </w:r>
       <w:r>
         <w:rPr>
@@ -491,10 +587,8 @@
           <w:i w:val="0"/>
           <w:sz w:val="24"/>
         </w:rPr>
-        <w:t xml:space="preserve"> структурированный сбор эндокринологического анамнеза до визита пациента.</w:t>
+        <w:t xml:space="preserve"> по семи направлениям эндокринологической практики: щитовидная железа, сахарный диабет и гипергликемия, ожирение, нарушения цикла и репродуктивные вопросы, усталость и выпадение волос, остеопороз и обмен кальция, а также свободная форма для иных жалоб. Для каждого направления разработаны </w:t>
       </w:r>
-    </w:p>
-    <w:p>
       <w:r>
         <w:rPr>
           <w:rFonts w:ascii="Times New Roman" w:hAnsi="Times New Roman" w:eastAsia="Times New Roman"/>
@@ -502,13 +596,8 @@
           <w:i w:val="0"/>
           <w:sz w:val="24"/>
         </w:rPr>
-        <w:t>Реализовано:</w:t>
+        <w:t>специализированные блоки вопросов</w:t>
       </w:r>
-    </w:p>
-    <w:p>
-      <w:pPr>
-        <w:pStyle w:val="ListBullet"/>
-      </w:pPr>
       <w:r>
         <w:rPr>
           <w:rFonts w:ascii="Times New Roman" w:hAnsi="Times New Roman" w:eastAsia="Times New Roman"/>
@@ -516,13 +605,10 @@
           <w:i w:val="0"/>
           <w:sz w:val="24"/>
         </w:rPr>
-        <w:t>веб-анкета с ветвлением по 7 клиническим направлениям;</w:t>
+        <w:t>, отражающие реальную логику эндокринологического приёма - в том числе детализированные перечни сахароснижающих препаратов, схем инсулинотерапии, терапии щитовидной железы, симптомов и ранее выполненных исследований.</w:t>
       </w:r>
     </w:p>
     <w:p>
-      <w:pPr>
-        <w:pStyle w:val="ListBullet"/>
-      </w:pPr>
       <w:r>
         <w:rPr>
           <w:rFonts w:ascii="Times New Roman" w:hAnsi="Times New Roman" w:eastAsia="Times New Roman"/>
@@ -530,13 +616,17 @@
           <w:i w:val="0"/>
           <w:sz w:val="24"/>
         </w:rPr>
-        <w:t>загрузка анализов, УЗИ и выписок;</w:t>
+        <w:t xml:space="preserve">Реализован </w:t>
       </w:r>
-    </w:p>
-    <w:p>
-      <w:pPr>
-        <w:pStyle w:val="ListBullet"/>
-      </w:pPr>
+      <w:r>
+        <w:rPr>
+          <w:rFonts w:ascii="Times New Roman" w:hAnsi="Times New Roman" w:eastAsia="Times New Roman"/>
+          <w:b/>
+          <w:i w:val="0"/>
+          <w:sz w:val="24"/>
+        </w:rPr>
+        <w:t>общий медицинский блок</w:t>
+      </w:r>
       <w:r>
         <w:rPr>
           <w:rFonts w:ascii="Times New Roman" w:hAnsi="Times New Roman" w:eastAsia="Times New Roman"/>
@@ -544,13 +634,17 @@
           <w:i w:val="0"/>
           <w:sz w:val="24"/>
         </w:rPr>
-        <w:t>кабинет врача, статусы просмотра, экспорт TXT/PDF;</w:t>
+        <w:t xml:space="preserve">: хронические заболевания, аллергии, семейный анамнез, постоянная терапия с уточнением дозировок, расчёт индекса массы тела, выявление потенциально срочных симптомов («красные флаги»). Пациент может приложить </w:t>
       </w:r>
-    </w:p>
-    <w:p>
-      <w:pPr>
-        <w:pStyle w:val="ListBullet"/>
-      </w:pPr>
+      <w:r>
+        <w:rPr>
+          <w:rFonts w:ascii="Times New Roman" w:hAnsi="Times New Roman" w:eastAsia="Times New Roman"/>
+          <w:b/>
+          <w:i w:val="0"/>
+          <w:sz w:val="24"/>
+        </w:rPr>
+        <w:t>файлы обследований</w:t>
+      </w:r>
       <w:r>
         <w:rPr>
           <w:rFonts w:ascii="Times New Roman" w:hAnsi="Times New Roman" w:eastAsia="Times New Roman"/>
@@ -558,13 +652,10 @@
           <w:i w:val="0"/>
           <w:sz w:val="24"/>
         </w:rPr>
-        <w:t>персональные ссылки и Telegram-бот для пациентов;</w:t>
+        <w:t xml:space="preserve"> (PDF, JPG, PNG), которые сохраняются и доступны врачу в личном кабинете.</w:t>
       </w:r>
     </w:p>
     <w:p>
-      <w:pPr>
-        <w:pStyle w:val="ListBullet"/>
-      </w:pPr>
       <w:r>
         <w:rPr>
           <w:rFonts w:ascii="Times New Roman" w:hAnsi="Times New Roman" w:eastAsia="Times New Roman"/>
@@ -572,13 +663,17 @@
           <w:i w:val="0"/>
           <w:sz w:val="24"/>
         </w:rPr>
-        <w:t>уведомления врачу (email, Telegram);</w:t>
+        <w:t xml:space="preserve">Для врача создан </w:t>
       </w:r>
-    </w:p>
-    <w:p>
-      <w:pPr>
-        <w:pStyle w:val="ListBullet"/>
-      </w:pPr>
+      <w:r>
+        <w:rPr>
+          <w:rFonts w:ascii="Times New Roman" w:hAnsi="Times New Roman" w:eastAsia="Times New Roman"/>
+          <w:b/>
+          <w:i w:val="0"/>
+          <w:sz w:val="24"/>
+        </w:rPr>
+        <w:t>кабинет просмотра анкет</w:t>
+      </w:r>
       <w:r>
         <w:rPr>
           <w:rFonts w:ascii="Times New Roman" w:hAnsi="Times New Roman" w:eastAsia="Times New Roman"/>
@@ -586,7 +681,127 @@
           <w:i w:val="0"/>
           <w:sz w:val="24"/>
         </w:rPr>
-        <w:t>деплой на VPS с HTTPS, резервное копирование.</w:t>
+        <w:t xml:space="preserve"> с фильтрацией, статусами («новая», «в работе», «просмотрена», «закрыта»), автоматическим формированием </w:t>
+      </w:r>
+      <w:r>
+        <w:rPr>
+          <w:rFonts w:ascii="Times New Roman" w:hAnsi="Times New Roman" w:eastAsia="Times New Roman"/>
+          <w:b/>
+          <w:i w:val="0"/>
+          <w:sz w:val="24"/>
+        </w:rPr>
+        <w:t>текстового и PDF-резюме</w:t>
+      </w:r>
+      <w:r>
+        <w:rPr>
+          <w:rFonts w:ascii="Times New Roman" w:hAnsi="Times New Roman" w:eastAsia="Times New Roman"/>
+          <w:b w:val="0"/>
+          <w:i w:val="0"/>
+          <w:sz w:val="24"/>
+        </w:rPr>
+        <w:t xml:space="preserve"> для печати и архива. Поддерживается работа </w:t>
+      </w:r>
+      <w:r>
+        <w:rPr>
+          <w:rFonts w:ascii="Times New Roman" w:hAnsi="Times New Roman" w:eastAsia="Times New Roman"/>
+          <w:b/>
+          <w:i w:val="0"/>
+          <w:sz w:val="24"/>
+        </w:rPr>
+        <w:t>нескольких врачей</w:t>
+      </w:r>
+      <w:r>
+        <w:rPr>
+          <w:rFonts w:ascii="Times New Roman" w:hAnsi="Times New Roman" w:eastAsia="Times New Roman"/>
+          <w:b w:val="0"/>
+          <w:i w:val="0"/>
+          <w:sz w:val="24"/>
+        </w:rPr>
+        <w:t xml:space="preserve"> с персональными ссылками и раздельным доступом; предусмотрены уведомления о новых анкетах по email и Telegram. Для удобства пациентов реализован </w:t>
+      </w:r>
+      <w:r>
+        <w:rPr>
+          <w:rFonts w:ascii="Times New Roman" w:hAnsi="Times New Roman" w:eastAsia="Times New Roman"/>
+          <w:b/>
+          <w:i w:val="0"/>
+          <w:sz w:val="24"/>
+        </w:rPr>
+        <w:t>Telegram-бот</w:t>
+      </w:r>
+      <w:r>
+        <w:rPr>
+          <w:rFonts w:ascii="Times New Roman" w:hAnsi="Times New Roman" w:eastAsia="Times New Roman"/>
+          <w:b w:val="0"/>
+          <w:i w:val="0"/>
+          <w:sz w:val="24"/>
+        </w:rPr>
+        <w:t>, направляющий на анкету конкретного врача.</w:t>
+      </w:r>
+    </w:p>
+    <w:p>
+      <w:r>
+        <w:rPr>
+          <w:rFonts w:ascii="Times New Roman" w:hAnsi="Times New Roman" w:eastAsia="Times New Roman"/>
+          <w:b w:val="0"/>
+          <w:i w:val="0"/>
+          <w:sz w:val="24"/>
+        </w:rPr>
+        <w:t xml:space="preserve">Сервис развёрнут на выделенном сервере с </w:t>
+      </w:r>
+      <w:r>
+        <w:rPr>
+          <w:rFonts w:ascii="Times New Roman" w:hAnsi="Times New Roman" w:eastAsia="Times New Roman"/>
+          <w:b/>
+          <w:i w:val="0"/>
+          <w:sz w:val="24"/>
+        </w:rPr>
+        <w:t>HTTPS</w:t>
+      </w:r>
+      <w:r>
+        <w:rPr>
+          <w:rFonts w:ascii="Times New Roman" w:hAnsi="Times New Roman" w:eastAsia="Times New Roman"/>
+          <w:b w:val="0"/>
+          <w:i w:val="0"/>
+          <w:sz w:val="24"/>
+        </w:rPr>
+        <w:t>, настроено резервное копирование медицинских данных и подготовлена документация для сопровождения.</w:t>
+      </w:r>
+    </w:p>
+    <w:p>
+      <w:pPr>
+        <w:pStyle w:val="Heading3"/>
+      </w:pPr>
+      <w:r>
+        <w:t>2.3. Польза для врача</w:t>
+      </w:r>
+    </w:p>
+    <w:p>
+      <w:r>
+        <w:rPr>
+          <w:rFonts w:ascii="Times New Roman" w:hAnsi="Times New Roman" w:eastAsia="Times New Roman"/>
+          <w:b w:val="0"/>
+          <w:i w:val="0"/>
+          <w:sz w:val="24"/>
+        </w:rPr>
+        <w:t xml:space="preserve">Врач получает к началу приёма </w:t>
+      </w:r>
+      <w:r>
+        <w:rPr>
+          <w:rFonts w:ascii="Times New Roman" w:hAnsi="Times New Roman" w:eastAsia="Times New Roman"/>
+          <w:b/>
+          <w:i w:val="0"/>
+          <w:sz w:val="24"/>
+        </w:rPr>
+        <w:t>структурированный, читаемый анамнез</w:t>
+      </w:r>
+      <w:r>
+        <w:rPr>
+          <w:rFonts w:ascii="Times New Roman" w:hAnsi="Times New Roman" w:eastAsia="Times New Roman"/>
+          <w:b w:val="0"/>
+          <w:i w:val="0"/>
+          <w:sz w:val="24"/>
+        </w:rPr>
+        <w:t xml:space="preserve"> с выделением срочных находок, видит прикреплённые документы и может сосредоточиться на клиническом анализе и принятии решений, а не на первичном опросе. Это особенно ценно при высокой потоковости кабинета, ведении нескольких врачей в одной клинике и при дистанционной подготовке пациента к очной консультации.</w:t>
       </w:r>
     </w:p>
     <w:p>
@@ -606,7 +821,7 @@
           <w:i w:val="0"/>
           <w:sz w:val="24"/>
         </w:rPr>
-        <w:t xml:space="preserve"> MVP в тестовой эксплуатации.</w:t>
+        <w:t xml:space="preserve"> MVP в тестовой эксплуатации, готов к пилотному подключению кабинета.</w:t>
       </w:r>
     </w:p>
     <w:p>
@@ -614,7 +829,230 @@
         <w:pStyle w:val="Heading2"/>
       </w:pPr>
       <w:r>
-        <w:t>3. Калькулятор выборки для клинических испытаний</w:t>
+        <w:t>3. MD Choice - поддержка выбора терапии при сахарном диабете 2 типа</w:t>
+      </w:r>
+    </w:p>
+    <w:p>
+      <w:pPr>
+        <w:pStyle w:val="Heading3"/>
+      </w:pPr>
+      <w:r>
+        <w:t>3.1. Клиническая проблема</w:t>
+      </w:r>
+    </w:p>
+    <w:p>
+      <w:r>
+        <w:rPr>
+          <w:rFonts w:ascii="Times New Roman" w:hAnsi="Times New Roman" w:eastAsia="Times New Roman"/>
+          <w:b w:val="0"/>
+          <w:i w:val="0"/>
+          <w:sz w:val="24"/>
+        </w:rPr>
+        <w:t xml:space="preserve">Выбор сахароснижающей терапии при СД2 - одна из наиболее частых и клинически неоднозначных задач эндокринолога и терапевта. Врачу необходимо одновременно учитывать уровень гликемии, функцию почек, массу тела, сердечно-сосудистый анамнез, риск гипогликемии и уже назначенные препараты. При большой потоке пациентов возрастает потребность в </w:t>
+      </w:r>
+      <w:r>
+        <w:rPr>
+          <w:rFonts w:ascii="Times New Roman" w:hAnsi="Times New Roman" w:eastAsia="Times New Roman"/>
+          <w:b/>
+          <w:i w:val="0"/>
+          <w:sz w:val="24"/>
+        </w:rPr>
+        <w:t>структурированной поддержке решения</w:t>
+      </w:r>
+      <w:r>
+        <w:rPr>
+          <w:rFonts w:ascii="Times New Roman" w:hAnsi="Times New Roman" w:eastAsia="Times New Roman"/>
+          <w:b w:val="0"/>
+          <w:i w:val="0"/>
+          <w:sz w:val="24"/>
+        </w:rPr>
+        <w:t>, не подменяющей клиническое мышление, но помогающей быстро сориентироваться в приоритетах.</w:t>
+      </w:r>
+    </w:p>
+    <w:p>
+      <w:pPr>
+        <w:pStyle w:val="Heading3"/>
+      </w:pPr>
+      <w:r>
+        <w:t>3.2. Выполненная работа</w:t>
+      </w:r>
+    </w:p>
+    <w:p>
+      <w:r>
+        <w:rPr>
+          <w:rFonts w:ascii="Times New Roman" w:hAnsi="Times New Roman" w:eastAsia="Times New Roman"/>
+          <w:b w:val="0"/>
+          <w:i w:val="0"/>
+          <w:sz w:val="24"/>
+        </w:rPr>
+        <w:t xml:space="preserve">Разработана и развёрнута система </w:t>
+      </w:r>
+      <w:r>
+        <w:rPr>
+          <w:rFonts w:ascii="Times New Roman" w:hAnsi="Times New Roman" w:eastAsia="Times New Roman"/>
+          <w:b/>
+          <w:i w:val="0"/>
+          <w:sz w:val="24"/>
+        </w:rPr>
+        <w:t>MD Choice</w:t>
+      </w:r>
+      <w:r>
+        <w:rPr>
+          <w:rFonts w:ascii="Times New Roman" w:hAnsi="Times New Roman" w:eastAsia="Times New Roman"/>
+          <w:b w:val="0"/>
+          <w:i w:val="0"/>
+          <w:sz w:val="24"/>
+        </w:rPr>
+        <w:t xml:space="preserve"> - веб-сервис поддержки принятия врачебных решений (СППВР) с применением </w:t>
+      </w:r>
+      <w:r>
+        <w:rPr>
+          <w:rFonts w:ascii="Times New Roman" w:hAnsi="Times New Roman" w:eastAsia="Times New Roman"/>
+          <w:b/>
+          <w:i w:val="0"/>
+          <w:sz w:val="24"/>
+        </w:rPr>
+        <w:t>машинного обучения</w:t>
+      </w:r>
+      <w:r>
+        <w:rPr>
+          <w:rFonts w:ascii="Times New Roman" w:hAnsi="Times New Roman" w:eastAsia="Times New Roman"/>
+          <w:b w:val="0"/>
+          <w:i w:val="0"/>
+          <w:sz w:val="24"/>
+        </w:rPr>
+        <w:t xml:space="preserve"> (модель Random Forest). Система принимает клинико-лабораторный профиль пациента и формирует </w:t>
+      </w:r>
+      <w:r>
+        <w:rPr>
+          <w:rFonts w:ascii="Times New Roman" w:hAnsi="Times New Roman" w:eastAsia="Times New Roman"/>
+          <w:b/>
+          <w:i w:val="0"/>
+          <w:sz w:val="24"/>
+        </w:rPr>
+        <w:t>ранжированный список классов препаратов</w:t>
+      </w:r>
+      <w:r>
+        <w:rPr>
+          <w:rFonts w:ascii="Times New Roman" w:hAnsi="Times New Roman" w:eastAsia="Times New Roman"/>
+          <w:b w:val="0"/>
+          <w:i w:val="0"/>
+          <w:sz w:val="24"/>
+        </w:rPr>
+        <w:t xml:space="preserve"> с оценкой вероятности и текстовым обоснованием.</w:t>
+      </w:r>
+    </w:p>
+    <w:p>
+      <w:r>
+        <w:rPr>
+          <w:rFonts w:ascii="Times New Roman" w:hAnsi="Times New Roman" w:eastAsia="Times New Roman"/>
+          <w:b w:val="0"/>
+          <w:i w:val="0"/>
+          <w:sz w:val="24"/>
+        </w:rPr>
+        <w:t xml:space="preserve">В модель заложены параметры, значимые в реальной практике при СД2: возраст, индекс массы тела, HbA1c, расчётная скорость клубочковой фильтрации, длительность заболевания, наличие сердечно-сосудистых заболеваний и сердечной недостаточности, риск гипогликемии, цель снижения веса, текущая терапия метформином и инсулином. На выходе врач получает рекомендацию по одному из клинически значимых классов - метформин, иНГЛТ-2, аГПП-1, иППП-4, сульфонилмочевины, инсулин - с </w:t>
+      </w:r>
+      <w:r>
+        <w:rPr>
+          <w:rFonts w:ascii="Times New Roman" w:hAnsi="Times New Roman" w:eastAsia="Times New Roman"/>
+          <w:b/>
+          <w:i w:val="0"/>
+          <w:sz w:val="24"/>
+        </w:rPr>
+        <w:t>альтернативными вариантами</w:t>
+      </w:r>
+      <w:r>
+        <w:rPr>
+          <w:rFonts w:ascii="Times New Roman" w:hAnsi="Times New Roman" w:eastAsia="Times New Roman"/>
+          <w:b w:val="0"/>
+          <w:i w:val="0"/>
+          <w:sz w:val="24"/>
+        </w:rPr>
+        <w:t xml:space="preserve">, предупреждениями (в том числе при снижении функции почек) и возможностью </w:t>
+      </w:r>
+      <w:r>
+        <w:rPr>
+          <w:rFonts w:ascii="Times New Roman" w:hAnsi="Times New Roman" w:eastAsia="Times New Roman"/>
+          <w:b/>
+          <w:i w:val="0"/>
+          <w:sz w:val="24"/>
+        </w:rPr>
+        <w:t>экспорта заключения в PDF</w:t>
+      </w:r>
+      <w:r>
+        <w:rPr>
+          <w:rFonts w:ascii="Times New Roman" w:hAnsi="Times New Roman" w:eastAsia="Times New Roman"/>
+          <w:b w:val="0"/>
+          <w:i w:val="0"/>
+          <w:sz w:val="24"/>
+        </w:rPr>
+        <w:t>.</w:t>
+      </w:r>
+    </w:p>
+    <w:p>
+      <w:r>
+        <w:rPr>
+          <w:rFonts w:ascii="Times New Roman" w:hAnsi="Times New Roman" w:eastAsia="Times New Roman"/>
+          <w:b w:val="0"/>
+          <w:i w:val="0"/>
+          <w:sz w:val="24"/>
+        </w:rPr>
+        <w:t xml:space="preserve">Методологически модель обучена на </w:t>
+      </w:r>
+      <w:r>
+        <w:rPr>
+          <w:rFonts w:ascii="Times New Roman" w:hAnsi="Times New Roman" w:eastAsia="Times New Roman"/>
+          <w:b/>
+          <w:i w:val="0"/>
+          <w:sz w:val="24"/>
+        </w:rPr>
+        <w:t>клинически размеченном наборе профилей пациентов</w:t>
+      </w:r>
+      <w:r>
+        <w:rPr>
+          <w:rFonts w:ascii="Times New Roman" w:hAnsi="Times New Roman" w:eastAsia="Times New Roman"/>
+          <w:b w:val="0"/>
+          <w:i w:val="0"/>
+          <w:sz w:val="24"/>
+        </w:rPr>
+        <w:t>, отражающем современные подходы к персонализации терапии при СД2 с учётом коморбидности и безопасности.</w:t>
+      </w:r>
+    </w:p>
+    <w:p>
+      <w:pPr>
+        <w:pStyle w:val="Heading3"/>
+      </w:pPr>
+      <w:r>
+        <w:t>3.3. Польза для врача</w:t>
+      </w:r>
+    </w:p>
+    <w:p>
+      <w:r>
+        <w:rPr>
+          <w:rFonts w:ascii="Times New Roman" w:hAnsi="Times New Roman" w:eastAsia="Times New Roman"/>
+          <w:b w:val="0"/>
+          <w:i w:val="0"/>
+          <w:sz w:val="24"/>
+        </w:rPr>
+        <w:t xml:space="preserve">MD Choice не заменяет клинические рекомендации и окончательное решение врача, но </w:t>
+      </w:r>
+      <w:r>
+        <w:rPr>
+          <w:rFonts w:ascii="Times New Roman" w:hAnsi="Times New Roman" w:eastAsia="Times New Roman"/>
+          <w:b/>
+          <w:i w:val="0"/>
+          <w:sz w:val="24"/>
+        </w:rPr>
+        <w:t>ускоряет этап клинического рассуждения</w:t>
+      </w:r>
+      <w:r>
+        <w:rPr>
+          <w:rFonts w:ascii="Times New Roman" w:hAnsi="Times New Roman" w:eastAsia="Times New Roman"/>
+          <w:b w:val="0"/>
+          <w:i w:val="0"/>
+          <w:sz w:val="24"/>
+        </w:rPr>
+        <w:t>: помогает сформулировать приоритетный класс препарата, видеть альтернативы и зафиксировать логику выбора в документе. Сервис полезен на приёме, при обучении ординаторов, при разборе сложных клинических случаев и в научной работе по персонализации терапии СД2.</w:t>
       </w:r>
     </w:p>
     <w:p>
@@ -625,1179 +1063,7 @@
           <w:i w:val="0"/>
           <w:sz w:val="24"/>
         </w:rPr>
-        <w:t>URL:</w:t>
-      </w:r>
-      <w:r>
-        <w:rPr>
-          <w:rFonts w:ascii="Times New Roman" w:hAnsi="Times New Roman" w:eastAsia="Times New Roman"/>
-          <w:b w:val="0"/>
-          <w:i w:val="0"/>
-          <w:sz w:val="24"/>
-        </w:rPr>
-        <w:t xml:space="preserve"> http://ikorsakov.tech:8080/</w:t>
-      </w:r>
-    </w:p>
-    <w:p>
-      <w:r>
-        <w:rPr>
-          <w:rFonts w:ascii="Times New Roman" w:hAnsi="Times New Roman" w:eastAsia="Times New Roman"/>
-          <w:b/>
-          <w:i w:val="0"/>
-          <w:sz w:val="24"/>
-        </w:rPr>
-        <w:t>Стек:</w:t>
-      </w:r>
-      <w:r>
-        <w:rPr>
-          <w:rFonts w:ascii="Times New Roman" w:hAnsi="Times New Roman" w:eastAsia="Times New Roman"/>
-          <w:b w:val="0"/>
-          <w:i w:val="0"/>
-          <w:sz w:val="24"/>
-        </w:rPr>
-        <w:t xml:space="preserve"> Python, Streamlit, scipy, statsmodels</w:t>
-      </w:r>
-    </w:p>
-    <w:p>
-      <w:r>
-        <w:rPr>
-          <w:rFonts w:ascii="Times New Roman" w:hAnsi="Times New Roman" w:eastAsia="Times New Roman"/>
-          <w:b/>
-          <w:i w:val="0"/>
-          <w:sz w:val="24"/>
-        </w:rPr>
-        <w:t>Назначение:</w:t>
-      </w:r>
-      <w:r>
-        <w:rPr>
-          <w:rFonts w:ascii="Times New Roman" w:hAnsi="Times New Roman" w:eastAsia="Times New Roman"/>
-          <w:b w:val="0"/>
-          <w:i w:val="0"/>
-          <w:sz w:val="24"/>
-        </w:rPr>
-        <w:t xml:space="preserve"> предварительный расчёт размера выборки при планировании клинических исследований.</w:t>
-      </w:r>
-    </w:p>
-    <w:p>
-      <w:r>
-        <w:rPr>
-          <w:rFonts w:ascii="Times New Roman" w:hAnsi="Times New Roman" w:eastAsia="Times New Roman"/>
-          <w:b/>
-          <w:i w:val="0"/>
-          <w:sz w:val="24"/>
-        </w:rPr>
-        <w:t>Поддерживаемые дизайны:</w:t>
-      </w:r>
-    </w:p>
-    <w:p>
-      <w:pPr>
-        <w:pStyle w:val="ListNumber"/>
-      </w:pPr>
-      <w:r>
-        <w:rPr>
-          <w:rFonts w:ascii="Times New Roman" w:hAnsi="Times New Roman" w:eastAsia="Times New Roman"/>
-          <w:b w:val="0"/>
-          <w:i w:val="0"/>
-          <w:sz w:val="24"/>
-        </w:rPr>
-        <w:t>Сравнение средних (двухвыборочный t-критерий, Cohen's d)</w:t>
-      </w:r>
-    </w:p>
-    <w:p>
-      <w:pPr>
-        <w:pStyle w:val="ListNumber"/>
-      </w:pPr>
-      <w:r>
-        <w:rPr>
-          <w:rFonts w:ascii="Times New Roman" w:hAnsi="Times New Roman" w:eastAsia="Times New Roman"/>
-          <w:b w:val="0"/>
-          <w:i w:val="0"/>
-          <w:sz w:val="24"/>
-        </w:rPr>
-        <w:t>Сравнение долей (z-тест, Cohen's h)</w:t>
-      </w:r>
-    </w:p>
-    <w:p>
-      <w:pPr>
-        <w:pStyle w:val="ListNumber"/>
-      </w:pPr>
-      <w:r>
-        <w:rPr>
-          <w:rFonts w:ascii="Times New Roman" w:hAnsi="Times New Roman" w:eastAsia="Times New Roman"/>
-          <w:b w:val="0"/>
-          <w:i w:val="0"/>
-          <w:sz w:val="24"/>
-        </w:rPr>
-        <w:t>Непревосходство по бинарной конечной точке (non-inferiority)</w:t>
-      </w:r>
-    </w:p>
-    <w:p>
-      <w:pPr>
-        <w:pStyle w:val="ListNumber"/>
-      </w:pPr>
-      <w:r>
-        <w:rPr>
-          <w:rFonts w:ascii="Times New Roman" w:hAnsi="Times New Roman" w:eastAsia="Times New Roman"/>
-          <w:b w:val="0"/>
-          <w:i w:val="0"/>
-          <w:sz w:val="24"/>
-        </w:rPr>
-        <w:t>Время до события (формула Schoenfeld, log-rank)</w:t>
-      </w:r>
-    </w:p>
-    <w:p>
-      <w:r>
-        <w:rPr>
-          <w:rFonts w:ascii="Times New Roman" w:hAnsi="Times New Roman" w:eastAsia="Times New Roman"/>
-          <w:b/>
-          <w:i w:val="0"/>
-          <w:sz w:val="24"/>
-        </w:rPr>
-        <w:t>Параметры расчёта:</w:t>
-      </w:r>
-    </w:p>
-    <w:p>
-      <w:pPr>
-        <w:pStyle w:val="ListBullet"/>
-      </w:pPr>
-      <w:r>
-        <w:rPr>
-          <w:rFonts w:ascii="Times New Roman" w:hAnsi="Times New Roman" w:eastAsia="Times New Roman"/>
-          <w:b w:val="0"/>
-          <w:i w:val="0"/>
-          <w:sz w:val="24"/>
-        </w:rPr>
-        <w:t>уровень значимости α;</w:t>
-      </w:r>
-    </w:p>
-    <w:p>
-      <w:pPr>
-        <w:pStyle w:val="ListBullet"/>
-      </w:pPr>
-      <w:r>
-        <w:rPr>
-          <w:rFonts w:ascii="Times New Roman" w:hAnsi="Times New Roman" w:eastAsia="Times New Roman"/>
-          <w:b w:val="0"/>
-          <w:i w:val="0"/>
-          <w:sz w:val="24"/>
-        </w:rPr>
-        <w:t>мощность (1 − β);</w:t>
-      </w:r>
-    </w:p>
-    <w:p>
-      <w:pPr>
-        <w:pStyle w:val="ListBullet"/>
-      </w:pPr>
-      <w:r>
-        <w:rPr>
-          <w:rFonts w:ascii="Times New Roman" w:hAnsi="Times New Roman" w:eastAsia="Times New Roman"/>
-          <w:b w:val="0"/>
-          <w:i w:val="0"/>
-          <w:sz w:val="24"/>
-        </w:rPr>
-        <w:t>соотношение рандомизации;</w:t>
-      </w:r>
-    </w:p>
-    <w:p>
-      <w:pPr>
-        <w:pStyle w:val="ListBullet"/>
-      </w:pPr>
-      <w:r>
-        <w:rPr>
-          <w:rFonts w:ascii="Times New Roman" w:hAnsi="Times New Roman" w:eastAsia="Times New Roman"/>
-          <w:b w:val="0"/>
-          <w:i w:val="0"/>
-          <w:sz w:val="24"/>
-        </w:rPr>
-        <w:t>запас на выбывание пациентов.</w:t>
-      </w:r>
-    </w:p>
-    <w:p>
-      <w:r>
-        <w:rPr>
-          <w:rFonts w:ascii="Times New Roman" w:hAnsi="Times New Roman" w:eastAsia="Times New Roman"/>
-          <w:b/>
-          <w:i w:val="0"/>
-          <w:sz w:val="24"/>
-        </w:rPr>
-        <w:t>Результат:</w:t>
-      </w:r>
-      <w:r>
-        <w:rPr>
-          <w:rFonts w:ascii="Times New Roman" w:hAnsi="Times New Roman" w:eastAsia="Times New Roman"/>
-          <w:b w:val="0"/>
-          <w:i w:val="0"/>
-          <w:sz w:val="24"/>
-        </w:rPr>
-        <w:t xml:space="preserve"> размер выборки по группам (контроль / лечение), общий N, N с учётом выбывания. </w:t>
-      </w:r>
-      <w:r>
-        <w:rPr>
-          <w:rFonts w:ascii="Times New Roman" w:hAnsi="Times New Roman" w:eastAsia="Times New Roman"/>
-          <w:b/>
-          <w:i w:val="0"/>
-          <w:sz w:val="24"/>
-        </w:rPr>
-        <w:t>Экспорт PDF</w:t>
-      </w:r>
-      <w:r>
-        <w:rPr>
-          <w:rFonts w:ascii="Times New Roman" w:hAnsi="Times New Roman" w:eastAsia="Times New Roman"/>
-          <w:b w:val="0"/>
-          <w:i w:val="0"/>
-          <w:sz w:val="24"/>
-        </w:rPr>
-        <w:t xml:space="preserve"> с указанием ФИО исполнителя.</w:t>
-      </w:r>
-    </w:p>
-    <w:p>
-      <w:r>
-        <w:rPr>
-          <w:rFonts w:ascii="Times New Roman" w:hAnsi="Times New Roman" w:eastAsia="Times New Roman"/>
-          <w:b/>
-          <w:i w:val="0"/>
-          <w:sz w:val="24"/>
-        </w:rPr>
-        <w:t>Ограничение:</w:t>
-      </w:r>
-      <w:r>
-        <w:rPr>
-          <w:rFonts w:ascii="Times New Roman" w:hAnsi="Times New Roman" w:eastAsia="Times New Roman"/>
-          <w:b w:val="0"/>
-          <w:i w:val="0"/>
-          <w:sz w:val="24"/>
-        </w:rPr>
-        <w:t xml:space="preserve"> ориентировочный расчёт; финальный размер выборки утверждается биостатистиком протокола (ICH E9, CONSORT).</w:t>
-      </w:r>
-    </w:p>
-    <w:p>
-      <w:r>
-        <w:rPr>
-          <w:rFonts w:ascii="Times New Roman" w:hAnsi="Times New Roman" w:eastAsia="Times New Roman"/>
-          <w:b/>
-          <w:i w:val="0"/>
-          <w:sz w:val="24"/>
-        </w:rPr>
-        <w:t>Файлы:</w:t>
-      </w:r>
-      <w:r>
-        <w:rPr>
-          <w:rFonts w:ascii="Times New Roman" w:hAnsi="Times New Roman" w:eastAsia="Times New Roman"/>
-          <w:b w:val="0"/>
-          <w:i w:val="0"/>
-          <w:sz w:val="24"/>
-        </w:rPr>
-        <w:t xml:space="preserve"> </w:t>
-      </w:r>
-      <w:r>
-        <w:rPr>
-          <w:rFonts w:ascii="Courier New" w:hAnsi="Courier New" w:eastAsia="Times New Roman"/>
-          <w:b w:val="0"/>
-          <w:i w:val="0"/>
-          <w:sz w:val="24"/>
-        </w:rPr>
-        <w:t>trial_calculator_app.py</w:t>
-      </w:r>
-      <w:r>
-        <w:rPr>
-          <w:rFonts w:ascii="Times New Roman" w:hAnsi="Times New Roman" w:eastAsia="Times New Roman"/>
-          <w:b w:val="0"/>
-          <w:i w:val="0"/>
-          <w:sz w:val="24"/>
-        </w:rPr>
-        <w:t xml:space="preserve">, </w:t>
-      </w:r>
-      <w:r>
-        <w:rPr>
-          <w:rFonts w:ascii="Courier New" w:hAnsi="Courier New" w:eastAsia="Times New Roman"/>
-          <w:b w:val="0"/>
-          <w:i w:val="0"/>
-          <w:sz w:val="24"/>
-        </w:rPr>
-        <w:t>clinical/sample_size.py</w:t>
-      </w:r>
-      <w:r>
-        <w:rPr>
-          <w:rFonts w:ascii="Times New Roman" w:hAnsi="Times New Roman" w:eastAsia="Times New Roman"/>
-          <w:b w:val="0"/>
-          <w:i w:val="0"/>
-          <w:sz w:val="24"/>
-        </w:rPr>
-        <w:t xml:space="preserve">, </w:t>
-      </w:r>
-      <w:r>
-        <w:rPr>
-          <w:rFonts w:ascii="Courier New" w:hAnsi="Courier New" w:eastAsia="Times New Roman"/>
-          <w:b w:val="0"/>
-          <w:i w:val="0"/>
-          <w:sz w:val="24"/>
-        </w:rPr>
-        <w:t>deploy/TRIAL_CALCULATOR.md</w:t>
-      </w:r>
-    </w:p>
-    <w:p>
-      <w:pPr>
-        <w:pStyle w:val="Heading2"/>
-      </w:pPr>
-      <w:r>
-        <w:t>4. Прогнозирование фракции выброса левого желудочка (ФВ ЛЖ)</w:t>
-      </w:r>
-    </w:p>
-    <w:p>
-      <w:r>
-        <w:rPr>
-          <w:rFonts w:ascii="Times New Roman" w:hAnsi="Times New Roman" w:eastAsia="Times New Roman"/>
-          <w:b/>
-          <w:i w:val="0"/>
-          <w:sz w:val="24"/>
-        </w:rPr>
-        <w:t>URL:</w:t>
-      </w:r>
-      <w:r>
-        <w:rPr>
-          <w:rFonts w:ascii="Times New Roman" w:hAnsi="Times New Roman" w:eastAsia="Times New Roman"/>
-          <w:b w:val="0"/>
-          <w:i w:val="0"/>
-          <w:sz w:val="24"/>
-        </w:rPr>
-        <w:t xml:space="preserve"> http://ikorsakov.tech:9999/</w:t>
-      </w:r>
-    </w:p>
-    <w:p>
-      <w:r>
-        <w:rPr>
-          <w:rFonts w:ascii="Times New Roman" w:hAnsi="Times New Roman" w:eastAsia="Times New Roman"/>
-          <w:b/>
-          <w:i w:val="0"/>
-          <w:sz w:val="24"/>
-        </w:rPr>
-        <w:t>Стек:</w:t>
-      </w:r>
-      <w:r>
-        <w:rPr>
-          <w:rFonts w:ascii="Times New Roman" w:hAnsi="Times New Roman" w:eastAsia="Times New Roman"/>
-          <w:b w:val="0"/>
-          <w:i w:val="0"/>
-          <w:sz w:val="24"/>
-        </w:rPr>
-        <w:t xml:space="preserve"> Python, Streamlit</w:t>
-      </w:r>
-    </w:p>
-    <w:p>
-      <w:r>
-        <w:rPr>
-          <w:rFonts w:ascii="Times New Roman" w:hAnsi="Times New Roman" w:eastAsia="Times New Roman"/>
-          <w:b/>
-          <w:i w:val="0"/>
-          <w:sz w:val="24"/>
-        </w:rPr>
-        <w:t>Назначение:</w:t>
-      </w:r>
-      <w:r>
-        <w:rPr>
-          <w:rFonts w:ascii="Times New Roman" w:hAnsi="Times New Roman" w:eastAsia="Times New Roman"/>
-          <w:b w:val="0"/>
-          <w:i w:val="0"/>
-          <w:sz w:val="24"/>
-        </w:rPr>
-        <w:t xml:space="preserve"> вспомогательная оценка и прогнозирование ФВ ЛЖ по данным ЭхоКГ и клиническим факторам.</w:t>
-      </w:r>
-    </w:p>
-    <w:p>
-      <w:pPr>
-        <w:pStyle w:val="Heading3"/>
-      </w:pPr>
-      <w:r>
-        <w:t>4.1. Методы расчёта по ЭхоКГ</w:t>
-      </w:r>
-    </w:p>
-    <w:tbl>
-      <w:tblPr>
-        <w:tblStyle w:val="TableGrid"/>
-        <w:tblW w:type="auto" w:w="0"/>
-        <w:tblLook w:firstColumn="1" w:firstRow="1" w:lastColumn="0" w:lastRow="0" w:noHBand="0" w:noVBand="1" w:val="04A0"/>
-      </w:tblPr>
-      <w:tblGrid>
-        <w:gridCol w:w="3230"/>
-        <w:gridCol w:w="3230"/>
-        <w:gridCol w:w="3230"/>
-      </w:tblGrid>
-      <w:tr>
-        <w:tc>
-          <w:tcPr>
-            <w:tcW w:type="dxa" w:w="3230"/>
-          </w:tcPr>
-          <w:p>
-            <w:r/>
-            <w:r>
-              <w:rPr>
-                <w:rFonts w:ascii="Times New Roman" w:hAnsi="Times New Roman" w:eastAsia="Times New Roman"/>
-                <w:b/>
-                <w:i w:val="0"/>
-                <w:sz w:val="24"/>
-              </w:rPr>
-              <w:t>Метод</w:t>
-            </w:r>
-          </w:p>
-        </w:tc>
-        <w:tc>
-          <w:tcPr>
-            <w:tcW w:type="dxa" w:w="3230"/>
-          </w:tcPr>
-          <w:p>
-            <w:r/>
-            <w:r>
-              <w:rPr>
-                <w:rFonts w:ascii="Times New Roman" w:hAnsi="Times New Roman" w:eastAsia="Times New Roman"/>
-                <w:b/>
-                <w:i w:val="0"/>
-                <w:sz w:val="24"/>
-              </w:rPr>
-              <w:t>Входные данные</w:t>
-            </w:r>
-          </w:p>
-        </w:tc>
-        <w:tc>
-          <w:tcPr>
-            <w:tcW w:type="dxa" w:w="3230"/>
-          </w:tcPr>
-          <w:p>
-            <w:r/>
-            <w:r>
-              <w:rPr>
-                <w:rFonts w:ascii="Times New Roman" w:hAnsi="Times New Roman" w:eastAsia="Times New Roman"/>
-                <w:b/>
-                <w:i w:val="0"/>
-                <w:sz w:val="24"/>
-              </w:rPr>
-              <w:t>Применение</w:t>
-            </w:r>
-          </w:p>
-        </w:tc>
-      </w:tr>
-      <w:tr>
-        <w:tc>
-          <w:tcPr>
-            <w:tcW w:type="dxa" w:w="3230"/>
-          </w:tcPr>
-          <w:p>
-            <w:r/>
-            <w:r>
-              <w:rPr>
-                <w:rFonts w:ascii="Times New Roman" w:hAnsi="Times New Roman" w:eastAsia="Times New Roman"/>
-                <w:b w:val="0"/>
-                <w:i w:val="0"/>
-                <w:sz w:val="24"/>
-              </w:rPr>
-              <w:t>Симпсон</w:t>
-            </w:r>
-          </w:p>
-        </w:tc>
-        <w:tc>
-          <w:tcPr>
-            <w:tcW w:type="dxa" w:w="3230"/>
-          </w:tcPr>
-          <w:p>
-            <w:r/>
-            <w:r>
-              <w:rPr>
-                <w:rFonts w:ascii="Times New Roman" w:hAnsi="Times New Roman" w:eastAsia="Times New Roman"/>
-                <w:b w:val="0"/>
-                <w:i w:val="0"/>
-                <w:sz w:val="24"/>
-              </w:rPr>
-              <w:t>КДО и КСО (мл)</w:t>
-            </w:r>
-          </w:p>
-        </w:tc>
-        <w:tc>
-          <w:tcPr>
-            <w:tcW w:type="dxa" w:w="3230"/>
-          </w:tcPr>
-          <w:p>
-            <w:r/>
-            <w:r>
-              <w:rPr>
-                <w:rFonts w:ascii="Times New Roman" w:hAnsi="Times New Roman" w:eastAsia="Times New Roman"/>
-                <w:b w:val="0"/>
-                <w:i w:val="0"/>
-                <w:sz w:val="24"/>
-              </w:rPr>
-              <w:t>Предпочтительный объёмный метод</w:t>
-            </w:r>
-          </w:p>
-        </w:tc>
-      </w:tr>
-      <w:tr>
-        <w:tc>
-          <w:tcPr>
-            <w:tcW w:type="dxa" w:w="3230"/>
-          </w:tcPr>
-          <w:p>
-            <w:r/>
-            <w:r>
-              <w:rPr>
-                <w:rFonts w:ascii="Times New Roman" w:hAnsi="Times New Roman" w:eastAsia="Times New Roman"/>
-                <w:b w:val="0"/>
-                <w:i w:val="0"/>
-                <w:sz w:val="24"/>
-              </w:rPr>
-              <w:t>Teichholz</w:t>
-            </w:r>
-          </w:p>
-        </w:tc>
-        <w:tc>
-          <w:tcPr>
-            <w:tcW w:type="dxa" w:w="3230"/>
-          </w:tcPr>
-          <w:p>
-            <w:r/>
-            <w:r>
-              <w:rPr>
-                <w:rFonts w:ascii="Times New Roman" w:hAnsi="Times New Roman" w:eastAsia="Times New Roman"/>
-                <w:b w:val="0"/>
-                <w:i w:val="0"/>
-                <w:sz w:val="24"/>
-              </w:rPr>
-              <w:t>LVIDd, LVIDs (мм)</w:t>
-            </w:r>
-          </w:p>
-        </w:tc>
-        <w:tc>
-          <w:tcPr>
-            <w:tcW w:type="dxa" w:w="3230"/>
-          </w:tcPr>
-          <w:p>
-            <w:r/>
-            <w:r>
-              <w:rPr>
-                <w:rFonts w:ascii="Times New Roman" w:hAnsi="Times New Roman" w:eastAsia="Times New Roman"/>
-                <w:b w:val="0"/>
-                <w:i w:val="0"/>
-                <w:sz w:val="24"/>
-              </w:rPr>
-              <w:t>Оценка по линейным размерам</w:t>
-            </w:r>
-          </w:p>
-        </w:tc>
-      </w:tr>
-      <w:tr>
-        <w:tc>
-          <w:tcPr>
-            <w:tcW w:type="dxa" w:w="3230"/>
-          </w:tcPr>
-          <w:p>
-            <w:r/>
-            <w:r>
-              <w:rPr>
-                <w:rFonts w:ascii="Times New Roman" w:hAnsi="Times New Roman" w:eastAsia="Times New Roman"/>
-                <w:b w:val="0"/>
-                <w:i w:val="0"/>
-                <w:sz w:val="24"/>
-              </w:rPr>
-              <w:t>Фракция укорочения (FS)</w:t>
-            </w:r>
-          </w:p>
-        </w:tc>
-        <w:tc>
-          <w:tcPr>
-            <w:tcW w:type="dxa" w:w="3230"/>
-          </w:tcPr>
-          <w:p>
-            <w:r/>
-            <w:r>
-              <w:rPr>
-                <w:rFonts w:ascii="Times New Roman" w:hAnsi="Times New Roman" w:eastAsia="Times New Roman"/>
-                <w:b w:val="0"/>
-                <w:i w:val="0"/>
-                <w:sz w:val="24"/>
-              </w:rPr>
-              <w:t>LVIDd, LVIDs</w:t>
-            </w:r>
-          </w:p>
-        </w:tc>
-        <w:tc>
-          <w:tcPr>
-            <w:tcW w:type="dxa" w:w="3230"/>
-          </w:tcPr>
-          <w:p>
-            <w:r/>
-            <w:r>
-              <w:rPr>
-                <w:rFonts w:ascii="Times New Roman" w:hAnsi="Times New Roman" w:eastAsia="Times New Roman"/>
-                <w:b w:val="0"/>
-                <w:i w:val="0"/>
-                <w:sz w:val="24"/>
-              </w:rPr>
-              <w:t>Быстрая оценка у постели больного</w:t>
-            </w:r>
-          </w:p>
-        </w:tc>
-      </w:tr>
-      <w:tr>
-        <w:tc>
-          <w:tcPr>
-            <w:tcW w:type="dxa" w:w="3230"/>
-          </w:tcPr>
-          <w:p>
-            <w:r/>
-            <w:r>
-              <w:rPr>
-                <w:rFonts w:ascii="Times New Roman" w:hAnsi="Times New Roman" w:eastAsia="Times New Roman"/>
-                <w:b w:val="0"/>
-                <w:i w:val="0"/>
-                <w:sz w:val="24"/>
-              </w:rPr>
-              <w:t>Сравнение методов</w:t>
-            </w:r>
-          </w:p>
-        </w:tc>
-        <w:tc>
-          <w:tcPr>
-            <w:tcW w:type="dxa" w:w="3230"/>
-          </w:tcPr>
-          <w:p>
-            <w:r/>
-            <w:r>
-              <w:rPr>
-                <w:rFonts w:ascii="Times New Roman" w:hAnsi="Times New Roman" w:eastAsia="Times New Roman"/>
-                <w:b w:val="0"/>
-                <w:i w:val="0"/>
-                <w:sz w:val="24"/>
-              </w:rPr>
-              <w:t>КДО/КСО + LVIDd/LVIDs</w:t>
-            </w:r>
-          </w:p>
-        </w:tc>
-        <w:tc>
-          <w:tcPr>
-            <w:tcW w:type="dxa" w:w="3230"/>
-          </w:tcPr>
-          <w:p>
-            <w:r/>
-            <w:r>
-              <w:rPr>
-                <w:rFonts w:ascii="Times New Roman" w:hAnsi="Times New Roman" w:eastAsia="Times New Roman"/>
-                <w:b w:val="0"/>
-                <w:i w:val="0"/>
-                <w:sz w:val="24"/>
-              </w:rPr>
-              <w:t>Контроль согласованности Симпсон vs Teichholz</w:t>
-            </w:r>
-          </w:p>
-        </w:tc>
-      </w:tr>
-    </w:tbl>
-    <w:p/>
-    <w:p>
-      <w:r>
-        <w:rPr>
-          <w:rFonts w:ascii="Times New Roman" w:hAnsi="Times New Roman" w:eastAsia="Times New Roman"/>
-          <w:b/>
-          <w:i w:val="0"/>
-          <w:sz w:val="24"/>
-        </w:rPr>
-        <w:t>Формулы:</w:t>
-      </w:r>
-    </w:p>
-    <w:p>
-      <w:pPr>
-        <w:pStyle w:val="ListBullet"/>
-      </w:pPr>
-      <w:r>
-        <w:rPr>
-          <w:rFonts w:ascii="Times New Roman" w:hAnsi="Times New Roman" w:eastAsia="Times New Roman"/>
-          <w:b w:val="0"/>
-          <w:i w:val="0"/>
-          <w:sz w:val="24"/>
-        </w:rPr>
-        <w:t>ФВ ЛЖ (%) = (КДО − КСО) / КДО × 100</w:t>
-      </w:r>
-    </w:p>
-    <w:p>
-      <w:pPr>
-        <w:pStyle w:val="ListBullet"/>
-      </w:pPr>
-      <w:r>
-        <w:rPr>
-          <w:rFonts w:ascii="Times New Roman" w:hAnsi="Times New Roman" w:eastAsia="Times New Roman"/>
-          <w:b w:val="0"/>
-          <w:i w:val="0"/>
-          <w:sz w:val="24"/>
-        </w:rPr>
-        <w:t>Teichholz: V = [7 / (2.4 + D)] × D³ (D в см)</w:t>
-      </w:r>
-    </w:p>
-    <w:p>
-      <w:pPr>
-        <w:pStyle w:val="ListBullet"/>
-      </w:pPr>
-      <w:r>
-        <w:rPr>
-          <w:rFonts w:ascii="Times New Roman" w:hAnsi="Times New Roman" w:eastAsia="Times New Roman"/>
-          <w:b w:val="0"/>
-          <w:i w:val="0"/>
-          <w:sz w:val="24"/>
-        </w:rPr>
-        <w:t>FS (%) = (LVIDd − LVIDs) / LVIDd × 100</w:t>
-      </w:r>
-    </w:p>
-    <w:p>
-      <w:pPr>
-        <w:pStyle w:val="Heading3"/>
-      </w:pPr>
-      <w:r>
-        <w:t>4.2. Клинический прогноз сниженной ФВ</w:t>
-      </w:r>
-    </w:p>
-    <w:p>
-      <w:r>
-        <w:rPr>
-          <w:rFonts w:ascii="Times New Roman" w:hAnsi="Times New Roman" w:eastAsia="Times New Roman"/>
-          <w:b w:val="0"/>
-          <w:i w:val="0"/>
-          <w:sz w:val="24"/>
-        </w:rPr>
-        <w:t xml:space="preserve">До выполнения ЭхоКГ рассчитывается </w:t>
-      </w:r>
-      <w:r>
-        <w:rPr>
-          <w:rFonts w:ascii="Times New Roman" w:hAnsi="Times New Roman" w:eastAsia="Times New Roman"/>
-          <w:b/>
-          <w:i w:val="0"/>
-          <w:sz w:val="24"/>
-        </w:rPr>
-        <w:t>вероятность сниженной ФВ (&lt;50%)</w:t>
-      </w:r>
-      <w:r>
-        <w:rPr>
-          <w:rFonts w:ascii="Times New Roman" w:hAnsi="Times New Roman" w:eastAsia="Times New Roman"/>
-          <w:b w:val="0"/>
-          <w:i w:val="0"/>
-          <w:sz w:val="24"/>
-        </w:rPr>
-        <w:t xml:space="preserve"> по факторам:</w:t>
-      </w:r>
-    </w:p>
-    <w:p>
-      <w:pPr>
-        <w:pStyle w:val="ListBullet"/>
-      </w:pPr>
-      <w:r>
-        <w:rPr>
-          <w:rFonts w:ascii="Times New Roman" w:hAnsi="Times New Roman" w:eastAsia="Times New Roman"/>
-          <w:b w:val="0"/>
-          <w:i w:val="0"/>
-          <w:sz w:val="24"/>
-        </w:rPr>
-        <w:t>возраст, пол;</w:t>
-      </w:r>
-    </w:p>
-    <w:p>
-      <w:pPr>
-        <w:pStyle w:val="ListBullet"/>
-      </w:pPr>
-      <w:r>
-        <w:rPr>
-          <w:rFonts w:ascii="Times New Roman" w:hAnsi="Times New Roman" w:eastAsia="Times New Roman"/>
-          <w:b w:val="0"/>
-          <w:i w:val="0"/>
-          <w:sz w:val="24"/>
-        </w:rPr>
-        <w:t>перенесённый ИМ;</w:t>
-      </w:r>
-    </w:p>
-    <w:p>
-      <w:pPr>
-        <w:pStyle w:val="ListBullet"/>
-      </w:pPr>
-      <w:r>
-        <w:rPr>
-          <w:rFonts w:ascii="Times New Roman" w:hAnsi="Times New Roman" w:eastAsia="Times New Roman"/>
-          <w:b w:val="0"/>
-          <w:i w:val="0"/>
-          <w:sz w:val="24"/>
-        </w:rPr>
-        <w:t>сахарный диабет, АГ;</w:t>
-      </w:r>
-    </w:p>
-    <w:p>
-      <w:pPr>
-        <w:pStyle w:val="ListBullet"/>
-      </w:pPr>
-      <w:r>
-        <w:rPr>
-          <w:rFonts w:ascii="Times New Roman" w:hAnsi="Times New Roman" w:eastAsia="Times New Roman"/>
-          <w:b w:val="0"/>
-          <w:i w:val="0"/>
-          <w:sz w:val="24"/>
-        </w:rPr>
-        <w:t>фибрилляция предсердий;</w:t>
-      </w:r>
-    </w:p>
-    <w:p>
-      <w:pPr>
-        <w:pStyle w:val="ListBullet"/>
-      </w:pPr>
-      <w:r>
-        <w:rPr>
-          <w:rFonts w:ascii="Times New Roman" w:hAnsi="Times New Roman" w:eastAsia="Times New Roman"/>
-          <w:b w:val="0"/>
-          <w:i w:val="0"/>
-          <w:sz w:val="24"/>
-        </w:rPr>
-        <w:t>одышка, отёки;</w:t>
-      </w:r>
-    </w:p>
-    <w:p>
-      <w:pPr>
-        <w:pStyle w:val="ListBullet"/>
-      </w:pPr>
-      <w:r>
-        <w:rPr>
-          <w:rFonts w:ascii="Times New Roman" w:hAnsi="Times New Roman" w:eastAsia="Times New Roman"/>
-          <w:b w:val="0"/>
-          <w:i w:val="0"/>
-          <w:sz w:val="24"/>
-        </w:rPr>
-        <w:t>длительность QRS;</w:t>
-      </w:r>
-    </w:p>
-    <w:p>
-      <w:pPr>
-        <w:pStyle w:val="ListBullet"/>
-      </w:pPr>
-      <w:r>
-        <w:rPr>
-          <w:rFonts w:ascii="Times New Roman" w:hAnsi="Times New Roman" w:eastAsia="Times New Roman"/>
-          <w:b w:val="0"/>
-          <w:i w:val="0"/>
-          <w:sz w:val="24"/>
-        </w:rPr>
-        <w:t>NT-proBNP (при наличии).</w:t>
-      </w:r>
-    </w:p>
-    <w:p>
-      <w:r>
-        <w:rPr>
-          <w:rFonts w:ascii="Times New Roman" w:hAnsi="Times New Roman" w:eastAsia="Times New Roman"/>
-          <w:b/>
-          <w:i w:val="0"/>
-          <w:sz w:val="24"/>
-        </w:rPr>
-        <w:t>Экспорт PDF</w:t>
-      </w:r>
-      <w:r>
-        <w:rPr>
-          <w:rFonts w:ascii="Times New Roman" w:hAnsi="Times New Roman" w:eastAsia="Times New Roman"/>
-          <w:b w:val="0"/>
-          <w:i w:val="0"/>
-          <w:sz w:val="24"/>
-        </w:rPr>
-        <w:t xml:space="preserve"> доступен для всех методов расчёта.</w:t>
-      </w:r>
-    </w:p>
-    <w:p>
-      <w:pPr>
-        <w:pStyle w:val="Heading3"/>
-      </w:pPr>
-      <w:r>
-        <w:t>4.3. Категории интерпретации ФВ ЛЖ</w:t>
-      </w:r>
-    </w:p>
-    <w:tbl>
-      <w:tblPr>
-        <w:tblStyle w:val="TableGrid"/>
-        <w:tblW w:type="auto" w:w="0"/>
-        <w:tblLook w:firstColumn="1" w:firstRow="1" w:lastColumn="0" w:lastRow="0" w:noHBand="0" w:noVBand="1" w:val="04A0"/>
-      </w:tblPr>
-      <w:tblGrid>
-        <w:gridCol w:w="4844"/>
-        <w:gridCol w:w="4844"/>
-      </w:tblGrid>
-      <w:tr>
-        <w:tc>
-          <w:tcPr>
-            <w:tcW w:type="dxa" w:w="4844"/>
-          </w:tcPr>
-          <w:p>
-            <w:r/>
-            <w:r>
-              <w:rPr>
-                <w:rFonts w:ascii="Times New Roman" w:hAnsi="Times New Roman" w:eastAsia="Times New Roman"/>
-                <w:b/>
-                <w:i w:val="0"/>
-                <w:sz w:val="24"/>
-              </w:rPr>
-              <w:t>ФВ ЛЖ</w:t>
-            </w:r>
-          </w:p>
-        </w:tc>
-        <w:tc>
-          <w:tcPr>
-            <w:tcW w:type="dxa" w:w="4844"/>
-          </w:tcPr>
-          <w:p>
-            <w:r/>
-            <w:r>
-              <w:rPr>
-                <w:rFonts w:ascii="Times New Roman" w:hAnsi="Times New Roman" w:eastAsia="Times New Roman"/>
-                <w:b/>
-                <w:i w:val="0"/>
-                <w:sz w:val="24"/>
-              </w:rPr>
-              <w:t>Категория</w:t>
-            </w:r>
-          </w:p>
-        </w:tc>
-      </w:tr>
-      <w:tr>
-        <w:tc>
-          <w:tcPr>
-            <w:tcW w:type="dxa" w:w="4844"/>
-          </w:tcPr>
-          <w:p>
-            <w:r/>
-            <w:r>
-              <w:rPr>
-                <w:rFonts w:ascii="Times New Roman" w:hAnsi="Times New Roman" w:eastAsia="Times New Roman"/>
-                <w:b w:val="0"/>
-                <w:i w:val="0"/>
-                <w:sz w:val="24"/>
-              </w:rPr>
-              <w:t>≥55%</w:t>
-            </w:r>
-          </w:p>
-        </w:tc>
-        <w:tc>
-          <w:tcPr>
-            <w:tcW w:type="dxa" w:w="4844"/>
-          </w:tcPr>
-          <w:p>
-            <w:r/>
-            <w:r>
-              <w:rPr>
-                <w:rFonts w:ascii="Times New Roman" w:hAnsi="Times New Roman" w:eastAsia="Times New Roman"/>
-                <w:b w:val="0"/>
-                <w:i w:val="0"/>
-                <w:sz w:val="24"/>
-              </w:rPr>
-              <w:t>Норма</w:t>
-            </w:r>
-          </w:p>
-        </w:tc>
-      </w:tr>
-      <w:tr>
-        <w:tc>
-          <w:tcPr>
-            <w:tcW w:type="dxa" w:w="4844"/>
-          </w:tcPr>
-          <w:p>
-            <w:r/>
-            <w:r>
-              <w:rPr>
-                <w:rFonts w:ascii="Times New Roman" w:hAnsi="Times New Roman" w:eastAsia="Times New Roman"/>
-                <w:b w:val="0"/>
-                <w:i w:val="0"/>
-                <w:sz w:val="24"/>
-              </w:rPr>
-              <w:t>41-54%</w:t>
-            </w:r>
-          </w:p>
-        </w:tc>
-        <w:tc>
-          <w:tcPr>
-            <w:tcW w:type="dxa" w:w="4844"/>
-          </w:tcPr>
-          <w:p>
-            <w:r/>
-            <w:r>
-              <w:rPr>
-                <w:rFonts w:ascii="Times New Roman" w:hAnsi="Times New Roman" w:eastAsia="Times New Roman"/>
-                <w:b w:val="0"/>
-                <w:i w:val="0"/>
-                <w:sz w:val="24"/>
-              </w:rPr>
-              <w:t>Незначительно снижена</w:t>
-            </w:r>
-          </w:p>
-        </w:tc>
-      </w:tr>
-      <w:tr>
-        <w:tc>
-          <w:tcPr>
-            <w:tcW w:type="dxa" w:w="4844"/>
-          </w:tcPr>
-          <w:p>
-            <w:r/>
-            <w:r>
-              <w:rPr>
-                <w:rFonts w:ascii="Times New Roman" w:hAnsi="Times New Roman" w:eastAsia="Times New Roman"/>
-                <w:b w:val="0"/>
-                <w:i w:val="0"/>
-                <w:sz w:val="24"/>
-              </w:rPr>
-              <w:t>30-40%</w:t>
-            </w:r>
-          </w:p>
-        </w:tc>
-        <w:tc>
-          <w:tcPr>
-            <w:tcW w:type="dxa" w:w="4844"/>
-          </w:tcPr>
-          <w:p>
-            <w:r/>
-            <w:r>
-              <w:rPr>
-                <w:rFonts w:ascii="Times New Roman" w:hAnsi="Times New Roman" w:eastAsia="Times New Roman"/>
-                <w:b w:val="0"/>
-                <w:i w:val="0"/>
-                <w:sz w:val="24"/>
-              </w:rPr>
-              <w:t>Умеренно снижена</w:t>
-            </w:r>
-          </w:p>
-        </w:tc>
-      </w:tr>
-      <w:tr>
-        <w:tc>
-          <w:tcPr>
-            <w:tcW w:type="dxa" w:w="4844"/>
-          </w:tcPr>
-          <w:p>
-            <w:r/>
-            <w:r>
-              <w:rPr>
-                <w:rFonts w:ascii="Times New Roman" w:hAnsi="Times New Roman" w:eastAsia="Times New Roman"/>
-                <w:b w:val="0"/>
-                <w:i w:val="0"/>
-                <w:sz w:val="24"/>
-              </w:rPr>
-              <w:t>&lt;30%</w:t>
-            </w:r>
-          </w:p>
-        </w:tc>
-        <w:tc>
-          <w:tcPr>
-            <w:tcW w:type="dxa" w:w="4844"/>
-          </w:tcPr>
-          <w:p>
-            <w:r/>
-            <w:r>
-              <w:rPr>
-                <w:rFonts w:ascii="Times New Roman" w:hAnsi="Times New Roman" w:eastAsia="Times New Roman"/>
-                <w:b w:val="0"/>
-                <w:i w:val="0"/>
-                <w:sz w:val="24"/>
-              </w:rPr>
-              <w:t>Выраженно снижена</w:t>
-            </w:r>
-          </w:p>
-        </w:tc>
-      </w:tr>
-    </w:tbl>
-    <w:p/>
-    <w:p>
-      <w:r>
-        <w:rPr>
-          <w:rFonts w:ascii="Times New Roman" w:hAnsi="Times New Roman" w:eastAsia="Times New Roman"/>
-          <w:b/>
-          <w:i w:val="0"/>
-          <w:sz w:val="24"/>
-        </w:rPr>
-        <w:t>Ограничение:</w:t>
-      </w:r>
-      <w:r>
-        <w:rPr>
-          <w:rFonts w:ascii="Times New Roman" w:hAnsi="Times New Roman" w:eastAsia="Times New Roman"/>
-          <w:b w:val="0"/>
-          <w:i w:val="0"/>
-          <w:sz w:val="24"/>
-        </w:rPr>
-        <w:t xml:space="preserve"> сервис не заменяет официальное заключение ЭхоКГ; результаты требуют клинической интерпретации кардиологом.</w:t>
-      </w:r>
-    </w:p>
-    <w:p>
-      <w:r>
-        <w:rPr>
-          <w:rFonts w:ascii="Times New Roman" w:hAnsi="Times New Roman" w:eastAsia="Times New Roman"/>
-          <w:b/>
-          <w:i w:val="0"/>
-          <w:sz w:val="24"/>
-        </w:rPr>
-        <w:t>Файлы:</w:t>
-      </w:r>
-      <w:r>
-        <w:rPr>
-          <w:rFonts w:ascii="Times New Roman" w:hAnsi="Times New Roman" w:eastAsia="Times New Roman"/>
-          <w:b w:val="0"/>
-          <w:i w:val="0"/>
-          <w:sz w:val="24"/>
-        </w:rPr>
-        <w:t xml:space="preserve"> </w:t>
-      </w:r>
-      <w:r>
-        <w:rPr>
-          <w:rFonts w:ascii="Courier New" w:hAnsi="Courier New" w:eastAsia="Times New Roman"/>
-          <w:b w:val="0"/>
-          <w:i w:val="0"/>
-          <w:sz w:val="24"/>
-        </w:rPr>
-        <w:t>lvef_app.py</w:t>
-      </w:r>
-      <w:r>
-        <w:rPr>
-          <w:rFonts w:ascii="Times New Roman" w:hAnsi="Times New Roman" w:eastAsia="Times New Roman"/>
-          <w:b w:val="0"/>
-          <w:i w:val="0"/>
-          <w:sz w:val="24"/>
-        </w:rPr>
-        <w:t xml:space="preserve">, </w:t>
-      </w:r>
-      <w:r>
-        <w:rPr>
-          <w:rFonts w:ascii="Courier New" w:hAnsi="Courier New" w:eastAsia="Times New Roman"/>
-          <w:b w:val="0"/>
-          <w:i w:val="0"/>
-          <w:sz w:val="24"/>
-        </w:rPr>
-        <w:t>clinical/lvef.py</w:t>
-      </w:r>
-      <w:r>
-        <w:rPr>
-          <w:rFonts w:ascii="Times New Roman" w:hAnsi="Times New Roman" w:eastAsia="Times New Roman"/>
-          <w:b w:val="0"/>
-          <w:i w:val="0"/>
-          <w:sz w:val="24"/>
-        </w:rPr>
-        <w:t xml:space="preserve">, </w:t>
-      </w:r>
-      <w:r>
-        <w:rPr>
-          <w:rFonts w:ascii="Courier New" w:hAnsi="Courier New" w:eastAsia="Times New Roman"/>
-          <w:b w:val="0"/>
-          <w:i w:val="0"/>
-          <w:sz w:val="24"/>
-        </w:rPr>
-        <w:t>deploy/LVEF.md</w:t>
-      </w:r>
-    </w:p>
-    <w:p>
-      <w:pPr>
-        <w:pStyle w:val="Heading2"/>
-      </w:pPr>
-      <w:r>
-        <w:t>5. MD Choice - прогнозирование выбора препарата при СД2</w:t>
-      </w:r>
-    </w:p>
-    <w:p>
-      <w:r>
-        <w:rPr>
-          <w:rFonts w:ascii="Times New Roman" w:hAnsi="Times New Roman" w:eastAsia="Times New Roman"/>
-          <w:b/>
-          <w:i w:val="0"/>
-          <w:sz w:val="24"/>
-        </w:rPr>
-        <w:t>URL:</w:t>
+        <w:t>Адрес:</w:t>
       </w:r>
       <w:r>
         <w:rPr>
@@ -1810,43 +1076,11 @@
       </w:r>
     </w:p>
     <w:p>
+      <w:pPr>
+        <w:pStyle w:val="Heading2"/>
+      </w:pPr>
       <w:r>
-        <w:rPr>
-          <w:rFonts w:ascii="Times New Roman" w:hAnsi="Times New Roman" w:eastAsia="Times New Roman"/>
-          <w:b/>
-          <w:i w:val="0"/>
-          <w:sz w:val="24"/>
-        </w:rPr>
-        <w:t>Стек:</w:t>
-      </w:r>
-      <w:r>
-        <w:rPr>
-          <w:rFonts w:ascii="Times New Roman" w:hAnsi="Times New Roman" w:eastAsia="Times New Roman"/>
-          <w:b w:val="0"/>
-          <w:i w:val="0"/>
-          <w:sz w:val="24"/>
-        </w:rPr>
-        <w:t xml:space="preserve"> Python, Streamlit, scikit-learn (Random Forest)</w:t>
-      </w:r>
-    </w:p>
-    <w:p>
-      <w:r>
-        <w:rPr>
-          <w:rFonts w:ascii="Times New Roman" w:hAnsi="Times New Roman" w:eastAsia="Times New Roman"/>
-          <w:b/>
-          <w:i w:val="0"/>
-          <w:sz w:val="24"/>
-        </w:rPr>
-        <w:t>Назначение:</w:t>
-      </w:r>
-      <w:r>
-        <w:rPr>
-          <w:rFonts w:ascii="Times New Roman" w:hAnsi="Times New Roman" w:eastAsia="Times New Roman"/>
-          <w:b w:val="0"/>
-          <w:i w:val="0"/>
-          <w:sz w:val="24"/>
-        </w:rPr>
-        <w:t xml:space="preserve"> система поддержки принятия врачебных решений (СППВР) для выбора класса сахароснижающего препарата при сахарном диабете 2 типа на основе машинного обучения.</w:t>
+        <w:t>4. Калькулятор выборки для клинических испытаний</w:t>
       </w:r>
     </w:p>
     <w:p>
@@ -1854,71 +1088,7 @@
         <w:pStyle w:val="Heading3"/>
       </w:pPr>
       <w:r>
-        <w:t>5.1. Входные данные</w:t>
-      </w:r>
-    </w:p>
-    <w:p>
-      <w:pPr>
-        <w:pStyle w:val="ListBullet"/>
-      </w:pPr>
-      <w:r>
-        <w:rPr>
-          <w:rFonts w:ascii="Times New Roman" w:hAnsi="Times New Roman" w:eastAsia="Times New Roman"/>
-          <w:b w:val="0"/>
-          <w:i w:val="0"/>
-          <w:sz w:val="24"/>
-        </w:rPr>
-        <w:t>возраст, ИМТ, HbA1c, рСКФ, длительность СД;</w:t>
-      </w:r>
-    </w:p>
-    <w:p>
-      <w:pPr>
-        <w:pStyle w:val="ListBullet"/>
-      </w:pPr>
-      <w:r>
-        <w:rPr>
-          <w:rFonts w:ascii="Times New Roman" w:hAnsi="Times New Roman" w:eastAsia="Times New Roman"/>
-          <w:b w:val="0"/>
-          <w:i w:val="0"/>
-          <w:sz w:val="24"/>
-        </w:rPr>
-        <w:t>сердечно-сосудистые заболевания, сердечная недостаточность;</w:t>
-      </w:r>
-    </w:p>
-    <w:p>
-      <w:pPr>
-        <w:pStyle w:val="ListBullet"/>
-      </w:pPr>
-      <w:r>
-        <w:rPr>
-          <w:rFonts w:ascii="Times New Roman" w:hAnsi="Times New Roman" w:eastAsia="Times New Roman"/>
-          <w:b w:val="0"/>
-          <w:i w:val="0"/>
-          <w:sz w:val="24"/>
-        </w:rPr>
-        <w:t>риск гипогликемии, цель снижения веса;</w:t>
-      </w:r>
-    </w:p>
-    <w:p>
-      <w:pPr>
-        <w:pStyle w:val="ListBullet"/>
-      </w:pPr>
-      <w:r>
-        <w:rPr>
-          <w:rFonts w:ascii="Times New Roman" w:hAnsi="Times New Roman" w:eastAsia="Times New Roman"/>
-          <w:b w:val="0"/>
-          <w:i w:val="0"/>
-          <w:sz w:val="24"/>
-        </w:rPr>
-        <w:t>текущая терапия (метформин, инсулин).</w:t>
-      </w:r>
-    </w:p>
-    <w:p>
-      <w:pPr>
-        <w:pStyle w:val="Heading3"/>
-      </w:pPr>
-      <w:r>
-        <w:t>5.2. Выход модели</w:t>
+        <w:t>4.1. Клиническая и исследовательская проблема</w:t>
       </w:r>
     </w:p>
     <w:p>
@@ -1929,102 +1099,7 @@
           <w:i w:val="0"/>
           <w:sz w:val="24"/>
         </w:rPr>
-        <w:t>Ранжирование классов препаратов с вероятностями:</w:t>
-      </w:r>
-    </w:p>
-    <w:p>
-      <w:pPr>
-        <w:pStyle w:val="ListBullet"/>
-      </w:pPr>
-      <w:r>
-        <w:rPr>
-          <w:rFonts w:ascii="Times New Roman" w:hAnsi="Times New Roman" w:eastAsia="Times New Roman"/>
-          <w:b w:val="0"/>
-          <w:i w:val="0"/>
-          <w:sz w:val="24"/>
-        </w:rPr>
-        <w:t>метформин;</w:t>
-      </w:r>
-    </w:p>
-    <w:p>
-      <w:pPr>
-        <w:pStyle w:val="ListBullet"/>
-      </w:pPr>
-      <w:r>
-        <w:rPr>
-          <w:rFonts w:ascii="Times New Roman" w:hAnsi="Times New Roman" w:eastAsia="Times New Roman"/>
-          <w:b w:val="0"/>
-          <w:i w:val="0"/>
-          <w:sz w:val="24"/>
-        </w:rPr>
-        <w:t>иНГЛТ-2 (SGLT2);</w:t>
-      </w:r>
-    </w:p>
-    <w:p>
-      <w:pPr>
-        <w:pStyle w:val="ListBullet"/>
-      </w:pPr>
-      <w:r>
-        <w:rPr>
-          <w:rFonts w:ascii="Times New Roman" w:hAnsi="Times New Roman" w:eastAsia="Times New Roman"/>
-          <w:b w:val="0"/>
-          <w:i w:val="0"/>
-          <w:sz w:val="24"/>
-        </w:rPr>
-        <w:t>аГПП-1 (GLP-1);</w:t>
-      </w:r>
-    </w:p>
-    <w:p>
-      <w:pPr>
-        <w:pStyle w:val="ListBullet"/>
-      </w:pPr>
-      <w:r>
-        <w:rPr>
-          <w:rFonts w:ascii="Times New Roman" w:hAnsi="Times New Roman" w:eastAsia="Times New Roman"/>
-          <w:b w:val="0"/>
-          <w:i w:val="0"/>
-          <w:sz w:val="24"/>
-        </w:rPr>
-        <w:t>иППП-4 (DPP-4);</w:t>
-      </w:r>
-    </w:p>
-    <w:p>
-      <w:pPr>
-        <w:pStyle w:val="ListBullet"/>
-      </w:pPr>
-      <w:r>
-        <w:rPr>
-          <w:rFonts w:ascii="Times New Roman" w:hAnsi="Times New Roman" w:eastAsia="Times New Roman"/>
-          <w:b w:val="0"/>
-          <w:i w:val="0"/>
-          <w:sz w:val="24"/>
-        </w:rPr>
-        <w:t>сульфонилмочевины;</w:t>
-      </w:r>
-    </w:p>
-    <w:p>
-      <w:pPr>
-        <w:pStyle w:val="ListBullet"/>
-      </w:pPr>
-      <w:r>
-        <w:rPr>
-          <w:rFonts w:ascii="Times New Roman" w:hAnsi="Times New Roman" w:eastAsia="Times New Roman"/>
-          <w:b w:val="0"/>
-          <w:i w:val="0"/>
-          <w:sz w:val="24"/>
-        </w:rPr>
-        <w:t>инсулин.</w:t>
-      </w:r>
-    </w:p>
-    <w:p>
-      <w:r>
-        <w:rPr>
-          <w:rFonts w:ascii="Times New Roman" w:hAnsi="Times New Roman" w:eastAsia="Times New Roman"/>
-          <w:b w:val="0"/>
-          <w:i w:val="0"/>
-          <w:sz w:val="24"/>
-        </w:rPr>
-        <w:t xml:space="preserve">Для каждого варианта - </w:t>
+        <w:t xml:space="preserve">Планирование клинического исследования требует на раннем этапе оценить </w:t>
       </w:r>
       <w:r>
         <w:rPr>
@@ -2033,7 +1108,7 @@
           <w:i w:val="0"/>
           <w:sz w:val="24"/>
         </w:rPr>
-        <w:t>клиническое обоснование</w:t>
+        <w:t>необходимый размер выборки</w:t>
       </w:r>
       <w:r>
         <w:rPr>
@@ -2042,7 +1117,7 @@
           <w:i w:val="0"/>
           <w:sz w:val="24"/>
         </w:rPr>
-        <w:t xml:space="preserve">, предупреждения (почки, гипогликемия), </w:t>
+        <w:t xml:space="preserve"> - от этого зависят сроки, бюджет, этическая обоснованность и статистическая мощность протокола. На практике исследователи и врачи-координаторы нередко обращаются к биостатистикам с базовыми вопросами по расчёту N, тогда как для предварительной проработки гипотезы нужен </w:t>
       </w:r>
       <w:r>
         <w:rPr>
@@ -2051,7 +1126,7 @@
           <w:i w:val="0"/>
           <w:sz w:val="24"/>
         </w:rPr>
-        <w:t>экспорт PDF</w:t>
+        <w:t>доступный и понятный инструмент быстрой оценки</w:t>
       </w:r>
       <w:r>
         <w:rPr>
@@ -2068,7 +1143,7 @@
         <w:pStyle w:val="Heading3"/>
       </w:pPr>
       <w:r>
-        <w:t>5.3. Методология</w:t>
+        <w:t>4.2. Выполненная работа</w:t>
       </w:r>
     </w:p>
     <w:p>
@@ -2079,7 +1154,7 @@
           <w:i w:val="0"/>
           <w:sz w:val="24"/>
         </w:rPr>
-        <w:t xml:space="preserve">Модель </w:t>
+        <w:t xml:space="preserve">Создан специализированный веб-калькулятор для </w:t>
       </w:r>
       <w:r>
         <w:rPr>
@@ -2088,7 +1163,7 @@
           <w:i w:val="0"/>
           <w:sz w:val="24"/>
         </w:rPr>
-        <w:t>Random Forest</w:t>
+        <w:t>предварительного расчёта размера выборки</w:t>
       </w:r>
       <w:r>
         <w:rPr>
@@ -2097,7 +1172,194 @@
           <w:i w:val="0"/>
           <w:sz w:val="24"/>
         </w:rPr>
-        <w:t>, обученная на клинически размеченном датасете профилей пациентов с СД2 с учётом современных подходов к персонализации терапии (ССЗ, ХСН, ожирение, функция почек).</w:t>
+        <w:t xml:space="preserve"> при типовых дизайнах клинических испытаний. Реализованы четыре наиболее востребованных сценария:</w:t>
+      </w:r>
+    </w:p>
+    <w:p>
+      <w:pPr>
+        <w:pStyle w:val="ListNumber"/>
+      </w:pPr>
+      <w:r>
+        <w:rPr>
+          <w:rFonts w:ascii="Times New Roman" w:hAnsi="Times New Roman" w:eastAsia="Times New Roman"/>
+          <w:b/>
+          <w:i w:val="0"/>
+          <w:sz w:val="24"/>
+        </w:rPr>
+        <w:t>Сравнение средних значений</w:t>
+      </w:r>
+      <w:r>
+        <w:rPr>
+          <w:rFonts w:ascii="Times New Roman" w:hAnsi="Times New Roman" w:eastAsia="Times New Roman"/>
+          <w:b w:val="0"/>
+          <w:i w:val="0"/>
+          <w:sz w:val="24"/>
+        </w:rPr>
+        <w:t xml:space="preserve"> непрерывной конечной точки (двухвыборочный t-критерий).</w:t>
+      </w:r>
+    </w:p>
+    <w:p>
+      <w:pPr>
+        <w:pStyle w:val="ListNumber"/>
+      </w:pPr>
+      <w:r>
+        <w:rPr>
+          <w:rFonts w:ascii="Times New Roman" w:hAnsi="Times New Roman" w:eastAsia="Times New Roman"/>
+          <w:b/>
+          <w:i w:val="0"/>
+          <w:sz w:val="24"/>
+        </w:rPr>
+        <w:t>Сравнение долей</w:t>
+      </w:r>
+      <w:r>
+        <w:rPr>
+          <w:rFonts w:ascii="Times New Roman" w:hAnsi="Times New Roman" w:eastAsia="Times New Roman"/>
+          <w:b w:val="0"/>
+          <w:i w:val="0"/>
+          <w:sz w:val="24"/>
+        </w:rPr>
+        <w:t xml:space="preserve"> при бинарной конечной точке.</w:t>
+      </w:r>
+    </w:p>
+    <w:p>
+      <w:pPr>
+        <w:pStyle w:val="ListNumber"/>
+      </w:pPr>
+      <w:r>
+        <w:rPr>
+          <w:rFonts w:ascii="Times New Roman" w:hAnsi="Times New Roman" w:eastAsia="Times New Roman"/>
+          <w:b/>
+          <w:i w:val="0"/>
+          <w:sz w:val="24"/>
+        </w:rPr>
+        <w:t>Дизайн непревосходства</w:t>
+      </w:r>
+      <w:r>
+        <w:rPr>
+          <w:rFonts w:ascii="Times New Roman" w:hAnsi="Times New Roman" w:eastAsia="Times New Roman"/>
+          <w:b w:val="0"/>
+          <w:i w:val="0"/>
+          <w:sz w:val="24"/>
+        </w:rPr>
+        <w:t xml:space="preserve"> (non-inferiority) для бинарных исходов.</w:t>
+      </w:r>
+    </w:p>
+    <w:p>
+      <w:pPr>
+        <w:pStyle w:val="ListNumber"/>
+      </w:pPr>
+      <w:r>
+        <w:rPr>
+          <w:rFonts w:ascii="Times New Roman" w:hAnsi="Times New Roman" w:eastAsia="Times New Roman"/>
+          <w:b/>
+          <w:i w:val="0"/>
+          <w:sz w:val="24"/>
+        </w:rPr>
+        <w:t>Анализ времени до события</w:t>
+      </w:r>
+      <w:r>
+        <w:rPr>
+          <w:rFonts w:ascii="Times New Roman" w:hAnsi="Times New Roman" w:eastAsia="Times New Roman"/>
+          <w:b w:val="0"/>
+          <w:i w:val="0"/>
+          <w:sz w:val="24"/>
+        </w:rPr>
+        <w:t xml:space="preserve"> (выживаемость) по формуле Schoenfeld для log-rank теста.</w:t>
+      </w:r>
+    </w:p>
+    <w:p>
+      <w:r>
+        <w:rPr>
+          <w:rFonts w:ascii="Times New Roman" w:hAnsi="Times New Roman" w:eastAsia="Times New Roman"/>
+          <w:b w:val="0"/>
+          <w:i w:val="0"/>
+          <w:sz w:val="24"/>
+        </w:rPr>
+        <w:t xml:space="preserve">Пользователь задаёт уровень значимости, мощность исследования, соотношение рандомизации и ожидаемую долю выбывания; система рассчитывает размер выборки </w:t>
+      </w:r>
+      <w:r>
+        <w:rPr>
+          <w:rFonts w:ascii="Times New Roman" w:hAnsi="Times New Roman" w:eastAsia="Times New Roman"/>
+          <w:b/>
+          <w:i w:val="0"/>
+          <w:sz w:val="24"/>
+        </w:rPr>
+        <w:t>по группам и суммарно</w:t>
+      </w:r>
+      <w:r>
+        <w:rPr>
+          <w:rFonts w:ascii="Times New Roman" w:hAnsi="Times New Roman" w:eastAsia="Times New Roman"/>
+          <w:b w:val="0"/>
+          <w:i w:val="0"/>
+          <w:sz w:val="24"/>
+        </w:rPr>
+        <w:t xml:space="preserve">, с учётом запаса на потери при наблюдении. Результат можно </w:t>
+      </w:r>
+      <w:r>
+        <w:rPr>
+          <w:rFonts w:ascii="Times New Roman" w:hAnsi="Times New Roman" w:eastAsia="Times New Roman"/>
+          <w:b/>
+          <w:i w:val="0"/>
+          <w:sz w:val="24"/>
+        </w:rPr>
+        <w:t>экспортировать в PDF</w:t>
+      </w:r>
+      <w:r>
+        <w:rPr>
+          <w:rFonts w:ascii="Times New Roman" w:hAnsi="Times New Roman" w:eastAsia="Times New Roman"/>
+          <w:b w:val="0"/>
+          <w:i w:val="0"/>
+          <w:sz w:val="24"/>
+        </w:rPr>
+        <w:t xml:space="preserve"> с указанием исполнителя расчёта для включения в проектную документацию или обсуждение с биостатистиком.</w:t>
+      </w:r>
+    </w:p>
+    <w:p>
+      <w:r>
+        <w:rPr>
+          <w:rFonts w:ascii="Times New Roman" w:hAnsi="Times New Roman" w:eastAsia="Times New Roman"/>
+          <w:b w:val="0"/>
+          <w:i w:val="0"/>
+          <w:sz w:val="24"/>
+        </w:rPr>
+        <w:t>Техническая реализация выполнена с использованием проверенных статистических библиотек (scipy, statsmodels); подготовлены инструкции по развёртыванию на сервере.</w:t>
+      </w:r>
+    </w:p>
+    <w:p>
+      <w:pPr>
+        <w:pStyle w:val="Heading3"/>
+      </w:pPr>
+      <w:r>
+        <w:t>4.3. Польза для медиков и исследователей</w:t>
+      </w:r>
+    </w:p>
+    <w:p>
+      <w:r>
+        <w:rPr>
+          <w:rFonts w:ascii="Times New Roman" w:hAnsi="Times New Roman" w:eastAsia="Times New Roman"/>
+          <w:b w:val="0"/>
+          <w:i w:val="0"/>
+          <w:sz w:val="24"/>
+        </w:rPr>
+        <w:t xml:space="preserve">Калькулятор позволяет </w:t>
+      </w:r>
+      <w:r>
+        <w:rPr>
+          <w:rFonts w:ascii="Times New Roman" w:hAnsi="Times New Roman" w:eastAsia="Times New Roman"/>
+          <w:b/>
+          <w:i w:val="0"/>
+          <w:sz w:val="24"/>
+        </w:rPr>
+        <w:t>на ранней стадии</w:t>
+      </w:r>
+      <w:r>
+        <w:rPr>
+          <w:rFonts w:ascii="Times New Roman" w:hAnsi="Times New Roman" w:eastAsia="Times New Roman"/>
+          <w:b w:val="0"/>
+          <w:i w:val="0"/>
+          <w:sz w:val="24"/>
+        </w:rPr>
+        <w:t xml:space="preserve"> - ещё до полноценного протокола - оценить реалистичность дизайна исследования, сравнить несколько сценариев и подготовить обоснованный диалог с биостатистическим отделом. Это снижает число итераций при проектировании КИ и повышает качество подготовки врачей-исследователей.</w:t>
       </w:r>
     </w:p>
     <w:p>
@@ -2108,7 +1370,7 @@
           <w:i w:val="0"/>
           <w:sz w:val="24"/>
         </w:rPr>
-        <w:t>Ограничение:</w:t>
+        <w:t>Адрес:</w:t>
       </w:r>
       <w:r>
         <w:rPr>
@@ -2117,7 +1379,89 @@
           <w:i w:val="0"/>
           <w:sz w:val="24"/>
         </w:rPr>
-        <w:t xml:space="preserve"> СППВР не заменяет клинические рекомендации и решение лечащего врача.</w:t>
+        <w:t xml:space="preserve"> http://ikorsakov.tech:8080/</w:t>
+      </w:r>
+    </w:p>
+    <w:p>
+      <w:pPr>
+        <w:pStyle w:val="Heading2"/>
+      </w:pPr>
+      <w:r>
+        <w:t>5. Прогнозирование фракции выброса левого желудочка (ФВ ЛЖ)</w:t>
+      </w:r>
+    </w:p>
+    <w:p>
+      <w:pPr>
+        <w:pStyle w:val="Heading3"/>
+      </w:pPr>
+      <w:r>
+        <w:t>5.1. Клиническая проблема</w:t>
+      </w:r>
+    </w:p>
+    <w:p>
+      <w:r>
+        <w:rPr>
+          <w:rFonts w:ascii="Times New Roman" w:hAnsi="Times New Roman" w:eastAsia="Times New Roman"/>
+          <w:b w:val="0"/>
+          <w:i w:val="0"/>
+          <w:sz w:val="24"/>
+        </w:rPr>
+        <w:t xml:space="preserve">Фракция выброса левого желудочка - ключевой параметр в кардиологии: от неё зависят тактика лечения сердечной недостаточности, прогноз и объём обследования. Врачу регулярно приходится </w:t>
+      </w:r>
+      <w:r>
+        <w:rPr>
+          <w:rFonts w:ascii="Times New Roman" w:hAnsi="Times New Roman" w:eastAsia="Times New Roman"/>
+          <w:b/>
+          <w:i w:val="0"/>
+          <w:sz w:val="24"/>
+        </w:rPr>
+        <w:t>интерпретировать данные ЭхоКГ</w:t>
+      </w:r>
+      <w:r>
+        <w:rPr>
+          <w:rFonts w:ascii="Times New Roman" w:hAnsi="Times New Roman" w:eastAsia="Times New Roman"/>
+          <w:b w:val="0"/>
+          <w:i w:val="0"/>
+          <w:sz w:val="24"/>
+        </w:rPr>
+        <w:t xml:space="preserve"> и до получения полноценного заключения - оценивать вероятность снижения сократительной функции по клинической картине, особенно в условиях первичного звена и приёмного отделения.</w:t>
+      </w:r>
+    </w:p>
+    <w:p>
+      <w:pPr>
+        <w:pStyle w:val="Heading3"/>
+      </w:pPr>
+      <w:r>
+        <w:t>5.2. Выполненная работа</w:t>
+      </w:r>
+    </w:p>
+    <w:p>
+      <w:r>
+        <w:rPr>
+          <w:rFonts w:ascii="Times New Roman" w:hAnsi="Times New Roman" w:eastAsia="Times New Roman"/>
+          <w:b w:val="0"/>
+          <w:i w:val="0"/>
+          <w:sz w:val="24"/>
+        </w:rPr>
+        <w:t xml:space="preserve">Разработан веб-сервис </w:t>
+      </w:r>
+      <w:r>
+        <w:rPr>
+          <w:rFonts w:ascii="Times New Roman" w:hAnsi="Times New Roman" w:eastAsia="Times New Roman"/>
+          <w:b/>
+          <w:i w:val="0"/>
+          <w:sz w:val="24"/>
+        </w:rPr>
+        <w:t>оценки и прогнозирования ФВ ЛЖ</w:t>
+      </w:r>
+      <w:r>
+        <w:rPr>
+          <w:rFonts w:ascii="Times New Roman" w:hAnsi="Times New Roman" w:eastAsia="Times New Roman"/>
+          <w:b w:val="0"/>
+          <w:i w:val="0"/>
+          <w:sz w:val="24"/>
+        </w:rPr>
+        <w:t>, объединяющий несколько методик в одном интерфейсе.</w:t>
       </w:r>
     </w:p>
     <w:p>
@@ -2128,7 +1472,7 @@
           <w:i w:val="0"/>
           <w:sz w:val="24"/>
         </w:rPr>
-        <w:t>Файлы:</w:t>
+        <w:t>Расчёт по данным ЭхоКГ</w:t>
       </w:r>
       <w:r>
         <w:rPr>
@@ -2137,16 +1481,231 @@
           <w:i w:val="0"/>
           <w:sz w:val="24"/>
         </w:rPr>
-        <w:t xml:space="preserve"> </w:t>
+        <w:t xml:space="preserve"> реализован тремя путями: по конечным объёмам (метод </w:t>
       </w:r>
       <w:r>
         <w:rPr>
-          <w:rFonts w:ascii="Courier New" w:hAnsi="Courier New" w:eastAsia="Times New Roman"/>
+          <w:rFonts w:ascii="Times New Roman" w:hAnsi="Times New Roman" w:eastAsia="Times New Roman"/>
+          <w:b/>
+          <w:i w:val="0"/>
+          <w:sz w:val="24"/>
+        </w:rPr>
+        <w:t>Симпсона</w:t>
+      </w:r>
+      <w:r>
+        <w:rPr>
+          <w:rFonts w:ascii="Times New Roman" w:hAnsi="Times New Roman" w:eastAsia="Times New Roman"/>
           <w:b w:val="0"/>
           <w:i w:val="0"/>
           <w:sz w:val="24"/>
         </w:rPr>
-        <w:t>md_choice_app.py</w:t>
+        <w:t xml:space="preserve"> - предпочтительный объёмный подход), по линейным размерам (</w:t>
+      </w:r>
+      <w:r>
+        <w:rPr>
+          <w:rFonts w:ascii="Times New Roman" w:hAnsi="Times New Roman" w:eastAsia="Times New Roman"/>
+          <w:b/>
+          <w:i w:val="0"/>
+          <w:sz w:val="24"/>
+        </w:rPr>
+        <w:t>Teichholz</w:t>
+      </w:r>
+      <w:r>
+        <w:rPr>
+          <w:rFonts w:ascii="Times New Roman" w:hAnsi="Times New Roman" w:eastAsia="Times New Roman"/>
+          <w:b w:val="0"/>
+          <w:i w:val="0"/>
+          <w:sz w:val="24"/>
+        </w:rPr>
+        <w:t xml:space="preserve">), а также через </w:t>
+      </w:r>
+      <w:r>
+        <w:rPr>
+          <w:rFonts w:ascii="Times New Roman" w:hAnsi="Times New Roman" w:eastAsia="Times New Roman"/>
+          <w:b/>
+          <w:i w:val="0"/>
+          <w:sz w:val="24"/>
+        </w:rPr>
+        <w:t>фракцию укорочения</w:t>
+      </w:r>
+      <w:r>
+        <w:rPr>
+          <w:rFonts w:ascii="Times New Roman" w:hAnsi="Times New Roman" w:eastAsia="Times New Roman"/>
+          <w:b w:val="0"/>
+          <w:i w:val="0"/>
+          <w:sz w:val="24"/>
+        </w:rPr>
+        <w:t xml:space="preserve"> для быстрой ориентировки. Дополнительно внедрён режим </w:t>
+      </w:r>
+      <w:r>
+        <w:rPr>
+          <w:rFonts w:ascii="Times New Roman" w:hAnsi="Times New Roman" w:eastAsia="Times New Roman"/>
+          <w:b/>
+          <w:i w:val="0"/>
+          <w:sz w:val="24"/>
+        </w:rPr>
+        <w:t>сравнения методов Симпсон и Teichholz</w:t>
+      </w:r>
+      <w:r>
+        <w:rPr>
+          <w:rFonts w:ascii="Times New Roman" w:hAnsi="Times New Roman" w:eastAsia="Times New Roman"/>
+          <w:b w:val="0"/>
+          <w:i w:val="0"/>
+          <w:sz w:val="24"/>
+        </w:rPr>
+        <w:t xml:space="preserve"> с автоматическим предупреждением о значимом расхождении - это помогает выявить ситуации, когда линейные измерения могут вводить в заблуждение (асинергия, изменение геометрии полости).</w:t>
+      </w:r>
+    </w:p>
+    <w:p>
+      <w:r>
+        <w:rPr>
+          <w:rFonts w:ascii="Times New Roman" w:hAnsi="Times New Roman" w:eastAsia="Times New Roman"/>
+          <w:b/>
+          <w:i w:val="0"/>
+          <w:sz w:val="24"/>
+        </w:rPr>
+        <w:t>Клинический модуль прогноза</w:t>
+      </w:r>
+      <w:r>
+        <w:rPr>
+          <w:rFonts w:ascii="Times New Roman" w:hAnsi="Times New Roman" w:eastAsia="Times New Roman"/>
+          <w:b w:val="0"/>
+          <w:i w:val="0"/>
+          <w:sz w:val="24"/>
+        </w:rPr>
+        <w:t xml:space="preserve"> оценивает вероятность сниженной ФВ (менее 50%) до выполнения ЭхоКГ на основании возраста, пола, перенесённого инфаркта миокарда, артериальной гипертонии, сахарного диабета, фибрилляции предсердий, симптомов сердечной недостаточности, длительности QRS и уровня NT-proBNP при его наличии.</w:t>
+      </w:r>
+    </w:p>
+    <w:p>
+      <w:r>
+        <w:rPr>
+          <w:rFonts w:ascii="Times New Roman" w:hAnsi="Times New Roman" w:eastAsia="Times New Roman"/>
+          <w:b w:val="0"/>
+          <w:i w:val="0"/>
+          <w:sz w:val="24"/>
+        </w:rPr>
+        <w:t xml:space="preserve">Для всех расчётов предусмотрена </w:t>
+      </w:r>
+      <w:r>
+        <w:rPr>
+          <w:rFonts w:ascii="Times New Roman" w:hAnsi="Times New Roman" w:eastAsia="Times New Roman"/>
+          <w:b/>
+          <w:i w:val="0"/>
+          <w:sz w:val="24"/>
+        </w:rPr>
+        <w:t>автоматическая категоризация ФВ ЛЖ</w:t>
+      </w:r>
+      <w:r>
+        <w:rPr>
+          <w:rFonts w:ascii="Times New Roman" w:hAnsi="Times New Roman" w:eastAsia="Times New Roman"/>
+          <w:b w:val="0"/>
+          <w:i w:val="0"/>
+          <w:sz w:val="24"/>
+        </w:rPr>
+        <w:t xml:space="preserve"> (норма, незначительное, умеренное и выраженное снижение) и </w:t>
+      </w:r>
+      <w:r>
+        <w:rPr>
+          <w:rFonts w:ascii="Times New Roman" w:hAnsi="Times New Roman" w:eastAsia="Times New Roman"/>
+          <w:b/>
+          <w:i w:val="0"/>
+          <w:sz w:val="24"/>
+        </w:rPr>
+        <w:t>экспорт результата в PDF</w:t>
+      </w:r>
+      <w:r>
+        <w:rPr>
+          <w:rFonts w:ascii="Times New Roman" w:hAnsi="Times New Roman" w:eastAsia="Times New Roman"/>
+          <w:b w:val="0"/>
+          <w:i w:val="0"/>
+          <w:sz w:val="24"/>
+        </w:rPr>
+        <w:t>.</w:t>
+      </w:r>
+    </w:p>
+    <w:p>
+      <w:pPr>
+        <w:pStyle w:val="Heading3"/>
+      </w:pPr>
+      <w:r>
+        <w:t>5.3. Польза для врача</w:t>
+      </w:r>
+    </w:p>
+    <w:p>
+      <w:r>
+        <w:rPr>
+          <w:rFonts w:ascii="Times New Roman" w:hAnsi="Times New Roman" w:eastAsia="Times New Roman"/>
+          <w:b w:val="0"/>
+          <w:i w:val="0"/>
+          <w:sz w:val="24"/>
+        </w:rPr>
+        <w:t xml:space="preserve">Сервис служит </w:t>
+      </w:r>
+      <w:r>
+        <w:rPr>
+          <w:rFonts w:ascii="Times New Roman" w:hAnsi="Times New Roman" w:eastAsia="Times New Roman"/>
+          <w:b/>
+          <w:i w:val="0"/>
+          <w:sz w:val="24"/>
+        </w:rPr>
+        <w:t>вспомогательным клиническим инструментом</w:t>
+      </w:r>
+      <w:r>
+        <w:rPr>
+          <w:rFonts w:ascii="Times New Roman" w:hAnsi="Times New Roman" w:eastAsia="Times New Roman"/>
+          <w:b w:val="0"/>
+          <w:i w:val="0"/>
+          <w:sz w:val="24"/>
+        </w:rPr>
+        <w:t>: ускоряет обработку эхокардиографических данных, помогает структурировать предварительную оценку до официального заключения врача УЗ-диагностики и поддерживает принятие решений о срочности дообследования. Особенно полезен кардиологам, терапевтам, врачам общей практики и специалистам функциональной диагностики.</w:t>
+      </w:r>
+    </w:p>
+    <w:p>
+      <w:r>
+        <w:rPr>
+          <w:rFonts w:ascii="Times New Roman" w:hAnsi="Times New Roman" w:eastAsia="Times New Roman"/>
+          <w:b/>
+          <w:i w:val="0"/>
+          <w:sz w:val="24"/>
+        </w:rPr>
+        <w:t>Адрес:</w:t>
+      </w:r>
+      <w:r>
+        <w:rPr>
+          <w:rFonts w:ascii="Times New Roman" w:hAnsi="Times New Roman" w:eastAsia="Times New Roman"/>
+          <w:b w:val="0"/>
+          <w:i w:val="0"/>
+          <w:sz w:val="24"/>
+        </w:rPr>
+        <w:t xml:space="preserve"> http://ikorsakov.tech:9999/</w:t>
+      </w:r>
+    </w:p>
+    <w:p>
+      <w:pPr>
+        <w:pStyle w:val="Heading2"/>
+      </w:pPr>
+      <w:r>
+        <w:t>6. Инфраструктура, качество и масштаб выполненных работ</w:t>
+      </w:r>
+    </w:p>
+    <w:p>
+      <w:r>
+        <w:rPr>
+          <w:rFonts w:ascii="Times New Roman" w:hAnsi="Times New Roman" w:eastAsia="Times New Roman"/>
+          <w:b w:val="0"/>
+          <w:i w:val="0"/>
+          <w:sz w:val="24"/>
+        </w:rPr>
+        <w:t xml:space="preserve">Все четыре сервиса развёрнуты на единой серверной инфраструктуре с использованием </w:t>
+      </w:r>
+      <w:r>
+        <w:rPr>
+          <w:rFonts w:ascii="Times New Roman" w:hAnsi="Times New Roman" w:eastAsia="Times New Roman"/>
+          <w:b/>
+          <w:i w:val="0"/>
+          <w:sz w:val="24"/>
+        </w:rPr>
+        <w:t>systemd</w:t>
       </w:r>
       <w:r>
         <w:rPr>
@@ -2159,12 +1718,12 @@
       </w:r>
       <w:r>
         <w:rPr>
-          <w:rFonts w:ascii="Courier New" w:hAnsi="Courier New" w:eastAsia="Times New Roman"/>
-          <w:b w:val="0"/>
+          <w:rFonts w:ascii="Times New Roman" w:hAnsi="Times New Roman" w:eastAsia="Times New Roman"/>
+          <w:b/>
           <w:i w:val="0"/>
           <w:sz w:val="24"/>
         </w:rPr>
-        <w:t>clinical/md_choice.py</w:t>
+        <w:t>Nginx</w:t>
       </w:r>
       <w:r>
         <w:rPr>
@@ -2173,24 +1732,36 @@
           <w:i w:val="0"/>
           <w:sz w:val="24"/>
         </w:rPr>
-        <w:t xml:space="preserve">, </w:t>
+        <w:t xml:space="preserve"> и раздельных портов доступа. Для сервиса анамнеза обеспечено </w:t>
       </w:r>
       <w:r>
         <w:rPr>
-          <w:rFonts w:ascii="Courier New" w:hAnsi="Courier New" w:eastAsia="Times New Roman"/>
+          <w:rFonts w:ascii="Times New Roman" w:hAnsi="Times New Roman" w:eastAsia="Times New Roman"/>
+          <w:b/>
+          <w:i w:val="0"/>
+          <w:sz w:val="24"/>
+        </w:rPr>
+        <w:t>шифрованное HTTPS-соединение</w:t>
+      </w:r>
+      <w:r>
+        <w:rPr>
+          <w:rFonts w:ascii="Times New Roman" w:hAnsi="Times New Roman" w:eastAsia="Times New Roman"/>
           <w:b w:val="0"/>
           <w:i w:val="0"/>
           <w:sz w:val="24"/>
         </w:rPr>
-        <w:t>deploy/MD_CHOICE.md</w:t>
+        <w:t>; для расчётных инструментов - стабильный внешний доступ через обратный прокси. Подготовлены инструкции по установке, обновлению и сопровождению каждого компонента.</w:t>
       </w:r>
     </w:p>
     <w:p>
-      <w:pPr>
-        <w:pStyle w:val="Heading2"/>
-      </w:pPr>
       <w:r>
-        <w:t>6. Общая инфраструктура</w:t>
+        <w:rPr>
+          <w:rFonts w:ascii="Times New Roman" w:hAnsi="Times New Roman" w:eastAsia="Times New Roman"/>
+          <w:b w:val="0"/>
+          <w:i w:val="0"/>
+          <w:sz w:val="24"/>
+        </w:rPr>
+        <w:t>С точки зрения объёма работ выполнено:</w:t>
       </w:r>
     </w:p>
     <w:p>
@@ -2200,20 +1771,11 @@
       <w:r>
         <w:rPr>
           <w:rFonts w:ascii="Times New Roman" w:hAnsi="Times New Roman" w:eastAsia="Times New Roman"/>
-          <w:b/>
-          <w:i w:val="0"/>
-          <w:sz w:val="24"/>
-        </w:rPr>
-        <w:t>Деплой:</w:t>
-      </w:r>
-      <w:r>
-        <w:rPr>
-          <w:rFonts w:ascii="Times New Roman" w:hAnsi="Times New Roman" w:eastAsia="Times New Roman"/>
           <w:b w:val="0"/>
           <w:i w:val="0"/>
           <w:sz w:val="24"/>
         </w:rPr>
-        <w:t xml:space="preserve"> VPS, systemd, Nginx, отдельные порты для каждого сервиса</w:t>
+        <w:t>проектирование клинической логики и пользовательских сценариев для четырёх различных медицинских направлений;</w:t>
       </w:r>
     </w:p>
     <w:p>
@@ -2223,20 +1785,11 @@
       <w:r>
         <w:rPr>
           <w:rFonts w:ascii="Times New Roman" w:hAnsi="Times New Roman" w:eastAsia="Times New Roman"/>
-          <w:b/>
-          <w:i w:val="0"/>
-          <w:sz w:val="24"/>
-        </w:rPr>
-        <w:t>Безопасность:</w:t>
-      </w:r>
-      <w:r>
-        <w:rPr>
-          <w:rFonts w:ascii="Times New Roman" w:hAnsi="Times New Roman" w:eastAsia="Times New Roman"/>
           <w:b w:val="0"/>
           <w:i w:val="0"/>
           <w:sz w:val="24"/>
         </w:rPr>
-        <w:t xml:space="preserve"> HTTPS для анамнеза; для калькуляторов - внутренний Streamlit + Nginx proxy</w:t>
+        <w:t>программная реализация на Python/Streamlit с выделением переиспользуемых клинических модулей;</w:t>
       </w:r>
     </w:p>
     <w:p>
@@ -2246,11 +1799,59 @@
       <w:r>
         <w:rPr>
           <w:rFonts w:ascii="Times New Roman" w:hAnsi="Times New Roman" w:eastAsia="Times New Roman"/>
+          <w:b w:val="0"/>
+          <w:i w:val="0"/>
+          <w:sz w:val="24"/>
+        </w:rPr>
+        <w:t>интеграция статистических и машинно-обучающих методов;</w:t>
+      </w:r>
+    </w:p>
+    <w:p>
+      <w:pPr>
+        <w:pStyle w:val="ListBullet"/>
+      </w:pPr>
+      <w:r>
+        <w:rPr>
+          <w:rFonts w:ascii="Times New Roman" w:hAnsi="Times New Roman" w:eastAsia="Times New Roman"/>
+          <w:b w:val="0"/>
+          <w:i w:val="0"/>
+          <w:sz w:val="24"/>
+        </w:rPr>
+        <w:t>организация экспорта результатов в PDF для документирования;</w:t>
+      </w:r>
+    </w:p>
+    <w:p>
+      <w:pPr>
+        <w:pStyle w:val="ListBullet"/>
+      </w:pPr>
+      <w:r>
+        <w:rPr>
+          <w:rFonts w:ascii="Times New Roman" w:hAnsi="Times New Roman" w:eastAsia="Times New Roman"/>
+          <w:b w:val="0"/>
+          <w:i w:val="0"/>
+          <w:sz w:val="24"/>
+        </w:rPr>
+        <w:t>подготовка отчётной и эксплуатационной документации.</w:t>
+      </w:r>
+    </w:p>
+    <w:p>
+      <w:r>
+        <w:rPr>
+          <w:rFonts w:ascii="Times New Roman" w:hAnsi="Times New Roman" w:eastAsia="Times New Roman"/>
+          <w:b w:val="0"/>
+          <w:i w:val="0"/>
+          <w:sz w:val="24"/>
+        </w:rPr>
+        <w:t xml:space="preserve">Созданные решения образуют </w:t>
+      </w:r>
+      <w:r>
+        <w:rPr>
+          <w:rFonts w:ascii="Times New Roman" w:hAnsi="Times New Roman" w:eastAsia="Times New Roman"/>
           <w:b/>
           <w:i w:val="0"/>
           <w:sz w:val="24"/>
         </w:rPr>
-        <w:t>Документация:</w:t>
+        <w:t>единую линейку цифровых инструментов для медиков</w:t>
       </w:r>
       <w:r>
         <w:rPr>
@@ -2259,7 +1860,7 @@
           <w:i w:val="0"/>
           <w:sz w:val="24"/>
         </w:rPr>
-        <w:t xml:space="preserve"> README, DEPLOY.md, TRIAL_CALCULATOR.md, LVEF.md, MD_CHOICE.md</w:t>
+        <w:t xml:space="preserve"> - от ежедневной амбулаторной практики до научно-исследовательской деятельности.</w:t>
       </w:r>
     </w:p>
     <w:p>
@@ -2267,7 +1868,7 @@
         <w:pStyle w:val="Heading2"/>
       </w:pPr>
       <w:r>
-        <w:t>7. Планы развития</w:t>
+        <w:t>7. Перспективы развития</w:t>
       </w:r>
     </w:p>
     <w:tbl>
@@ -2330,7 +1931,7 @@
                 <w:i w:val="0"/>
                 <w:sz w:val="24"/>
               </w:rPr>
-              <w:t>Анамнез</w:t>
+              <w:t>Анамнез эндокринолога</w:t>
             </w:r>
           </w:p>
         </w:tc>
@@ -2347,7 +1948,43 @@
                 <w:i w:val="0"/>
                 <w:sz w:val="24"/>
               </w:rPr>
-              <w:t>QR-коды, красивые URL, аудит 152-ФЗ</w:t>
+              <w:t>QR-коды в клинике, интеграция с МИС, соответствие требованиям по защите персональных данных</w:t>
+            </w:r>
+          </w:p>
+        </w:tc>
+      </w:tr>
+      <w:tr>
+        <w:tc>
+          <w:tcPr>
+            <w:tcW w:type="dxa" w:w="4844"/>
+          </w:tcPr>
+          <w:p>
+            <w:r/>
+            <w:r>
+              <w:rPr>
+                <w:rFonts w:ascii="Times New Roman" w:hAnsi="Times New Roman" w:eastAsia="Times New Roman"/>
+                <w:b w:val="0"/>
+                <w:i w:val="0"/>
+                <w:sz w:val="24"/>
+              </w:rPr>
+              <w:t>MD Choice</w:t>
+            </w:r>
+          </w:p>
+        </w:tc>
+        <w:tc>
+          <w:tcPr>
+            <w:tcW w:type="dxa" w:w="4844"/>
+          </w:tcPr>
+          <w:p>
+            <w:r/>
+            <w:r>
+              <w:rPr>
+                <w:rFonts w:ascii="Times New Roman" w:hAnsi="Times New Roman" w:eastAsia="Times New Roman"/>
+                <w:b w:val="0"/>
+                <w:i w:val="0"/>
+                <w:sz w:val="24"/>
+              </w:rPr>
+              <w:t>Обучение модели на реальных обезличенных клинических данных, связка с анамнезом</w:t>
             </w:r>
           </w:p>
         </w:tc>
@@ -2383,7 +2020,7 @@
                 <w:i w:val="0"/>
                 <w:sz w:val="24"/>
               </w:rPr>
-              <w:t>Paired design, кластерная рандомизация</w:t>
+              <w:t>Парные дизайны, кластерная рандомизация, многоцентровые исследования</w:t>
             </w:r>
           </w:p>
         </w:tc>
@@ -2402,7 +2039,7 @@
                 <w:i w:val="0"/>
                 <w:sz w:val="24"/>
               </w:rPr>
-              <w:t>ФВ ЛЖ</w:t>
+              <w:t>Прогноз ФВ ЛЖ</w:t>
             </w:r>
           </w:p>
         </w:tc>
@@ -2419,43 +2056,7 @@
                 <w:i w:val="0"/>
                 <w:sz w:val="24"/>
               </w:rPr>
-              <w:t>ML-модель по данным ЭхоКГ, архив расчётов</w:t>
-            </w:r>
-          </w:p>
-        </w:tc>
-      </w:tr>
-      <w:tr>
-        <w:tc>
-          <w:tcPr>
-            <w:tcW w:type="dxa" w:w="4844"/>
-          </w:tcPr>
-          <w:p>
-            <w:r/>
-            <w:r>
-              <w:rPr>
-                <w:rFonts w:ascii="Times New Roman" w:hAnsi="Times New Roman" w:eastAsia="Times New Roman"/>
-                <w:b w:val="0"/>
-                <w:i w:val="0"/>
-                <w:sz w:val="24"/>
-              </w:rPr>
-              <w:t>MD Choice</w:t>
-            </w:r>
-          </w:p>
-        </w:tc>
-        <w:tc>
-          <w:tcPr>
-            <w:tcW w:type="dxa" w:w="4844"/>
-          </w:tcPr>
-          <w:p>
-            <w:r/>
-            <w:r>
-              <w:rPr>
-                <w:rFonts w:ascii="Times New Roman" w:hAnsi="Times New Roman" w:eastAsia="Times New Roman"/>
-                <w:b w:val="0"/>
-                <w:i w:val="0"/>
-                <w:sz w:val="24"/>
-              </w:rPr>
-              <w:t>Обучение на реальных клинических данных, интеграция с анамнезом</w:t>
+              <w:t>Углублённые ML-модели, архив расчётов для аудита</w:t>
             </w:r>
           </w:p>
         </w:tc>
@@ -2491,7 +2092,7 @@
                 <w:i w:val="0"/>
                 <w:sz w:val="24"/>
               </w:rPr>
-              <w:t>Единый портал медицинских инструментов на ikorsakov.tech</w:t>
+              <w:t>Единый портал медицинских сервисов ikorsakov.tech</w:t>
             </w:r>
           </w:p>
         </w:tc>
@@ -2503,7 +2104,62 @@
         <w:pStyle w:val="Heading2"/>
       </w:pPr>
       <w:r>
-        <w:t>8. Формулировка для служебной записки (1 абзац)</w:t>
+        <w:t>8. Выводы</w:t>
+      </w:r>
+    </w:p>
+    <w:p>
+      <w:r>
+        <w:rPr>
+          <w:rFonts w:ascii="Times New Roman" w:hAnsi="Times New Roman" w:eastAsia="Times New Roman"/>
+          <w:b w:val="0"/>
+          <w:i w:val="0"/>
+          <w:sz w:val="24"/>
+        </w:rPr>
+        <w:t xml:space="preserve">В отчётном периоде проделана </w:t>
+      </w:r>
+      <w:r>
+        <w:rPr>
+          <w:rFonts w:ascii="Times New Roman" w:hAnsi="Times New Roman" w:eastAsia="Times New Roman"/>
+          <w:b/>
+          <w:i w:val="0"/>
+          <w:sz w:val="24"/>
+        </w:rPr>
+        <w:t>существенная практическая работа</w:t>
+      </w:r>
+      <w:r>
+        <w:rPr>
+          <w:rFonts w:ascii="Times New Roman" w:hAnsi="Times New Roman" w:eastAsia="Times New Roman"/>
+          <w:b w:val="0"/>
+          <w:i w:val="0"/>
+          <w:sz w:val="24"/>
+        </w:rPr>
+        <w:t xml:space="preserve"> по созданию цифровых сервисов, непосредственно ориентированных на нужды врачей. Разработанные инструменты закрывают разные этапы клинического процесса: подготовку пациента к приёму, поддержку терапевтических решений, интерпретацию диагностических данных и планирование клинических исследований. Все сервисы развёрнуты, документированы и готовы к </w:t>
+      </w:r>
+      <w:r>
+        <w:rPr>
+          <w:rFonts w:ascii="Times New Roman" w:hAnsi="Times New Roman" w:eastAsia="Times New Roman"/>
+          <w:b/>
+          <w:i w:val="0"/>
+          <w:sz w:val="24"/>
+        </w:rPr>
+        <w:t>пилотному внедрению в медицинской и научной практике</w:t>
+      </w:r>
+      <w:r>
+        <w:rPr>
+          <w:rFonts w:ascii="Times New Roman" w:hAnsi="Times New Roman" w:eastAsia="Times New Roman"/>
+          <w:b w:val="0"/>
+          <w:i w:val="0"/>
+          <w:sz w:val="24"/>
+        </w:rPr>
+        <w:t>.</w:t>
+      </w:r>
+    </w:p>
+    <w:p>
+      <w:pPr>
+        <w:pStyle w:val="Heading2"/>
+      </w:pPr>
+      <w:r>
+        <w:t>9. Формулировка для служебной записки</w:t>
       </w:r>
     </w:p>
     <w:p>
@@ -2517,7 +2173,7 @@
           <w:i/>
           <w:sz w:val="24"/>
         </w:rPr>
-        <w:t>С начала 2026 года старший научный сотрудник Корсаков И.Н. разработал и развёрнул четыре цифровых медицинских сервиса: MVP предприёмного эндокринологического анамнеза (anamnes.ikorsakov.tech); MD Choice - систему поддержки принятия врачебных решений для прогнозирования выбора препарата при СД2 на основе машинного обучения (ikorsakov.tech:7777); калькулятор расчёта выборки для клинических испытаний (ikorsakov.tech:8080); сервис прогнозирования фракции выброса левого желудочка (ikorsakov.tech:9999). Все решения документированы и готовы к пилотному использованию в клинической и исследовательской практике.</w:t>
+        <w:t>С начала 2026 года старший научный сотрудник Корсаков И.Н. выполнил комплекс работ по разработке и внедрению четырёх цифровых медицинских сервисов, ориентированных на нужды врачебной практики и клинических исследований: предприёмный сбор эндокринологического анамнеза с кабинетом врача и уведомлениями (anamnes.ikorsakov.tech); систему поддержки принятия решений MD Choice для прогнозирования выбора препарата при сахарном диабете 2 типа на основе машинного обучения (ikorsakov.tech:7777); калькулятор расчёта выборки для клинических испытаний (ikorsakov.tech:8080); сервис прогнозирования фракции выброса левого желудочка (ikorsakov.tech:9999). Разработанные инструменты сокращают время подготовки к приёму, повышают полноту клинических данных, поддерживают врача при выборе терапии и планировании исследований. Сервисы развёрнуты на сервере, снабжены документацией и готовы к пилотному использованию.</w:t>
       </w:r>
     </w:p>
     <w:sectPr>

</xml_diff>

<commit_message>
Add NII lab subdivision to medical report header and memo text.
Co-authored-by: Igor N Korsakov <igor.korsa@gmail.com>
</commit_message>
<xml_diff>
--- a/docs/MEDICAL_REPORT_2026.docx
+++ b/docs/MEDICAL_REPORT_2026.docx
@@ -72,7 +72,7 @@
           <w:i w:val="0"/>
           <w:sz w:val="24"/>
         </w:rPr>
-        <w:t>Должность / организация:</w:t>
+        <w:t>Должность:</w:t>
       </w:r>
       <w:r>
         <w:rPr>
@@ -92,6 +92,26 @@
           <w:i w:val="0"/>
           <w:sz w:val="24"/>
         </w:rPr>
+        <w:t>Подразделение:</w:t>
+      </w:r>
+      <w:r>
+        <w:rPr>
+          <w:rFonts w:ascii="Times New Roman" w:hAnsi="Times New Roman" w:eastAsia="Times New Roman"/>
+          <w:b w:val="0"/>
+          <w:i w:val="0"/>
+          <w:sz w:val="24"/>
+        </w:rPr>
+        <w:t xml:space="preserve"> Внебюджет / Наука / Научно-исследовательский центр развития искусственного интеллекта в медицине / Научно-исследовательская лаборатория компьютерного моделирования и искусственного интеллекта</w:t>
+      </w:r>
+    </w:p>
+    <w:p>
+      <w:r>
+        <w:rPr>
+          <w:rFonts w:ascii="Times New Roman" w:hAnsi="Times New Roman" w:eastAsia="Times New Roman"/>
+          <w:b/>
+          <w:i w:val="0"/>
+          <w:sz w:val="24"/>
+        </w:rPr>
         <w:t>Направление:</w:t>
       </w:r>
       <w:r>
@@ -101,7 +121,7 @@
           <w:i w:val="0"/>
           <w:sz w:val="24"/>
         </w:rPr>
-        <w:t xml:space="preserve"> цифровизация клинической практики, эндокринология, кардиология, клинические исследования</w:t>
+        <w:t xml:space="preserve"> цифровизация клинической практики, эндокринология, кардиология, клинические исследования, применение ИИ в медицине</w:t>
       </w:r>
     </w:p>
     <w:p>
@@ -120,7 +140,25 @@
           <w:i w:val="0"/>
           <w:sz w:val="24"/>
         </w:rPr>
-        <w:t xml:space="preserve">В начале 2026 года была развёрнута программа создания </w:t>
+        <w:t xml:space="preserve">В начале 2026 года в рамках деятельности </w:t>
+      </w:r>
+      <w:r>
+        <w:rPr>
+          <w:rFonts w:ascii="Times New Roman" w:hAnsi="Times New Roman" w:eastAsia="Times New Roman"/>
+          <w:b/>
+          <w:i w:val="0"/>
+          <w:sz w:val="24"/>
+        </w:rPr>
+        <w:t>Научно-исследовательской лаборатории компьютерного моделирования и искусственного интеллекта</w:t>
+      </w:r>
+      <w:r>
+        <w:rPr>
+          <w:rFonts w:ascii="Times New Roman" w:hAnsi="Times New Roman" w:eastAsia="Times New Roman"/>
+          <w:b w:val="0"/>
+          <w:i w:val="0"/>
+          <w:sz w:val="24"/>
+        </w:rPr>
+        <w:t xml:space="preserve"> (НИЦ развития искусственного интеллекта в медицине) была развёрнута программа создания </w:t>
       </w:r>
       <w:r>
         <w:rPr>
@@ -2173,7 +2211,7 @@
           <w:i/>
           <w:sz w:val="24"/>
         </w:rPr>
-        <w:t>С начала 2026 года старший научный сотрудник Корсаков И.Н. выполнил комплекс работ по разработке и внедрению четырёх цифровых медицинских сервисов, ориентированных на нужды врачебной практики и клинических исследований: предприёмный сбор эндокринологического анамнеза с кабинетом врача и уведомлениями (anamnes.ikorsakov.tech); систему поддержки принятия решений MD Choice для прогнозирования выбора препарата при сахарном диабете 2 типа на основе машинного обучения (ikorsakov.tech:7777); калькулятор расчёта выборки для клинических испытаний (ikorsakov.tech:8080); сервис прогнозирования фракции выброса левого желудочка (ikorsakov.tech:9999). Разработанные инструменты сокращают время подготовки к приёму, повышают полноту клинических данных, поддерживают врача при выборе терапии и планировании исследований. Сервисы развёрнуты на сервере, снабжены документацией и готовы к пилотному использованию.</w:t>
+        <w:t>С начала 2026 года старший научный сотрудник Научно-исследовательской лаборатории компьютерного моделирования и искусственного интеллекта (НИЦ развития ИИ в медицине) Корсаков И.Н. выполнил комплекс работ по разработке и внедрению четырёх цифровых медицинских сервисов, ориентированных на нужды врачебной практики и клинических исследований: предприёмный сбор эндокринологического анамнеза с кабинетом врача и уведомлениями (anamnes.ikorsakov.tech); систему поддержки принятия решений MD Choice для прогнозирования выбора препарата при сахарном диабете 2 типа на основе машинного обучения (ikorsakov.tech:7777); калькулятор расчёта выборки для клинических испытаний (ikorsakov.tech:8080); сервис прогнозирования фракции выброса левого желудочка (ikorsakov.tech:9999). Разработанные инструменты сокращают время подготовки к приёму, повышают полноту клинических данных, поддерживают врача при выборе терапии и планировании исследований. Сервисы развёрнуты на сервере, снабжены документацией и готовы к пилотному использованию.</w:t>
       </w:r>
     </w:p>
     <w:sectPr>

</xml_diff>

<commit_message>
Improve report layout: narrower text block, justified paragraphs, table widths.
Co-authored-by: Igor N Korsakov <igor.korsa@gmail.com>
</commit_message>
<xml_diff>
--- a/docs/MEDICAL_REPORT_2026.docx
+++ b/docs/MEDICAL_REPORT_2026.docx
@@ -25,6 +25,10 @@
       </w:r>
     </w:p>
     <w:p>
+      <w:pPr>
+        <w:spacing w:lineRule="auto" w:line="276" w:after="120"/>
+        <w:jc w:val="both"/>
+      </w:pPr>
       <w:r>
         <w:rPr>
           <w:rFonts w:ascii="Times New Roman" w:hAnsi="Times New Roman" w:eastAsia="Times New Roman"/>
@@ -45,6 +49,10 @@
       </w:r>
     </w:p>
     <w:p>
+      <w:pPr>
+        <w:spacing w:lineRule="auto" w:line="276" w:after="120"/>
+        <w:jc w:val="both"/>
+      </w:pPr>
       <w:r>
         <w:rPr>
           <w:rFonts w:ascii="Times New Roman" w:hAnsi="Times New Roman" w:eastAsia="Times New Roman"/>
@@ -65,6 +73,10 @@
       </w:r>
     </w:p>
     <w:p>
+      <w:pPr>
+        <w:spacing w:lineRule="auto" w:line="276" w:after="120"/>
+        <w:jc w:val="both"/>
+      </w:pPr>
       <w:r>
         <w:rPr>
           <w:rFonts w:ascii="Times New Roman" w:hAnsi="Times New Roman" w:eastAsia="Times New Roman"/>
@@ -85,6 +97,10 @@
       </w:r>
     </w:p>
     <w:p>
+      <w:pPr>
+        <w:spacing w:lineRule="auto" w:line="276" w:after="120"/>
+        <w:jc w:val="both"/>
+      </w:pPr>
       <w:r>
         <w:rPr>
           <w:rFonts w:ascii="Times New Roman" w:hAnsi="Times New Roman" w:eastAsia="Times New Roman"/>
@@ -101,10 +117,29 @@
           <w:i w:val="0"/>
           <w:sz w:val="24"/>
         </w:rPr>
-        <w:t xml:space="preserve"> Внебюджет / Наука / Научно-исследовательский центр развития искусственного интеллекта в медицине / Научно-исследовательская лаборатория компьютерного моделирования и искусственного интеллекта</w:t>
+        <w:t xml:space="preserve"> Внебюджет / Наука / НИЦ развития ИИ в медицине /</w:t>
       </w:r>
     </w:p>
     <w:p>
+      <w:pPr>
+        <w:spacing w:lineRule="auto" w:line="276" w:after="120"/>
+        <w:jc w:val="both"/>
+      </w:pPr>
+      <w:r>
+        <w:rPr>
+          <w:rFonts w:ascii="Times New Roman" w:hAnsi="Times New Roman" w:eastAsia="Times New Roman"/>
+          <w:b w:val="0"/>
+          <w:i w:val="0"/>
+          <w:sz w:val="24"/>
+        </w:rPr>
+        <w:t>НИЛ компьютерного моделирования и искусственного интеллекта</w:t>
+      </w:r>
+    </w:p>
+    <w:p>
+      <w:pPr>
+        <w:spacing w:lineRule="auto" w:line="276" w:after="120"/>
+        <w:jc w:val="both"/>
+      </w:pPr>
       <w:r>
         <w:rPr>
           <w:rFonts w:ascii="Times New Roman" w:hAnsi="Times New Roman" w:eastAsia="Times New Roman"/>
@@ -121,7 +156,7 @@
           <w:i w:val="0"/>
           <w:sz w:val="24"/>
         </w:rPr>
-        <w:t xml:space="preserve"> цифровизация клинической практики, эндокринология, кардиология, клинические исследования, применение ИИ в медицине</w:t>
+        <w:t xml:space="preserve"> цифровизация клинической практики, эндокринология, кардиология, клинические исследования, ИИ в медицине</w:t>
       </w:r>
     </w:p>
     <w:p>
@@ -133,6 +168,10 @@
       </w:r>
     </w:p>
     <w:p>
+      <w:pPr>
+        <w:spacing w:lineRule="auto" w:line="276" w:after="120"/>
+        <w:jc w:val="both"/>
+      </w:pPr>
       <w:r>
         <w:rPr>
           <w:rFonts w:ascii="Times New Roman" w:hAnsi="Times New Roman" w:eastAsia="Times New Roman"/>
@@ -180,6 +219,10 @@
       </w:r>
     </w:p>
     <w:p>
+      <w:pPr>
+        <w:spacing w:lineRule="auto" w:line="276" w:after="120"/>
+        <w:jc w:val="both"/>
+      </w:pPr>
       <w:r>
         <w:rPr>
           <w:rFonts w:ascii="Times New Roman" w:hAnsi="Times New Roman" w:eastAsia="Times New Roman"/>
@@ -227,6 +270,10 @@
       </w:r>
     </w:p>
     <w:p>
+      <w:pPr>
+        <w:spacing w:lineRule="auto" w:line="276" w:after="120"/>
+        <w:jc w:val="both"/>
+      </w:pPr>
       <w:r>
         <w:rPr>
           <w:rFonts w:ascii="Times New Roman" w:hAnsi="Times New Roman" w:eastAsia="Times New Roman"/>
@@ -250,26 +297,31 @@
       <w:tblPr>
         <w:tblStyle w:val="TableGrid"/>
         <w:tblW w:type="auto" w:w="0"/>
+        <w:tblLayout w:type="fixed"/>
         <w:tblLook w:firstColumn="1" w:firstRow="1" w:lastColumn="0" w:lastRow="0" w:noHBand="0" w:noVBand="1" w:val="04A0"/>
       </w:tblPr>
       <w:tblGrid>
-        <w:gridCol w:w="3230"/>
-        <w:gridCol w:w="3230"/>
-        <w:gridCol w:w="3230"/>
+        <w:gridCol w:w="2268"/>
+        <w:gridCol w:w="3175"/>
+        <w:gridCol w:w="3628"/>
       </w:tblGrid>
       <w:tr>
         <w:tc>
           <w:tcPr>
-            <w:tcW w:type="dxa" w:w="3230"/>
+            <w:tcW w:type="dxa" w:w="3041"/>
           </w:tcPr>
           <w:p>
+            <w:pPr>
+              <w:spacing w:lineRule="auto" w:line="276" w:after="120"/>
+              <w:jc w:val="both"/>
+            </w:pPr>
             <w:r/>
             <w:r>
               <w:rPr>
                 <w:rFonts w:ascii="Times New Roman" w:hAnsi="Times New Roman" w:eastAsia="Times New Roman"/>
                 <w:b/>
                 <w:i w:val="0"/>
-                <w:sz w:val="24"/>
+                <w:sz w:val="22"/>
               </w:rPr>
               <w:t>Сервис</w:t>
             </w:r>
@@ -277,16 +329,20 @@
         </w:tc>
         <w:tc>
           <w:tcPr>
-            <w:tcW w:type="dxa" w:w="3230"/>
+            <w:tcW w:type="dxa" w:w="3041"/>
           </w:tcPr>
           <w:p>
+            <w:pPr>
+              <w:spacing w:lineRule="auto" w:line="276" w:after="120"/>
+              <w:jc w:val="both"/>
+            </w:pPr>
             <w:r/>
             <w:r>
               <w:rPr>
                 <w:rFonts w:ascii="Times New Roman" w:hAnsi="Times New Roman" w:eastAsia="Times New Roman"/>
                 <w:b/>
                 <w:i w:val="0"/>
-                <w:sz w:val="24"/>
+                <w:sz w:val="22"/>
               </w:rPr>
               <w:t>Адрес</w:t>
             </w:r>
@@ -294,16 +350,20 @@
         </w:tc>
         <w:tc>
           <w:tcPr>
-            <w:tcW w:type="dxa" w:w="3230"/>
+            <w:tcW w:type="dxa" w:w="3041"/>
           </w:tcPr>
           <w:p>
+            <w:pPr>
+              <w:spacing w:lineRule="auto" w:line="276" w:after="120"/>
+              <w:jc w:val="both"/>
+            </w:pPr>
             <w:r/>
             <w:r>
               <w:rPr>
                 <w:rFonts w:ascii="Times New Roman" w:hAnsi="Times New Roman" w:eastAsia="Times New Roman"/>
                 <w:b/>
                 <w:i w:val="0"/>
-                <w:sz w:val="24"/>
+                <w:sz w:val="22"/>
               </w:rPr>
               <w:t>Для кого</w:t>
             </w:r>
@@ -313,16 +373,20 @@
       <w:tr>
         <w:tc>
           <w:tcPr>
-            <w:tcW w:type="dxa" w:w="3230"/>
+            <w:tcW w:type="dxa" w:w="3041"/>
           </w:tcPr>
           <w:p>
+            <w:pPr>
+              <w:spacing w:lineRule="auto" w:line="276" w:after="120"/>
+              <w:jc w:val="both"/>
+            </w:pPr>
             <w:r/>
             <w:r>
               <w:rPr>
                 <w:rFonts w:ascii="Times New Roman" w:hAnsi="Times New Roman" w:eastAsia="Times New Roman"/>
                 <w:b w:val="0"/>
                 <w:i w:val="0"/>
-                <w:sz w:val="24"/>
+                <w:sz w:val="22"/>
               </w:rPr>
               <w:t>Анамнез эндокринолога</w:t>
             </w:r>
@@ -330,16 +394,20 @@
         </w:tc>
         <w:tc>
           <w:tcPr>
-            <w:tcW w:type="dxa" w:w="3230"/>
+            <w:tcW w:type="dxa" w:w="3041"/>
           </w:tcPr>
           <w:p>
+            <w:pPr>
+              <w:spacing w:lineRule="auto" w:line="276" w:after="120"/>
+              <w:jc w:val="both"/>
+            </w:pPr>
             <w:r/>
             <w:r>
               <w:rPr>
                 <w:rFonts w:ascii="Times New Roman" w:hAnsi="Times New Roman" w:eastAsia="Times New Roman"/>
                 <w:b w:val="0"/>
                 <w:i w:val="0"/>
-                <w:sz w:val="24"/>
+                <w:sz w:val="22"/>
               </w:rPr>
               <w:t>https://anamnes.ikorsakov.tech</w:t>
             </w:r>
@@ -347,16 +415,20 @@
         </w:tc>
         <w:tc>
           <w:tcPr>
-            <w:tcW w:type="dxa" w:w="3230"/>
+            <w:tcW w:type="dxa" w:w="3041"/>
           </w:tcPr>
           <w:p>
+            <w:pPr>
+              <w:spacing w:lineRule="auto" w:line="276" w:after="120"/>
+              <w:jc w:val="both"/>
+            </w:pPr>
             <w:r/>
             <w:r>
               <w:rPr>
                 <w:rFonts w:ascii="Times New Roman" w:hAnsi="Times New Roman" w:eastAsia="Times New Roman"/>
                 <w:b w:val="0"/>
                 <w:i w:val="0"/>
-                <w:sz w:val="24"/>
+                <w:sz w:val="22"/>
               </w:rPr>
               <w:t>Эндокринологи, врачи общей практики</w:t>
             </w:r>
@@ -366,16 +438,20 @@
       <w:tr>
         <w:tc>
           <w:tcPr>
-            <w:tcW w:type="dxa" w:w="3230"/>
+            <w:tcW w:type="dxa" w:w="3041"/>
           </w:tcPr>
           <w:p>
+            <w:pPr>
+              <w:spacing w:lineRule="auto" w:line="276" w:after="120"/>
+              <w:jc w:val="both"/>
+            </w:pPr>
             <w:r/>
             <w:r>
               <w:rPr>
                 <w:rFonts w:ascii="Times New Roman" w:hAnsi="Times New Roman" w:eastAsia="Times New Roman"/>
                 <w:b w:val="0"/>
                 <w:i w:val="0"/>
-                <w:sz w:val="24"/>
+                <w:sz w:val="22"/>
               </w:rPr>
               <w:t>MD Choice</w:t>
             </w:r>
@@ -383,16 +459,20 @@
         </w:tc>
         <w:tc>
           <w:tcPr>
-            <w:tcW w:type="dxa" w:w="3230"/>
+            <w:tcW w:type="dxa" w:w="3041"/>
           </w:tcPr>
           <w:p>
+            <w:pPr>
+              <w:spacing w:lineRule="auto" w:line="276" w:after="120"/>
+              <w:jc w:val="both"/>
+            </w:pPr>
             <w:r/>
             <w:r>
               <w:rPr>
                 <w:rFonts w:ascii="Times New Roman" w:hAnsi="Times New Roman" w:eastAsia="Times New Roman"/>
                 <w:b w:val="0"/>
                 <w:i w:val="0"/>
-                <w:sz w:val="24"/>
+                <w:sz w:val="22"/>
               </w:rPr>
               <w:t>http://ikorsakov.tech:7777</w:t>
             </w:r>
@@ -400,16 +480,20 @@
         </w:tc>
         <w:tc>
           <w:tcPr>
-            <w:tcW w:type="dxa" w:w="3230"/>
+            <w:tcW w:type="dxa" w:w="3041"/>
           </w:tcPr>
           <w:p>
+            <w:pPr>
+              <w:spacing w:lineRule="auto" w:line="276" w:after="120"/>
+              <w:jc w:val="both"/>
+            </w:pPr>
             <w:r/>
             <w:r>
               <w:rPr>
                 <w:rFonts w:ascii="Times New Roman" w:hAnsi="Times New Roman" w:eastAsia="Times New Roman"/>
                 <w:b w:val="0"/>
                 <w:i w:val="0"/>
-                <w:sz w:val="24"/>
+                <w:sz w:val="22"/>
               </w:rPr>
               <w:t>Эндокринологи, терапевты, врачи при СД2</w:t>
             </w:r>
@@ -419,16 +503,20 @@
       <w:tr>
         <w:tc>
           <w:tcPr>
-            <w:tcW w:type="dxa" w:w="3230"/>
+            <w:tcW w:type="dxa" w:w="3041"/>
           </w:tcPr>
           <w:p>
+            <w:pPr>
+              <w:spacing w:lineRule="auto" w:line="276" w:after="120"/>
+              <w:jc w:val="both"/>
+            </w:pPr>
             <w:r/>
             <w:r>
               <w:rPr>
                 <w:rFonts w:ascii="Times New Roman" w:hAnsi="Times New Roman" w:eastAsia="Times New Roman"/>
                 <w:b w:val="0"/>
                 <w:i w:val="0"/>
-                <w:sz w:val="24"/>
+                <w:sz w:val="22"/>
               </w:rPr>
               <w:t>Калькулятор выборки КИ</w:t>
             </w:r>
@@ -436,16 +524,20 @@
         </w:tc>
         <w:tc>
           <w:tcPr>
-            <w:tcW w:type="dxa" w:w="3230"/>
+            <w:tcW w:type="dxa" w:w="3041"/>
           </w:tcPr>
           <w:p>
+            <w:pPr>
+              <w:spacing w:lineRule="auto" w:line="276" w:after="120"/>
+              <w:jc w:val="both"/>
+            </w:pPr>
             <w:r/>
             <w:r>
               <w:rPr>
                 <w:rFonts w:ascii="Times New Roman" w:hAnsi="Times New Roman" w:eastAsia="Times New Roman"/>
                 <w:b w:val="0"/>
                 <w:i w:val="0"/>
-                <w:sz w:val="24"/>
+                <w:sz w:val="22"/>
               </w:rPr>
               <w:t>http://ikorsakov.tech:8080</w:t>
             </w:r>
@@ -453,16 +545,20 @@
         </w:tc>
         <w:tc>
           <w:tcPr>
-            <w:tcW w:type="dxa" w:w="3230"/>
+            <w:tcW w:type="dxa" w:w="3041"/>
           </w:tcPr>
           <w:p>
+            <w:pPr>
+              <w:spacing w:lineRule="auto" w:line="276" w:after="120"/>
+              <w:jc w:val="both"/>
+            </w:pPr>
             <w:r/>
             <w:r>
               <w:rPr>
                 <w:rFonts w:ascii="Times New Roman" w:hAnsi="Times New Roman" w:eastAsia="Times New Roman"/>
                 <w:b w:val="0"/>
                 <w:i w:val="0"/>
-                <w:sz w:val="24"/>
+                <w:sz w:val="22"/>
               </w:rPr>
               <w:t>Исследователи, биостатистики, заведующие КИ</w:t>
             </w:r>
@@ -472,16 +568,20 @@
       <w:tr>
         <w:tc>
           <w:tcPr>
-            <w:tcW w:type="dxa" w:w="3230"/>
+            <w:tcW w:type="dxa" w:w="3041"/>
           </w:tcPr>
           <w:p>
+            <w:pPr>
+              <w:spacing w:lineRule="auto" w:line="276" w:after="120"/>
+              <w:jc w:val="both"/>
+            </w:pPr>
             <w:r/>
             <w:r>
               <w:rPr>
                 <w:rFonts w:ascii="Times New Roman" w:hAnsi="Times New Roman" w:eastAsia="Times New Roman"/>
                 <w:b w:val="0"/>
                 <w:i w:val="0"/>
-                <w:sz w:val="24"/>
+                <w:sz w:val="22"/>
               </w:rPr>
               <w:t>Прогноз ФВ ЛЖ</w:t>
             </w:r>
@@ -489,16 +589,20 @@
         </w:tc>
         <w:tc>
           <w:tcPr>
-            <w:tcW w:type="dxa" w:w="3230"/>
+            <w:tcW w:type="dxa" w:w="3041"/>
           </w:tcPr>
           <w:p>
+            <w:pPr>
+              <w:spacing w:lineRule="auto" w:line="276" w:after="120"/>
+              <w:jc w:val="both"/>
+            </w:pPr>
             <w:r/>
             <w:r>
               <w:rPr>
                 <w:rFonts w:ascii="Times New Roman" w:hAnsi="Times New Roman" w:eastAsia="Times New Roman"/>
                 <w:b w:val="0"/>
                 <w:i w:val="0"/>
-                <w:sz w:val="24"/>
+                <w:sz w:val="22"/>
               </w:rPr>
               <w:t>http://ikorsakov.tech:9999</w:t>
             </w:r>
@@ -506,16 +610,20 @@
         </w:tc>
         <w:tc>
           <w:tcPr>
-            <w:tcW w:type="dxa" w:w="3230"/>
+            <w:tcW w:type="dxa" w:w="3041"/>
           </w:tcPr>
           <w:p>
+            <w:pPr>
+              <w:spacing w:lineRule="auto" w:line="276" w:after="120"/>
+              <w:jc w:val="both"/>
+            </w:pPr>
             <w:r/>
             <w:r>
               <w:rPr>
                 <w:rFonts w:ascii="Times New Roman" w:hAnsi="Times New Roman" w:eastAsia="Times New Roman"/>
                 <w:b w:val="0"/>
                 <w:i w:val="0"/>
-                <w:sz w:val="24"/>
+                <w:sz w:val="22"/>
               </w:rPr>
               <w:t>Кардиологи, терапевты, врачи УЗ-диагностики</w:t>
             </w:r>
@@ -541,6 +649,10 @@
       </w:r>
     </w:p>
     <w:p>
+      <w:pPr>
+        <w:spacing w:lineRule="auto" w:line="276" w:after="120"/>
+        <w:jc w:val="both"/>
+      </w:pPr>
       <w:r>
         <w:rPr>
           <w:rFonts w:ascii="Times New Roman" w:hAnsi="Times New Roman" w:eastAsia="Times New Roman"/>
@@ -560,6 +672,10 @@
       </w:r>
     </w:p>
     <w:p>
+      <w:pPr>
+        <w:spacing w:lineRule="auto" w:line="276" w:after="120"/>
+        <w:jc w:val="both"/>
+      </w:pPr>
       <w:r>
         <w:rPr>
           <w:rFonts w:ascii="Times New Roman" w:hAnsi="Times New Roman" w:eastAsia="Times New Roman"/>
@@ -589,6 +705,10 @@
       </w:r>
     </w:p>
     <w:p>
+      <w:pPr>
+        <w:spacing w:lineRule="auto" w:line="276" w:after="120"/>
+        <w:jc w:val="both"/>
+      </w:pPr>
       <w:r>
         <w:rPr>
           <w:rFonts w:ascii="Times New Roman" w:hAnsi="Times New Roman" w:eastAsia="Times New Roman"/>
@@ -600,6 +720,10 @@
       </w:r>
     </w:p>
     <w:p>
+      <w:pPr>
+        <w:spacing w:lineRule="auto" w:line="276" w:after="120"/>
+        <w:jc w:val="both"/>
+      </w:pPr>
       <w:r>
         <w:rPr>
           <w:rFonts w:ascii="Times New Roman" w:hAnsi="Times New Roman" w:eastAsia="Times New Roman"/>
@@ -647,6 +771,10 @@
       </w:r>
     </w:p>
     <w:p>
+      <w:pPr>
+        <w:spacing w:lineRule="auto" w:line="276" w:after="120"/>
+        <w:jc w:val="both"/>
+      </w:pPr>
       <w:r>
         <w:rPr>
           <w:rFonts w:ascii="Times New Roman" w:hAnsi="Times New Roman" w:eastAsia="Times New Roman"/>
@@ -694,6 +822,10 @@
       </w:r>
     </w:p>
     <w:p>
+      <w:pPr>
+        <w:spacing w:lineRule="auto" w:line="276" w:after="120"/>
+        <w:jc w:val="both"/>
+      </w:pPr>
       <w:r>
         <w:rPr>
           <w:rFonts w:ascii="Times New Roman" w:hAnsi="Times New Roman" w:eastAsia="Times New Roman"/>
@@ -777,6 +909,10 @@
       </w:r>
     </w:p>
     <w:p>
+      <w:pPr>
+        <w:spacing w:lineRule="auto" w:line="276" w:after="120"/>
+        <w:jc w:val="both"/>
+      </w:pPr>
       <w:r>
         <w:rPr>
           <w:rFonts w:ascii="Times New Roman" w:hAnsi="Times New Roman" w:eastAsia="Times New Roman"/>
@@ -814,6 +950,10 @@
       </w:r>
     </w:p>
     <w:p>
+      <w:pPr>
+        <w:spacing w:lineRule="auto" w:line="276" w:after="120"/>
+        <w:jc w:val="both"/>
+      </w:pPr>
       <w:r>
         <w:rPr>
           <w:rFonts w:ascii="Times New Roman" w:hAnsi="Times New Roman" w:eastAsia="Times New Roman"/>
@@ -843,6 +983,10 @@
       </w:r>
     </w:p>
     <w:p>
+      <w:pPr>
+        <w:spacing w:lineRule="auto" w:line="276" w:after="120"/>
+        <w:jc w:val="both"/>
+      </w:pPr>
       <w:r>
         <w:rPr>
           <w:rFonts w:ascii="Times New Roman" w:hAnsi="Times New Roman" w:eastAsia="Times New Roman"/>
@@ -879,6 +1023,10 @@
       </w:r>
     </w:p>
     <w:p>
+      <w:pPr>
+        <w:spacing w:lineRule="auto" w:line="276" w:after="120"/>
+        <w:jc w:val="both"/>
+      </w:pPr>
       <w:r>
         <w:rPr>
           <w:rFonts w:ascii="Times New Roman" w:hAnsi="Times New Roman" w:eastAsia="Times New Roman"/>
@@ -916,6 +1064,10 @@
       </w:r>
     </w:p>
     <w:p>
+      <w:pPr>
+        <w:spacing w:lineRule="auto" w:line="276" w:after="120"/>
+        <w:jc w:val="both"/>
+      </w:pPr>
       <w:r>
         <w:rPr>
           <w:rFonts w:ascii="Times New Roman" w:hAnsi="Times New Roman" w:eastAsia="Times New Roman"/>
@@ -981,6 +1133,10 @@
       </w:r>
     </w:p>
     <w:p>
+      <w:pPr>
+        <w:spacing w:lineRule="auto" w:line="276" w:after="120"/>
+        <w:jc w:val="both"/>
+      </w:pPr>
       <w:r>
         <w:rPr>
           <w:rFonts w:ascii="Times New Roman" w:hAnsi="Times New Roman" w:eastAsia="Times New Roman"/>
@@ -1028,6 +1184,10 @@
       </w:r>
     </w:p>
     <w:p>
+      <w:pPr>
+        <w:spacing w:lineRule="auto" w:line="276" w:after="120"/>
+        <w:jc w:val="both"/>
+      </w:pPr>
       <w:r>
         <w:rPr>
           <w:rFonts w:ascii="Times New Roman" w:hAnsi="Times New Roman" w:eastAsia="Times New Roman"/>
@@ -1065,6 +1225,10 @@
       </w:r>
     </w:p>
     <w:p>
+      <w:pPr>
+        <w:spacing w:lineRule="auto" w:line="276" w:after="120"/>
+        <w:jc w:val="both"/>
+      </w:pPr>
       <w:r>
         <w:rPr>
           <w:rFonts w:ascii="Times New Roman" w:hAnsi="Times New Roman" w:eastAsia="Times New Roman"/>
@@ -1094,6 +1258,10 @@
       </w:r>
     </w:p>
     <w:p>
+      <w:pPr>
+        <w:spacing w:lineRule="auto" w:line="276" w:after="120"/>
+        <w:jc w:val="both"/>
+      </w:pPr>
       <w:r>
         <w:rPr>
           <w:rFonts w:ascii="Times New Roman" w:hAnsi="Times New Roman" w:eastAsia="Times New Roman"/>
@@ -1130,6 +1298,10 @@
       </w:r>
     </w:p>
     <w:p>
+      <w:pPr>
+        <w:spacing w:lineRule="auto" w:line="276" w:after="120"/>
+        <w:jc w:val="both"/>
+      </w:pPr>
       <w:r>
         <w:rPr>
           <w:rFonts w:ascii="Times New Roman" w:hAnsi="Times New Roman" w:eastAsia="Times New Roman"/>
@@ -1185,6 +1357,10 @@
       </w:r>
     </w:p>
     <w:p>
+      <w:pPr>
+        <w:spacing w:lineRule="auto" w:line="276" w:after="120"/>
+        <w:jc w:val="both"/>
+      </w:pPr>
       <w:r>
         <w:rPr>
           <w:rFonts w:ascii="Times New Roman" w:hAnsi="Times New Roman" w:eastAsia="Times New Roman"/>
@@ -1306,6 +1482,10 @@
       </w:r>
     </w:p>
     <w:p>
+      <w:pPr>
+        <w:spacing w:lineRule="auto" w:line="276" w:after="120"/>
+        <w:jc w:val="both"/>
+      </w:pPr>
       <w:r>
         <w:rPr>
           <w:rFonts w:ascii="Times New Roman" w:hAnsi="Times New Roman" w:eastAsia="Times New Roman"/>
@@ -1353,6 +1533,10 @@
       </w:r>
     </w:p>
     <w:p>
+      <w:pPr>
+        <w:spacing w:lineRule="auto" w:line="276" w:after="120"/>
+        <w:jc w:val="both"/>
+      </w:pPr>
       <w:r>
         <w:rPr>
           <w:rFonts w:ascii="Times New Roman" w:hAnsi="Times New Roman" w:eastAsia="Times New Roman"/>
@@ -1372,6 +1556,10 @@
       </w:r>
     </w:p>
     <w:p>
+      <w:pPr>
+        <w:spacing w:lineRule="auto" w:line="276" w:after="120"/>
+        <w:jc w:val="both"/>
+      </w:pPr>
       <w:r>
         <w:rPr>
           <w:rFonts w:ascii="Times New Roman" w:hAnsi="Times New Roman" w:eastAsia="Times New Roman"/>
@@ -1401,6 +1589,10 @@
       </w:r>
     </w:p>
     <w:p>
+      <w:pPr>
+        <w:spacing w:lineRule="auto" w:line="276" w:after="120"/>
+        <w:jc w:val="both"/>
+      </w:pPr>
       <w:r>
         <w:rPr>
           <w:rFonts w:ascii="Times New Roman" w:hAnsi="Times New Roman" w:eastAsia="Times New Roman"/>
@@ -1437,6 +1629,10 @@
       </w:r>
     </w:p>
     <w:p>
+      <w:pPr>
+        <w:spacing w:lineRule="auto" w:line="276" w:after="120"/>
+        <w:jc w:val="both"/>
+      </w:pPr>
       <w:r>
         <w:rPr>
           <w:rFonts w:ascii="Times New Roman" w:hAnsi="Times New Roman" w:eastAsia="Times New Roman"/>
@@ -1474,6 +1670,10 @@
       </w:r>
     </w:p>
     <w:p>
+      <w:pPr>
+        <w:spacing w:lineRule="auto" w:line="276" w:after="120"/>
+        <w:jc w:val="both"/>
+      </w:pPr>
       <w:r>
         <w:rPr>
           <w:rFonts w:ascii="Times New Roman" w:hAnsi="Times New Roman" w:eastAsia="Times New Roman"/>
@@ -1503,6 +1703,10 @@
       </w:r>
     </w:p>
     <w:p>
+      <w:pPr>
+        <w:spacing w:lineRule="auto" w:line="276" w:after="120"/>
+        <w:jc w:val="both"/>
+      </w:pPr>
       <w:r>
         <w:rPr>
           <w:rFonts w:ascii="Times New Roman" w:hAnsi="Times New Roman" w:eastAsia="Times New Roman"/>
@@ -1595,6 +1799,10 @@
       </w:r>
     </w:p>
     <w:p>
+      <w:pPr>
+        <w:spacing w:lineRule="auto" w:line="276" w:after="120"/>
+        <w:jc w:val="both"/>
+      </w:pPr>
       <w:r>
         <w:rPr>
           <w:rFonts w:ascii="Times New Roman" w:hAnsi="Times New Roman" w:eastAsia="Times New Roman"/>
@@ -1615,6 +1823,10 @@
       </w:r>
     </w:p>
     <w:p>
+      <w:pPr>
+        <w:spacing w:lineRule="auto" w:line="276" w:after="120"/>
+        <w:jc w:val="both"/>
+      </w:pPr>
       <w:r>
         <w:rPr>
           <w:rFonts w:ascii="Times New Roman" w:hAnsi="Times New Roman" w:eastAsia="Times New Roman"/>
@@ -1670,6 +1882,10 @@
       </w:r>
     </w:p>
     <w:p>
+      <w:pPr>
+        <w:spacing w:lineRule="auto" w:line="276" w:after="120"/>
+        <w:jc w:val="both"/>
+      </w:pPr>
       <w:r>
         <w:rPr>
           <w:rFonts w:ascii="Times New Roman" w:hAnsi="Times New Roman" w:eastAsia="Times New Roman"/>
@@ -1699,6 +1915,10 @@
       </w:r>
     </w:p>
     <w:p>
+      <w:pPr>
+        <w:spacing w:lineRule="auto" w:line="276" w:after="120"/>
+        <w:jc w:val="both"/>
+      </w:pPr>
       <w:r>
         <w:rPr>
           <w:rFonts w:ascii="Times New Roman" w:hAnsi="Times New Roman" w:eastAsia="Times New Roman"/>
@@ -1727,6 +1947,10 @@
       </w:r>
     </w:p>
     <w:p>
+      <w:pPr>
+        <w:spacing w:lineRule="auto" w:line="276" w:after="120"/>
+        <w:jc w:val="both"/>
+      </w:pPr>
       <w:r>
         <w:rPr>
           <w:rFonts w:ascii="Times New Roman" w:hAnsi="Times New Roman" w:eastAsia="Times New Roman"/>
@@ -1792,6 +2016,10 @@
       </w:r>
     </w:p>
     <w:p>
+      <w:pPr>
+        <w:spacing w:lineRule="auto" w:line="276" w:after="120"/>
+        <w:jc w:val="both"/>
+      </w:pPr>
       <w:r>
         <w:rPr>
           <w:rFonts w:ascii="Times New Roman" w:hAnsi="Times New Roman" w:eastAsia="Times New Roman"/>
@@ -1873,6 +2101,10 @@
       </w:r>
     </w:p>
     <w:p>
+      <w:pPr>
+        <w:spacing w:lineRule="auto" w:line="276" w:after="120"/>
+        <w:jc w:val="both"/>
+      </w:pPr>
       <w:r>
         <w:rPr>
           <w:rFonts w:ascii="Times New Roman" w:hAnsi="Times New Roman" w:eastAsia="Times New Roman"/>
@@ -1913,25 +2145,30 @@
       <w:tblPr>
         <w:tblStyle w:val="TableGrid"/>
         <w:tblW w:type="auto" w:w="0"/>
+        <w:tblLayout w:type="fixed"/>
         <w:tblLook w:firstColumn="1" w:firstRow="1" w:lastColumn="0" w:lastRow="0" w:noHBand="0" w:noVBand="1" w:val="04A0"/>
       </w:tblPr>
       <w:tblGrid>
-        <w:gridCol w:w="4844"/>
-        <w:gridCol w:w="4844"/>
+        <w:gridCol w:w="3175"/>
+        <w:gridCol w:w="5896"/>
       </w:tblGrid>
       <w:tr>
         <w:tc>
           <w:tcPr>
-            <w:tcW w:type="dxa" w:w="4844"/>
+            <w:tcW w:type="dxa" w:w="4561"/>
           </w:tcPr>
           <w:p>
+            <w:pPr>
+              <w:spacing w:lineRule="auto" w:line="276" w:after="120"/>
+              <w:jc w:val="both"/>
+            </w:pPr>
             <w:r/>
             <w:r>
               <w:rPr>
                 <w:rFonts w:ascii="Times New Roman" w:hAnsi="Times New Roman" w:eastAsia="Times New Roman"/>
                 <w:b/>
                 <w:i w:val="0"/>
-                <w:sz w:val="24"/>
+                <w:sz w:val="22"/>
               </w:rPr>
               <w:t>Направление</w:t>
             </w:r>
@@ -1939,16 +2176,20 @@
         </w:tc>
         <w:tc>
           <w:tcPr>
-            <w:tcW w:type="dxa" w:w="4844"/>
+            <w:tcW w:type="dxa" w:w="4561"/>
           </w:tcPr>
           <w:p>
+            <w:pPr>
+              <w:spacing w:lineRule="auto" w:line="276" w:after="120"/>
+              <w:jc w:val="both"/>
+            </w:pPr>
             <w:r/>
             <w:r>
               <w:rPr>
                 <w:rFonts w:ascii="Times New Roman" w:hAnsi="Times New Roman" w:eastAsia="Times New Roman"/>
                 <w:b/>
                 <w:i w:val="0"/>
-                <w:sz w:val="24"/>
+                <w:sz w:val="22"/>
               </w:rPr>
               <w:t>Задача</w:t>
             </w:r>
@@ -1958,16 +2199,20 @@
       <w:tr>
         <w:tc>
           <w:tcPr>
-            <w:tcW w:type="dxa" w:w="4844"/>
+            <w:tcW w:type="dxa" w:w="4561"/>
           </w:tcPr>
           <w:p>
+            <w:pPr>
+              <w:spacing w:lineRule="auto" w:line="276" w:after="120"/>
+              <w:jc w:val="both"/>
+            </w:pPr>
             <w:r/>
             <w:r>
               <w:rPr>
                 <w:rFonts w:ascii="Times New Roman" w:hAnsi="Times New Roman" w:eastAsia="Times New Roman"/>
                 <w:b w:val="0"/>
                 <w:i w:val="0"/>
-                <w:sz w:val="24"/>
+                <w:sz w:val="22"/>
               </w:rPr>
               <w:t>Анамнез эндокринолога</w:t>
             </w:r>
@@ -1975,16 +2220,20 @@
         </w:tc>
         <w:tc>
           <w:tcPr>
-            <w:tcW w:type="dxa" w:w="4844"/>
+            <w:tcW w:type="dxa" w:w="4561"/>
           </w:tcPr>
           <w:p>
+            <w:pPr>
+              <w:spacing w:lineRule="auto" w:line="276" w:after="120"/>
+              <w:jc w:val="both"/>
+            </w:pPr>
             <w:r/>
             <w:r>
               <w:rPr>
                 <w:rFonts w:ascii="Times New Roman" w:hAnsi="Times New Roman" w:eastAsia="Times New Roman"/>
                 <w:b w:val="0"/>
                 <w:i w:val="0"/>
-                <w:sz w:val="24"/>
+                <w:sz w:val="22"/>
               </w:rPr>
               <w:t>QR-коды в клинике, интеграция с МИС, соответствие требованиям по защите персональных данных</w:t>
             </w:r>
@@ -1994,16 +2243,20 @@
       <w:tr>
         <w:tc>
           <w:tcPr>
-            <w:tcW w:type="dxa" w:w="4844"/>
+            <w:tcW w:type="dxa" w:w="4561"/>
           </w:tcPr>
           <w:p>
+            <w:pPr>
+              <w:spacing w:lineRule="auto" w:line="276" w:after="120"/>
+              <w:jc w:val="both"/>
+            </w:pPr>
             <w:r/>
             <w:r>
               <w:rPr>
                 <w:rFonts w:ascii="Times New Roman" w:hAnsi="Times New Roman" w:eastAsia="Times New Roman"/>
                 <w:b w:val="0"/>
                 <w:i w:val="0"/>
-                <w:sz w:val="24"/>
+                <w:sz w:val="22"/>
               </w:rPr>
               <w:t>MD Choice</w:t>
             </w:r>
@@ -2011,16 +2264,20 @@
         </w:tc>
         <w:tc>
           <w:tcPr>
-            <w:tcW w:type="dxa" w:w="4844"/>
+            <w:tcW w:type="dxa" w:w="4561"/>
           </w:tcPr>
           <w:p>
+            <w:pPr>
+              <w:spacing w:lineRule="auto" w:line="276" w:after="120"/>
+              <w:jc w:val="both"/>
+            </w:pPr>
             <w:r/>
             <w:r>
               <w:rPr>
                 <w:rFonts w:ascii="Times New Roman" w:hAnsi="Times New Roman" w:eastAsia="Times New Roman"/>
                 <w:b w:val="0"/>
                 <w:i w:val="0"/>
-                <w:sz w:val="24"/>
+                <w:sz w:val="22"/>
               </w:rPr>
               <w:t>Обучение модели на реальных обезличенных клинических данных, связка с анамнезом</w:t>
             </w:r>
@@ -2030,16 +2287,20 @@
       <w:tr>
         <w:tc>
           <w:tcPr>
-            <w:tcW w:type="dxa" w:w="4844"/>
+            <w:tcW w:type="dxa" w:w="4561"/>
           </w:tcPr>
           <w:p>
+            <w:pPr>
+              <w:spacing w:lineRule="auto" w:line="276" w:after="120"/>
+              <w:jc w:val="both"/>
+            </w:pPr>
             <w:r/>
             <w:r>
               <w:rPr>
                 <w:rFonts w:ascii="Times New Roman" w:hAnsi="Times New Roman" w:eastAsia="Times New Roman"/>
                 <w:b w:val="0"/>
                 <w:i w:val="0"/>
-                <w:sz w:val="24"/>
+                <w:sz w:val="22"/>
               </w:rPr>
               <w:t>Калькулятор КИ</w:t>
             </w:r>
@@ -2047,16 +2308,20 @@
         </w:tc>
         <w:tc>
           <w:tcPr>
-            <w:tcW w:type="dxa" w:w="4844"/>
+            <w:tcW w:type="dxa" w:w="4561"/>
           </w:tcPr>
           <w:p>
+            <w:pPr>
+              <w:spacing w:lineRule="auto" w:line="276" w:after="120"/>
+              <w:jc w:val="both"/>
+            </w:pPr>
             <w:r/>
             <w:r>
               <w:rPr>
                 <w:rFonts w:ascii="Times New Roman" w:hAnsi="Times New Roman" w:eastAsia="Times New Roman"/>
                 <w:b w:val="0"/>
                 <w:i w:val="0"/>
-                <w:sz w:val="24"/>
+                <w:sz w:val="22"/>
               </w:rPr>
               <w:t>Парные дизайны, кластерная рандомизация, многоцентровые исследования</w:t>
             </w:r>
@@ -2066,16 +2331,20 @@
       <w:tr>
         <w:tc>
           <w:tcPr>
-            <w:tcW w:type="dxa" w:w="4844"/>
+            <w:tcW w:type="dxa" w:w="4561"/>
           </w:tcPr>
           <w:p>
+            <w:pPr>
+              <w:spacing w:lineRule="auto" w:line="276" w:after="120"/>
+              <w:jc w:val="both"/>
+            </w:pPr>
             <w:r/>
             <w:r>
               <w:rPr>
                 <w:rFonts w:ascii="Times New Roman" w:hAnsi="Times New Roman" w:eastAsia="Times New Roman"/>
                 <w:b w:val="0"/>
                 <w:i w:val="0"/>
-                <w:sz w:val="24"/>
+                <w:sz w:val="22"/>
               </w:rPr>
               <w:t>Прогноз ФВ ЛЖ</w:t>
             </w:r>
@@ -2083,16 +2352,20 @@
         </w:tc>
         <w:tc>
           <w:tcPr>
-            <w:tcW w:type="dxa" w:w="4844"/>
+            <w:tcW w:type="dxa" w:w="4561"/>
           </w:tcPr>
           <w:p>
+            <w:pPr>
+              <w:spacing w:lineRule="auto" w:line="276" w:after="120"/>
+              <w:jc w:val="both"/>
+            </w:pPr>
             <w:r/>
             <w:r>
               <w:rPr>
                 <w:rFonts w:ascii="Times New Roman" w:hAnsi="Times New Roman" w:eastAsia="Times New Roman"/>
                 <w:b w:val="0"/>
                 <w:i w:val="0"/>
-                <w:sz w:val="24"/>
+                <w:sz w:val="22"/>
               </w:rPr>
               <w:t>Углублённые ML-модели, архив расчётов для аудита</w:t>
             </w:r>
@@ -2102,16 +2375,20 @@
       <w:tr>
         <w:tc>
           <w:tcPr>
-            <w:tcW w:type="dxa" w:w="4844"/>
+            <w:tcW w:type="dxa" w:w="4561"/>
           </w:tcPr>
           <w:p>
+            <w:pPr>
+              <w:spacing w:lineRule="auto" w:line="276" w:after="120"/>
+              <w:jc w:val="both"/>
+            </w:pPr>
             <w:r/>
             <w:r>
               <w:rPr>
                 <w:rFonts w:ascii="Times New Roman" w:hAnsi="Times New Roman" w:eastAsia="Times New Roman"/>
                 <w:b w:val="0"/>
                 <w:i w:val="0"/>
-                <w:sz w:val="24"/>
+                <w:sz w:val="22"/>
               </w:rPr>
               <w:t>Общее</w:t>
             </w:r>
@@ -2119,16 +2396,20 @@
         </w:tc>
         <w:tc>
           <w:tcPr>
-            <w:tcW w:type="dxa" w:w="4844"/>
+            <w:tcW w:type="dxa" w:w="4561"/>
           </w:tcPr>
           <w:p>
+            <w:pPr>
+              <w:spacing w:lineRule="auto" w:line="276" w:after="120"/>
+              <w:jc w:val="both"/>
+            </w:pPr>
             <w:r/>
             <w:r>
               <w:rPr>
                 <w:rFonts w:ascii="Times New Roman" w:hAnsi="Times New Roman" w:eastAsia="Times New Roman"/>
                 <w:b w:val="0"/>
                 <w:i w:val="0"/>
-                <w:sz w:val="24"/>
+                <w:sz w:val="22"/>
               </w:rPr>
               <w:t>Единый портал медицинских сервисов ikorsakov.tech</w:t>
             </w:r>
@@ -2146,6 +2427,10 @@
       </w:r>
     </w:p>
     <w:p>
+      <w:pPr>
+        <w:spacing w:lineRule="auto" w:line="276" w:after="120"/>
+        <w:jc w:val="both"/>
+      </w:pPr>
       <w:r>
         <w:rPr>
           <w:rFonts w:ascii="Times New Roman" w:hAnsi="Times New Roman" w:eastAsia="Times New Roman"/>
@@ -2202,21 +2487,23 @@
     </w:p>
     <w:p>
       <w:pPr>
-        <w:ind w:left="567"/>
+        <w:spacing w:lineRule="auto" w:line="276" w:after="120"/>
+        <w:ind w:left="567" w:right="283"/>
+        <w:jc w:val="both"/>
       </w:pPr>
       <w:r>
         <w:rPr>
           <w:rFonts w:ascii="Times New Roman" w:hAnsi="Times New Roman" w:eastAsia="Times New Roman"/>
           <w:b w:val="0"/>
           <w:i/>
-          <w:sz w:val="24"/>
+          <w:sz w:val="22"/>
         </w:rPr>
         <w:t>С начала 2026 года старший научный сотрудник Научно-исследовательской лаборатории компьютерного моделирования и искусственного интеллекта (НИЦ развития ИИ в медицине) Корсаков И.Н. выполнил комплекс работ по разработке и внедрению четырёх цифровых медицинских сервисов, ориентированных на нужды врачебной практики и клинических исследований: предприёмный сбор эндокринологического анамнеза с кабинетом врача и уведомлениями (anamnes.ikorsakov.tech); систему поддержки принятия решений MD Choice для прогнозирования выбора препарата при сахарном диабете 2 типа на основе машинного обучения (ikorsakov.tech:7777); калькулятор расчёта выборки для клинических испытаний (ikorsakov.tech:8080); сервис прогнозирования фракции выброса левого желудочка (ikorsakov.tech:9999). Разработанные инструменты сокращают время подготовки к приёму, повышают полноту клинических данных, поддерживают врача при выборе терапии и планировании исследований. Сервисы развёрнуты на сервере, снабжены документацией и готовы к пилотному использованию.</w:t>
       </w:r>
     </w:p>
     <w:sectPr>
       <w:pgSz w:w="12240" w:h="15840"/>
-      <w:pgMar w:top="1134" w:right="1134" w:bottom="1134" w:left="1417" w:header="720" w:footer="720" w:gutter="0"/>
+      <w:pgMar w:top="1134" w:right="1417" w:bottom="1134" w:left="1701" w:header="720" w:footer="720" w:gutter="0"/>
       <w:cols w:space="720"/>
       <w:docGrid w:linePitch="360"/>
     </w:sectPr>
@@ -2651,7 +2938,7 @@
       <w:outlineLvl w:val="0"/>
     </w:pPr>
     <w:rPr>
-      <w:rFonts w:asciiTheme="majorHAnsi" w:eastAsiaTheme="majorEastAsia" w:hAnsiTheme="majorHAnsi" w:cstheme="majorBidi"/>
+      <w:rFonts w:asciiTheme="majorHAnsi" w:eastAsiaTheme="majorEastAsia" w:hAnsiTheme="majorHAnsi" w:cstheme="majorBidi" w:ascii="Times New Roman" w:hAnsi="Times New Roman"/>
       <w:b/>
       <w:bCs/>
       <w:color w:val="365F91" w:themeColor="accent1" w:themeShade="BF"/>
@@ -2675,7 +2962,7 @@
       <w:outlineLvl w:val="1"/>
     </w:pPr>
     <w:rPr>
-      <w:rFonts w:asciiTheme="majorHAnsi" w:eastAsiaTheme="majorEastAsia" w:hAnsiTheme="majorHAnsi" w:cstheme="majorBidi"/>
+      <w:rFonts w:asciiTheme="majorHAnsi" w:eastAsiaTheme="majorEastAsia" w:hAnsiTheme="majorHAnsi" w:cstheme="majorBidi" w:ascii="Times New Roman" w:hAnsi="Times New Roman"/>
       <w:b/>
       <w:bCs/>
       <w:color w:val="4F81BD" w:themeColor="accent1"/>
@@ -2699,7 +2986,7 @@
       <w:outlineLvl w:val="2"/>
     </w:pPr>
     <w:rPr>
-      <w:rFonts w:asciiTheme="majorHAnsi" w:eastAsiaTheme="majorEastAsia" w:hAnsiTheme="majorHAnsi" w:cstheme="majorBidi"/>
+      <w:rFonts w:asciiTheme="majorHAnsi" w:eastAsiaTheme="majorEastAsia" w:hAnsiTheme="majorHAnsi" w:cstheme="majorBidi" w:ascii="Times New Roman" w:hAnsi="Times New Roman"/>
       <w:b/>
       <w:bCs/>
       <w:color w:val="4F81BD" w:themeColor="accent1"/>

</xml_diff>

<commit_message>
Clarify wording about urgent symptoms in medical report.
Co-authored-by: Igor N Korsakov <igor.korsa@gmail.com>
</commit_message>
<xml_diff>
--- a/docs/MEDICAL_REPORT_2026.docx
+++ b/docs/MEDICAL_REPORT_2026.docx
@@ -800,7 +800,7 @@
           <w:i w:val="0"/>
           <w:sz w:val="24"/>
         </w:rPr>
-        <w:t xml:space="preserve">: хронические заболевания, аллергии, семейный анамнез, постоянная терапия с уточнением дозировок, расчёт индекса массы тела, выявление потенциально срочных симптомов («красные флаги»). Пациент может приложить </w:t>
+        <w:t xml:space="preserve">: хронические заболевания, аллергии, семейный анамнез, постоянная терапия с уточнением дозировок, расчёт индекса массы тела, опрос о симптомах, которые могут указывать на необходимость срочного обращения за медицинской помощью. Пациент может приложить </w:t>
       </w:r>
       <w:r>
         <w:rPr>
@@ -979,7 +979,7 @@
           <w:i w:val="0"/>
           <w:sz w:val="24"/>
         </w:rPr>
-        <w:t xml:space="preserve"> с выделением срочных находок, видит прикреплённые документы и может сосредоточиться на клиническом анализе и принятии решений, а не на первичном опросе. Это особенно ценно при высокой потоковости кабинета, ведении нескольких врачей в одной клинике и при дистанционной подготовке пациента к очной консультации.</w:t>
+        <w:t xml:space="preserve"> с отдельной пометкой симптомов, которые могут требовать неотложной оценки, видит прикреплённые документы и может сосредоточиться на клиническом анализе и принятии решений, а не на первичном опросе. Это особенно ценно при высокой потоковости кабинета, ведении нескольких врачей в одной клинике и при дистанционной подготовке пациента к очной консультации.</w:t>
       </w:r>
     </w:p>
     <w:p>

</xml_diff>

<commit_message>
Retitle report and shorten introduction per user feedback.
Co-authored-by: Igor N Korsakov <igor.korsa@gmail.com>
</commit_message>
<xml_diff>
--- a/docs/MEDICAL_REPORT_2026.docx
+++ b/docs/MEDICAL_REPORT_2026.docx
@@ -13,15 +13,7 @@
           <w:i w:val="0"/>
           <w:sz w:val="32"/>
         </w:rPr>
-        <w:t>Отчёт по медицинской деятельности - 2026</w:t>
-      </w:r>
-    </w:p>
-    <w:p>
-      <w:pPr>
-        <w:pStyle w:val="Heading1"/>
-      </w:pPr>
-      <w:r>
-        <w:t>Отчёт по медицинской деятельности с начала 2026 года</w:t>
+        <w:t>Отчёт о проделанной работе</w:t>
       </w:r>
     </w:p>
     <w:p>
@@ -164,58 +156,7 @@
         <w:pStyle w:val="Heading2"/>
       </w:pPr>
       <w:r>
-        <w:t>1. Введение и актуальность</w:t>
-      </w:r>
-    </w:p>
-    <w:p>
-      <w:pPr>
-        <w:spacing w:lineRule="auto" w:line="276" w:after="120"/>
-        <w:jc w:val="both"/>
-      </w:pPr>
-      <w:r>
-        <w:rPr>
-          <w:rFonts w:ascii="Times New Roman" w:hAnsi="Times New Roman" w:eastAsia="Times New Roman"/>
-          <w:b w:val="0"/>
-          <w:i w:val="0"/>
-          <w:sz w:val="24"/>
-        </w:rPr>
-        <w:t xml:space="preserve">В начале 2026 года в рамках деятельности </w:t>
-      </w:r>
-      <w:r>
-        <w:rPr>
-          <w:rFonts w:ascii="Times New Roman" w:hAnsi="Times New Roman" w:eastAsia="Times New Roman"/>
-          <w:b/>
-          <w:i w:val="0"/>
-          <w:sz w:val="24"/>
-        </w:rPr>
-        <w:t>Научно-исследовательской лаборатории компьютерного моделирования и искусственного интеллекта</w:t>
-      </w:r>
-      <w:r>
-        <w:rPr>
-          <w:rFonts w:ascii="Times New Roman" w:hAnsi="Times New Roman" w:eastAsia="Times New Roman"/>
-          <w:b w:val="0"/>
-          <w:i w:val="0"/>
-          <w:sz w:val="24"/>
-        </w:rPr>
-        <w:t xml:space="preserve"> (НИЦ развития искусственного интеллекта в медицине) была развёрнута программа создания </w:t>
-      </w:r>
-      <w:r>
-        <w:rPr>
-          <w:rFonts w:ascii="Times New Roman" w:hAnsi="Times New Roman" w:eastAsia="Times New Roman"/>
-          <w:b/>
-          <w:i w:val="0"/>
-          <w:sz w:val="24"/>
-        </w:rPr>
-        <w:t>практико-ориентированных цифровых инструментов</w:t>
-      </w:r>
-      <w:r>
-        <w:rPr>
-          <w:rFonts w:ascii="Times New Roman" w:hAnsi="Times New Roman" w:eastAsia="Times New Roman"/>
-          <w:b w:val="0"/>
-          <w:i w:val="0"/>
-          <w:sz w:val="24"/>
-        </w:rPr>
-        <w:t xml:space="preserve"> для врачей и исследователей. Задача состояла не в разработке абстрактного программного обеспечения, а в решении конкретных ежедневных проблем медицинской практики: неполный анамнез к моменту приёма, затраты времени врача на рутинный сбор данных, необходимость быстрой клинико-статистической поддержки при планировании исследований и принятии терапевтических решений.</w:t>
+        <w:t>1. Введение</w:t>
       </w:r>
     </w:p>
     <w:p>

</xml_diff>

<commit_message>
Remove section 9 (memo wording) from medical report.
Co-authored-by: Igor N Korsakov <igor.korsa@gmail.com>
</commit_message>
<xml_diff>
--- a/docs/MEDICAL_REPORT_2026.docx
+++ b/docs/MEDICAL_REPORT_2026.docx
@@ -2418,30 +2418,6 @@
         <w:t>.</w:t>
       </w:r>
     </w:p>
-    <w:p>
-      <w:pPr>
-        <w:pStyle w:val="Heading2"/>
-      </w:pPr>
-      <w:r>
-        <w:t>9. Формулировка для служебной записки</w:t>
-      </w:r>
-    </w:p>
-    <w:p>
-      <w:pPr>
-        <w:spacing w:lineRule="auto" w:line="276" w:after="120"/>
-        <w:ind w:left="567" w:right="283"/>
-        <w:jc w:val="both"/>
-      </w:pPr>
-      <w:r>
-        <w:rPr>
-          <w:rFonts w:ascii="Times New Roman" w:hAnsi="Times New Roman" w:eastAsia="Times New Roman"/>
-          <w:b w:val="0"/>
-          <w:i/>
-          <w:sz w:val="22"/>
-        </w:rPr>
-        <w:t>С начала 2026 года старший научный сотрудник Научно-исследовательской лаборатории компьютерного моделирования и искусственного интеллекта (НИЦ развития ИИ в медицине) Корсаков И.Н. выполнил комплекс работ по разработке и внедрению четырёх цифровых медицинских сервисов, ориентированных на нужды врачебной практики и клинических исследований: предприёмный сбор эндокринологического анамнеза с кабинетом врача и уведомлениями (anamnes.ikorsakov.tech); систему поддержки принятия решений MD Choice для прогнозирования выбора препарата при сахарном диабете 2 типа на основе машинного обучения (ikorsakov.tech:7777); калькулятор расчёта выборки для клинических испытаний (ikorsakov.tech:8080); сервис прогнозирования фракции выброса левого желудочка (ikorsakov.tech:9999). Разработанные инструменты сокращают время подготовки к приёму, повышают полноту клинических данных, поддерживают врача при выборе терапии и планировании исследований. Сервисы развёрнуты на сервере, снабжены документацией и готовы к пилотному использованию.</w:t>
-      </w:r>
-    </w:p>
     <w:sectPr>
       <w:pgSz w:w="12240" w:h="15840"/>
       <w:pgMar w:top="1134" w:right="1417" w:bottom="1134" w:left="1701" w:header="720" w:footer="720" w:gutter="0"/>

</xml_diff>